<commit_message>
Rett spørsmål som valideringen flagget
Fjerner absolutte ord som bare sto i gale svar (40), forkorter fire lange spørsmål,
retter et negativt spørsmål og jevner ut svarlengde (riktig svar lengst: 42 % -> 33 %).
Skjerper validatoren: negative spørsmål (ikke leddsetninger) og navn/fagord uten lengdekrav.

Co-Authored-By: Claude Sonnet 5.5 <noreply@anthropic.com>
Claude-Session: https://claude.ai/code/session_011UYoyR9gVzG4pSPdKNw8ZV
</commit_message>
<xml_diff>
--- a/sporsmalsbank/ut/Spørsmålsbank_samfunnskunnskap.docx
+++ b/sporsmalsbank/ut/Spørsmålsbank_samfunnskunnskap.docx
@@ -195,7 +195,7 @@
         <w:ind w:left="420"/>
       </w:pPr>
       <w:r>
-        <w:t xml:space="preserve">Å lære alt utenat fra nettsider</w:t>
+        <w:t xml:space="preserve">Å lese mye og lære alt utenat fra nettsider</w:t>
       </w:r>
     </w:p>
     <w:p>
@@ -357,7 +357,7 @@
         <w:ind w:left="420"/>
       </w:pPr>
       <w:r>
-        <w:t xml:space="preserve">Gratis plass til alle søsknene deres</w:t>
+        <w:t xml:space="preserve">Gratis plass til søsknene deres</w:t>
       </w:r>
     </w:p>
     <w:p>
@@ -400,7 +400,7 @@
         <w:ind w:left="420"/>
       </w:pPr>
       <w:r>
-        <w:t xml:space="preserve">Å få alle møter på morsmålet</w:t>
+        <w:t xml:space="preserve">Å få møtet holdt på morsmålet</w:t>
       </w:r>
     </w:p>
     <w:p>
@@ -582,7 +582,7 @@
         <w:ind w:left="420"/>
       </w:pPr>
       <w:r>
-        <w:t xml:space="preserve">Foreldrene bestemmer alle aktivitetene</w:t>
+        <w:t xml:space="preserve">Foreldrene lager planen for hver dag</w:t>
       </w:r>
     </w:p>
     <w:p>
@@ -658,7 +658,7 @@
         <w:ind w:left="420"/>
       </w:pPr>
       <w:r>
-        <w:t xml:space="preserve">I juni det året de blir seks år</w:t>
+        <w:t xml:space="preserve">I september det året de blir seks år</w:t>
       </w:r>
     </w:p>
     <w:p>
@@ -1131,17 +1131,17 @@
         <w:ind w:left="420"/>
       </w:pPr>
       <w:r>
-        <w:t xml:space="preserve">Ja, alle elever har uniform</w:t>
-      </w:r>
-    </w:p>
-    <w:p>
-      <w:pPr>
-        <w:keepNext w:val="false"/>
-        <w:spacing w:after="30"/>
-        <w:ind w:left="420"/>
-      </w:pPr>
-      <w:r>
-        <w:t xml:space="preserve">Ja, men ikke på barnetrinnet</w:t>
+        <w:t xml:space="preserve">Ja, elevene må ha uniform</w:t>
+      </w:r>
+    </w:p>
+    <w:p>
+      <w:pPr>
+        <w:keepNext w:val="false"/>
+        <w:spacing w:after="30"/>
+        <w:ind w:left="420"/>
+      </w:pPr>
+      <w:r>
+        <w:t xml:space="preserve">Ja, men ikke på de yngste trinnene</w:t>
       </w:r>
     </w:p>
     <w:p>
@@ -1313,7 +1313,7 @@
         <w:ind w:left="420"/>
       </w:pPr>
       <w:r>
-        <w:t xml:space="preserve">Svare på alle meldinger samme dag</w:t>
+        <w:t xml:space="preserve">La barnet lese den og svare selv</w:t>
       </w:r>
     </w:p>
     <w:p>
@@ -1346,7 +1346,7 @@
         <w:ind w:left="420"/>
       </w:pPr>
       <w:r>
-        <w:t xml:space="preserve">Vente til neste foreldremøte</w:t>
+        <w:t xml:space="preserve">Vente til neste foreldremøte på skolen</w:t>
       </w:r>
     </w:p>
     <w:p>
@@ -1422,27 +1422,27 @@
         <w:ind w:left="420"/>
       </w:pPr>
       <w:r>
-        <w:t xml:space="preserve">De er med og bestemmer, for eksempel i elevrådet</w:t>
-      </w:r>
-    </w:p>
-    <w:p>
-      <w:pPr>
-        <w:keepNext/>
-        <w:spacing w:after="30"/>
-        <w:ind w:left="420"/>
-      </w:pPr>
-      <w:r>
-        <w:t xml:space="preserve">De bestemmer alle regler selv, uten lærere</w:t>
-      </w:r>
-    </w:p>
-    <w:p>
-      <w:pPr>
-        <w:keepNext w:val="false"/>
-        <w:spacing w:after="30"/>
-        <w:ind w:left="420"/>
-      </w:pPr>
-      <w:r>
-        <w:t xml:space="preserve">De følger alle regler uten å spørre</w:t>
+        <w:t xml:space="preserve">De er med og bestemmer, som i elevrådet</w:t>
+      </w:r>
+    </w:p>
+    <w:p>
+      <w:pPr>
+        <w:keepNext/>
+        <w:spacing w:after="30"/>
+        <w:ind w:left="420"/>
+      </w:pPr>
+      <w:r>
+        <w:t xml:space="preserve">De bestemmer reglene selv, uten lærere</w:t>
+      </w:r>
+    </w:p>
+    <w:p>
+      <w:pPr>
+        <w:keepNext w:val="false"/>
+        <w:spacing w:after="30"/>
+        <w:ind w:left="420"/>
+      </w:pPr>
+      <w:r>
+        <w:t xml:space="preserve">De følger reglene uten å spørre</w:t>
       </w:r>
     </w:p>
     <w:p>
@@ -1475,7 +1475,7 @@
         <w:ind w:left="420"/>
       </w:pPr>
       <w:r>
-        <w:t xml:space="preserve">At de lærer barna alle fag hjemme</w:t>
+        <w:t xml:space="preserve">At de lærer barna skolefagene hjemme</w:t>
       </w:r>
     </w:p>
     <w:p>
@@ -1733,7 +1733,7 @@
         <w:ind w:left="420"/>
       </w:pPr>
       <w:r>
-        <w:t xml:space="preserve">Ja, alle betaler mye hvert semester</w:t>
+        <w:t xml:space="preserve">Ja, de betaler mye hvert semester</w:t>
       </w:r>
     </w:p>
     <w:p>
@@ -1819,7 +1819,7 @@
         <w:ind w:left="420"/>
       </w:pPr>
       <w:r>
-        <w:t xml:space="preserve">Gratis bolig til alle studenter</w:t>
+        <w:t xml:space="preserve">Gratis bolig i hele studietiden</w:t>
       </w:r>
     </w:p>
     <w:p>
@@ -2120,7 +2120,7 @@
         <w:ind w:left="420"/>
       </w:pPr>
       <w:r>
-        <w:t xml:space="preserve">Fordi loven krever kurs hvert år</w:t>
+        <w:t xml:space="preserve">Fordi loven krever nye kurs hvert år</w:t>
       </w:r>
     </w:p>
     <w:p>
@@ -2302,7 +2302,7 @@
         <w:ind w:left="420"/>
       </w:pPr>
       <w:r>
-        <w:t xml:space="preserve">Ja, også på alle private skoler</w:t>
+        <w:t xml:space="preserve">Ja, også på de private skolene</w:t>
       </w:r>
     </w:p>
     <w:p>
@@ -2593,7 +2593,7 @@
         <w:ind w:left="420"/>
       </w:pPr>
       <w:r>
-        <w:t xml:space="preserve">Etter hvor gammel du er</w:t>
+        <w:t xml:space="preserve">Etter hvor gammel du er når du søker</w:t>
       </w:r>
     </w:p>
     <w:p>
@@ -2636,17 +2636,17 @@
         <w:ind w:left="420"/>
       </w:pPr>
       <w:r>
-        <w:t xml:space="preserve">Alle må mene det samme om alt</w:t>
-      </w:r>
-    </w:p>
-    <w:p>
-      <w:pPr>
-        <w:keepNext w:val="false"/>
-        <w:spacing w:after="30"/>
-        <w:ind w:left="420"/>
-      </w:pPr>
-      <w:r>
-        <w:t xml:space="preserve">Alle må jobbe i de samme yrkene</w:t>
+        <w:t xml:space="preserve">Folk må mene det samme om det meste</w:t>
+      </w:r>
+    </w:p>
+    <w:p>
+      <w:pPr>
+        <w:keepNext w:val="false"/>
+        <w:spacing w:after="30"/>
+        <w:ind w:left="420"/>
+      </w:pPr>
+      <w:r>
+        <w:t xml:space="preserve">Folk må jobbe i de samme yrkene</w:t>
       </w:r>
     </w:p>
     <w:p>
@@ -3066,17 +3066,17 @@
         <w:ind w:left="420"/>
       </w:pPr>
       <w:r>
-        <w:t xml:space="preserve">Politikerne trenger ikke forklare seg</w:t>
-      </w:r>
-    </w:p>
-    <w:p>
-      <w:pPr>
-        <w:keepNext w:val="false"/>
-        <w:spacing w:after="30"/>
-        <w:ind w:left="420"/>
-      </w:pPr>
-      <w:r>
-        <w:t xml:space="preserve">Alle får samme lønn og samme jobb</w:t>
+        <w:t xml:space="preserve">Politikerne trenger ikke å forklare seg selv</w:t>
+      </w:r>
+    </w:p>
+    <w:p>
+      <w:pPr>
+        <w:keepNext w:val="false"/>
+        <w:spacing w:after="30"/>
+        <w:ind w:left="420"/>
+      </w:pPr>
+      <w:r>
+        <w:t xml:space="preserve">Folk får samme lønn og samme jobb</w:t>
       </w:r>
     </w:p>
     <w:p>
@@ -3334,7 +3334,7 @@
         <w:ind w:left="420"/>
       </w:pPr>
       <w:r>
-        <w:t xml:space="preserve">Å regne med brøk og prosent i tabeller</w:t>
+        <w:t xml:space="preserve">Å regne med brøk og prosent i store tabeller</w:t>
       </w:r>
     </w:p>
     <w:p>
@@ -3420,7 +3420,7 @@
         <w:ind w:left="420"/>
       </w:pPr>
       <w:r>
-        <w:t xml:space="preserve">Kunst og håndverk</w:t>
+        <w:t xml:space="preserve">Matematikk</w:t>
       </w:r>
     </w:p>
     <w:p>
@@ -3504,7 +3504,7 @@
         <w:ind w:left="420"/>
       </w:pPr>
       <w:r>
-        <w:t xml:space="preserve">At alle jobber like mange timer</w:t>
+        <w:t xml:space="preserve">At voksne jobber 40 timer i uken</w:t>
       </w:r>
     </w:p>
     <w:p>
@@ -3633,7 +3633,7 @@
         <w:ind w:left="420"/>
       </w:pPr>
       <w:r>
-        <w:t xml:space="preserve">Alle gamle jobber blir tryggere</w:t>
+        <w:t xml:space="preserve">De gamle jobbene blir tryggere</w:t>
       </w:r>
     </w:p>
     <w:p>
@@ -3815,7 +3815,7 @@
         <w:ind w:left="420"/>
       </w:pPr>
       <w:r>
-        <w:t xml:space="preserve">En som kontrollerer alle arbeidsplasser</w:t>
+        <w:t xml:space="preserve">En som kontrollerer arbeidsplassene</w:t>
       </w:r>
     </w:p>
     <w:p>
@@ -4417,7 +4417,7 @@
         <w:ind w:left="420"/>
       </w:pPr>
       <w:r>
-        <w:t xml:space="preserve">Private firmaer driver alle offentlige tjenester</w:t>
+        <w:t xml:space="preserve">Private firmaer driver de offentlige tjenestene</w:t>
       </w:r>
     </w:p>
     <w:p>
@@ -4665,17 +4665,17 @@
         <w:ind w:left="420"/>
       </w:pPr>
       <w:r>
-        <w:t xml:space="preserve">At alle får penger uten å jobbe</w:t>
-      </w:r>
-    </w:p>
-    <w:p>
-      <w:pPr>
-        <w:keepNext w:val="false"/>
-        <w:spacing w:after="30"/>
-        <w:ind w:left="420"/>
-      </w:pPr>
-      <w:r>
-        <w:t xml:space="preserve">At bedriftene betaler all skatt alene</w:t>
+        <w:t xml:space="preserve">At folk får penger uten å jobbe</w:t>
+      </w:r>
+    </w:p>
+    <w:p>
+      <w:pPr>
+        <w:keepNext w:val="false"/>
+        <w:spacing w:after="30"/>
+        <w:ind w:left="420"/>
+      </w:pPr>
+      <w:r>
+        <w:t xml:space="preserve">At bedriftene betaler skatten alene</w:t>
       </w:r>
     </w:p>
     <w:p>
@@ -4708,7 +4708,7 @@
         <w:ind w:left="420"/>
       </w:pPr>
       <w:r>
-        <w:t xml:space="preserve">Daglig kontroll av alle innbyggerne</w:t>
+        <w:t xml:space="preserve">Daglig kontroll av innbyggerne</w:t>
       </w:r>
     </w:p>
     <w:p>
@@ -4923,7 +4923,7 @@
         <w:ind w:left="420"/>
       </w:pPr>
       <w:r>
-        <w:t xml:space="preserve">Alle betaler det samme beløpet</w:t>
+        <w:t xml:space="preserve">Folk betaler det samme beløpet</w:t>
       </w:r>
     </w:p>
     <w:p>
@@ -5181,7 +5181,7 @@
         <w:ind w:left="420"/>
       </w:pPr>
       <w:r>
-        <w:t xml:space="preserve">Navn og adresse til alle ansatte</w:t>
+        <w:t xml:space="preserve">Navn og adresse til de andre ansatte</w:t>
       </w:r>
     </w:p>
     <w:p>
@@ -5363,7 +5363,7 @@
         <w:ind w:left="420"/>
       </w:pPr>
       <w:r>
-        <w:t xml:space="preserve">Mange nordmenn begynte å jobbe i sykehus</w:t>
+        <w:t xml:space="preserve">Mange nordmenn begynte å jobbe på sykehus og i skoler</w:t>
       </w:r>
     </w:p>
     <w:p>
@@ -5826,7 +5826,7 @@
         <w:ind w:left="420"/>
       </w:pPr>
       <w:r>
-        <w:t xml:space="preserve">Alle som søker jobb får komme på intervju</w:t>
+        <w:t xml:space="preserve">Du får komme på intervju hvis du søker</w:t>
       </w:r>
     </w:p>
     <w:p>
@@ -6041,7 +6041,7 @@
         <w:ind w:left="420"/>
       </w:pPr>
       <w:r>
-        <w:t xml:space="preserve">Via fylkeskommunen og skolene</w:t>
+        <w:t xml:space="preserve">Via fylkeskommunen og videregående skoler</w:t>
       </w:r>
     </w:p>
     <w:p>
@@ -6127,7 +6127,7 @@
         <w:ind w:left="420"/>
       </w:pPr>
       <w:r>
-        <w:t xml:space="preserve">Kvinner har ikke lov til å jobbe i alle yrker</w:t>
+        <w:t xml:space="preserve">Kvinner har ikke lov til å jobbe i noen yrker</w:t>
       </w:r>
     </w:p>
     <w:p>
@@ -6266,7 +6266,7 @@
         <w:ind w:left="420"/>
       </w:pPr>
       <w:r>
-        <w:t xml:space="preserve">Den som representerer alle de ansatte</w:t>
+        <w:t xml:space="preserve">Den som representerer de ansatte</w:t>
       </w:r>
     </w:p>
     <w:p>
@@ -6342,7 +6342,7 @@
         <w:ind w:left="420"/>
       </w:pPr>
       <w:r>
-        <w:t xml:space="preserve">Penger som alle voksne får hver måned</w:t>
+        <w:t xml:space="preserve">Penger fra staten til voksne hver måned</w:t>
       </w:r>
     </w:p>
     <w:p>
@@ -6739,7 +6739,7 @@
         <w:ind w:left="420"/>
       </w:pPr>
       <w:r>
-        <w:t xml:space="preserve">De ansatte tar ferie på samme tid</w:t>
+        <w:t xml:space="preserve">De ansatte tar ferie på samme tid hvert år</w:t>
       </w:r>
     </w:p>
     <w:p>
@@ -6825,7 +6825,7 @@
         <w:ind w:left="420"/>
       </w:pPr>
       <w:r>
-        <w:t xml:space="preserve">En som leder en fagforening</w:t>
+        <w:t xml:space="preserve">En som leder en stor fagforening</w:t>
       </w:r>
     </w:p>
     <w:p>
@@ -7081,7 +7081,7 @@
         <w:ind w:left="420"/>
       </w:pPr>
       <w:r>
-        <w:t xml:space="preserve">Å gjøre det som er best for deg selv</w:t>
+        <w:t xml:space="preserve">Å gjøre det som er best for deg selv alene</w:t>
       </w:r>
     </w:p>
     <w:p>
@@ -7263,7 +7263,7 @@
         <w:ind w:left="420"/>
       </w:pPr>
       <w:r>
-        <w:t xml:space="preserve">Spørre alle på nettet om lov</w:t>
+        <w:t xml:space="preserve">Spørre vennene dine om lov</w:t>
       </w:r>
     </w:p>
     <w:p>
@@ -7448,17 +7448,17 @@
           <w:b/>
           <w:bCs/>
         </w:rPr>
-        <w:t xml:space="preserve">173. En familie skal kjøpe ny bil. De bryr seg om miljøet. De trenger plass til besteforeldrene. Hva må de tenke på?</w:t>
-      </w:r>
-    </w:p>
-    <w:p>
-      <w:pPr>
-        <w:keepNext/>
-        <w:spacing w:after="30"/>
-        <w:ind w:left="420"/>
-      </w:pPr>
-      <w:r>
-        <w:t xml:space="preserve">Miljøet og plass til besteforeldrene</w:t>
+        <w:t xml:space="preserve">173. Familien vil ha miljøvennlig bil med plass til besteforeldre. Hva må de se på?</w:t>
+      </w:r>
+    </w:p>
+    <w:p>
+      <w:pPr>
+        <w:keepNext/>
+        <w:spacing w:after="30"/>
+        <w:ind w:left="420"/>
+      </w:pPr>
+      <w:r>
+        <w:t xml:space="preserve">Utslipp og hvor mye plass bilen har</w:t>
       </w:r>
     </w:p>
     <w:p>
@@ -7478,7 +7478,7 @@
         <w:ind w:left="420"/>
       </w:pPr>
       <w:r>
-        <w:t xml:space="preserve">Hvilket bilmerke som er mest kjent</w:t>
+        <w:t xml:space="preserve">Hvilket bilmerke som er mest kjent i Norge</w:t>
       </w:r>
     </w:p>
     <w:p>
@@ -7812,7 +7812,7 @@
         <w:ind w:left="420"/>
       </w:pPr>
       <w:r>
-        <w:t xml:space="preserve">Alle skriver mer høflig enn ellers</w:t>
+        <w:t xml:space="preserve">Folk skriver mer høflig enn ellers</w:t>
       </w:r>
     </w:p>
     <w:p>
@@ -7865,7 +7865,7 @@
         <w:ind w:left="420"/>
       </w:pPr>
       <w:r>
-        <w:t xml:space="preserve">Passord som bare du selv kjenner til</w:t>
+        <w:t xml:space="preserve">Passordene du har lagret på mobilen</w:t>
       </w:r>
     </w:p>
     <w:p>
@@ -7941,7 +7941,7 @@
         <w:ind w:left="420"/>
       </w:pPr>
       <w:r>
-        <w:t xml:space="preserve">Regler som hver kommune bestemmer</w:t>
+        <w:t xml:space="preserve">Regler som hver kommune bestemmer selv</w:t>
       </w:r>
     </w:p>
     <w:p>
@@ -7984,7 +7984,7 @@
         <w:ind w:left="420"/>
       </w:pPr>
       <w:r>
-        <w:t xml:space="preserve">Ting du deler med alle kollegene dine</w:t>
+        <w:t xml:space="preserve">Ting du deler med kollegene dine</w:t>
       </w:r>
     </w:p>
     <w:p>
@@ -8050,7 +8050,7 @@
           <w:b/>
           <w:bCs/>
         </w:rPr>
-        <w:t xml:space="preserve">187. Noen deler et privat bilde av en venninne og skriver noe usant om henne. Hva er dette?</w:t>
+        <w:t xml:space="preserve">187. Noen deler et privat bilde av deg og skriver løgn om deg. Hva er dette?</w:t>
       </w:r>
     </w:p>
     <w:p>
@@ -8070,17 +8070,17 @@
         <w:ind w:left="420"/>
       </w:pPr>
       <w:r>
-        <w:t xml:space="preserve">Lovlig, fordi alle har ytringsfrihet</w:t>
-      </w:r>
-    </w:p>
-    <w:p>
-      <w:pPr>
-        <w:keepNext w:val="false"/>
-        <w:spacing w:after="30"/>
-        <w:ind w:left="420"/>
-      </w:pPr>
-      <w:r>
-        <w:t xml:space="preserve">Lovlig, hvis profilen er åpen for alle</w:t>
+        <w:t xml:space="preserve">Lovlig, fordi det er ytringsfrihet</w:t>
+      </w:r>
+    </w:p>
+    <w:p>
+      <w:pPr>
+        <w:keepNext w:val="false"/>
+        <w:spacing w:after="30"/>
+        <w:ind w:left="420"/>
+      </w:pPr>
+      <w:r>
+        <w:t xml:space="preserve">Lovlig, hvis profilen er offentlig</w:t>
       </w:r>
     </w:p>
     <w:p>
@@ -8113,17 +8113,17 @@
         <w:ind w:left="420"/>
       </w:pPr>
       <w:r>
-        <w:t xml:space="preserve">Alt du deler blir slettet etter noen uker</w:t>
-      </w:r>
-    </w:p>
-    <w:p>
-      <w:pPr>
-        <w:keepNext w:val="false"/>
-        <w:spacing w:after="30"/>
-        <w:ind w:left="420"/>
-      </w:pPr>
-      <w:r>
-        <w:t xml:space="preserve">Bare vennene dine kan se det du deler</w:t>
+        <w:t xml:space="preserve">Det du deler blir slettet etter noen uker</w:t>
+      </w:r>
+    </w:p>
+    <w:p>
+      <w:pPr>
+        <w:keepNext w:val="false"/>
+        <w:spacing w:after="30"/>
+        <w:ind w:left="420"/>
+      </w:pPr>
+      <w:r>
+        <w:t xml:space="preserve">Det er nærmeste venner som ser det du deler</w:t>
       </w:r>
     </w:p>
     <w:p>
@@ -8338,7 +8338,7 @@
         <w:ind w:left="420"/>
       </w:pPr>
       <w:r>
-        <w:t xml:space="preserve">En betaling for å kunne lese en artikkel</w:t>
+        <w:t xml:space="preserve">En betaling for å kunne lese hele artikkelen</w:t>
       </w:r>
     </w:p>
     <w:p>
@@ -8457,7 +8457,7 @@
         <w:ind w:left="420"/>
       </w:pPr>
       <w:r>
-        <w:t xml:space="preserve">Det gir deg flere sider å dele på nett</w:t>
+        <w:t xml:space="preserve">Det gir deg flere sider å dele på sosiale medier</w:t>
       </w:r>
     </w:p>
     <w:p>
@@ -8586,7 +8586,7 @@
         <w:ind w:left="420"/>
       </w:pPr>
       <w:r>
-        <w:t xml:space="preserve">Noe som alle mennesker er enige om</w:t>
+        <w:t xml:space="preserve">Noe som politikerne har bestemt</w:t>
       </w:r>
     </w:p>
     <w:p>
@@ -8609,7 +8609,7 @@
           <w:b/>
           <w:bCs/>
         </w:rPr>
-        <w:t xml:space="preserve">200. Hvorfor kan du ikke alltid stole på en reklame?</w:t>
+        <w:t xml:space="preserve">200. Hvorfor bør du være kritisk til reklame?</w:t>
       </w:r>
     </w:p>
     <w:p>
@@ -8758,7 +8758,7 @@
         <w:ind w:left="420"/>
       </w:pPr>
       <w:r>
-        <w:t xml:space="preserve">En ansatt som godkjenner alle innleggene</w:t>
+        <w:t xml:space="preserve">En ansatt som godkjenner innleggene</w:t>
       </w:r>
     </w:p>
     <w:p>
@@ -8973,7 +8973,7 @@
         <w:ind w:left="420"/>
       </w:pPr>
       <w:r>
-        <w:t xml:space="preserve">Å gi alle de samme rettighetene i samfunnet</w:t>
+        <w:t xml:space="preserve">Å gi folk de samme rettighetene i samfunnet</w:t>
       </w:r>
     </w:p>
     <w:p>
@@ -9026,7 +9026,7 @@
         <w:ind w:left="420"/>
       </w:pPr>
       <w:r>
-        <w:t xml:space="preserve">Dele kommentaren med alle vennene dine</w:t>
+        <w:t xml:space="preserve">Dele kommentaren med vennene dine</w:t>
       </w:r>
     </w:p>
     <w:p>
@@ -9145,7 +9145,7 @@
         <w:ind w:left="420"/>
       </w:pPr>
       <w:r>
-        <w:t xml:space="preserve">Ja, alle har ytringsfrihet på nettet</w:t>
+        <w:t xml:space="preserve">Ja, det er ytringsfrihet på nettet</w:t>
       </w:r>
     </w:p>
     <w:p>
@@ -9317,17 +9317,17 @@
         <w:ind w:left="420"/>
       </w:pPr>
       <w:r>
-        <w:t xml:space="preserve">Alle som spør om det på sosiale medier</w:t>
-      </w:r>
-    </w:p>
-    <w:p>
-      <w:pPr>
-        <w:keepNext w:val="false"/>
-        <w:spacing w:after="30"/>
-        <w:ind w:left="420"/>
-      </w:pPr>
-      <w:r>
-        <w:t xml:space="preserve">Alle naboene dine og kollegene på jobben</w:t>
+        <w:t xml:space="preserve">Folk som spør om det på sosiale medier</w:t>
+      </w:r>
+    </w:p>
+    <w:p>
+      <w:pPr>
+        <w:keepNext w:val="false"/>
+        <w:spacing w:after="30"/>
+        <w:ind w:left="420"/>
+      </w:pPr>
+      <w:r>
+        <w:t xml:space="preserve">Naboene dine og kollegene på jobben</w:t>
       </w:r>
     </w:p>
     <w:p>
@@ -9532,7 +9532,7 @@
         <w:ind w:left="420"/>
       </w:pPr>
       <w:r>
-        <w:t xml:space="preserve">Et virus som kan stjele alle passordene</w:t>
+        <w:t xml:space="preserve">Et virus som kan stjele passordene</w:t>
       </w:r>
     </w:p>
     <w:p>
@@ -9618,17 +9618,17 @@
         <w:ind w:left="420"/>
       </w:pPr>
       <w:r>
-        <w:t xml:space="preserve">Åpne alle innstillinger så alle kan se alt</w:t>
-      </w:r>
-    </w:p>
-    <w:p>
-      <w:pPr>
-        <w:keepNext w:val="false"/>
-        <w:spacing w:after="30"/>
-        <w:ind w:left="420"/>
-      </w:pPr>
-      <w:r>
-        <w:t xml:space="preserve">Ikke endre noe, siden alle er like</w:t>
+        <w:t xml:space="preserve">Åpne innstillingene så hvem som helst kan se alt</w:t>
+      </w:r>
+    </w:p>
+    <w:p>
+      <w:pPr>
+        <w:keepNext w:val="false"/>
+        <w:spacing w:after="30"/>
+        <w:ind w:left="420"/>
+      </w:pPr>
+      <w:r>
+        <w:t xml:space="preserve">Ikke endre noe, siden det ikke har betydning</w:t>
       </w:r>
     </w:p>
     <w:p>
@@ -9727,7 +9727,7 @@
           <w:b/>
           <w:bCs/>
         </w:rPr>
-        <w:t xml:space="preserve">226. Du får en SMS om at pakken din er stoppet. Du må betale via en lenke. Hva er lurt å gjøre?</w:t>
+        <w:t xml:space="preserve">226. En SMS ber deg betale for en stoppet pakke via en lenke. Hva er lurt?</w:t>
       </w:r>
     </w:p>
     <w:p>
@@ -9770,7 +9770,7 @@
           <w:b/>
           <w:bCs/>
         </w:rPr>
-        <w:t xml:space="preserve">227. Noen ringer og sier at de er fra banken. De ber om BankID-koden din. Hva bør du gjøre?</w:t>
+        <w:t xml:space="preserve">227. Noen ringer fra «banken» og vil ha BankID-koden din. Hva bør du gjøre?</w:t>
       </w:r>
     </w:p>
     <w:p>
@@ -9929,7 +9929,7 @@
         <w:ind w:left="420"/>
       </w:pPr>
       <w:r>
-        <w:t xml:space="preserve">Oppdateringer sletter gamle bilder automatisk</w:t>
+        <w:t xml:space="preserve">Oppdateringer sletter gamle bilder fra telefonen</w:t>
       </w:r>
     </w:p>
     <w:p>
@@ -10005,7 +10005,7 @@
         <w:ind w:left="420"/>
       </w:pPr>
       <w:r>
-        <w:t xml:space="preserve">Så banken får mer penger fra deg</w:t>
+        <w:t xml:space="preserve">Så banken får mer penger fra deg hvert år</w:t>
       </w:r>
     </w:p>
     <w:p>
@@ -10058,7 +10058,7 @@
         <w:ind w:left="420"/>
       </w:pPr>
       <w:r>
-        <w:t xml:space="preserve">Et nummer som politiet gir til alle</w:t>
+        <w:t xml:space="preserve">Et nummer som politiet gir deg</w:t>
       </w:r>
     </w:p>
     <w:p>
@@ -10134,7 +10134,7 @@
         <w:ind w:left="420"/>
       </w:pPr>
       <w:r>
-        <w:t xml:space="preserve">En situasjon der alle er enige om svaret</w:t>
+        <w:t xml:space="preserve">En situasjon der folk er enige om svaret</w:t>
       </w:r>
     </w:p>
     <w:p>
@@ -10187,7 +10187,7 @@
         <w:ind w:left="420"/>
       </w:pPr>
       <w:r>
-        <w:t xml:space="preserve">Legge den tilbake og gå videre</w:t>
+        <w:t xml:space="preserve">Legge den tilbake på gaten og gå videre</w:t>
       </w:r>
     </w:p>
     <w:p>

</xml_diff>

<commit_message>
Bygg questions.xml, docx og prototype på nytt fra kilden
Co-authored-by: Ivar <IvarMolde@users.noreply.github.com>
</commit_message>
<xml_diff>
--- a/sporsmalsbank/ut/Spørsmålsbank_samfunnskunnskap.docx
+++ b/sporsmalsbank/ut/Spørsmålsbank_samfunnskunnskap.docx
@@ -36,37 +36,37 @@
           <w:b/>
           <w:bCs/>
         </w:rPr>
-        <w:t xml:space="preserve">1. Hva bestemte Norge på 1700-tallet?</w:t>
-      </w:r>
-    </w:p>
-    <w:p>
-      <w:pPr>
-        <w:keepNext/>
-        <w:spacing w:after="30"/>
-        <w:ind w:left="420"/>
-      </w:pPr>
-      <w:r>
-        <w:t xml:space="preserve">Alle barn skal gå på skole, og staten betaler</w:t>
-      </w:r>
-    </w:p>
-    <w:p>
-      <w:pPr>
-        <w:keepNext/>
-        <w:spacing w:after="30"/>
-        <w:ind w:left="420"/>
-      </w:pPr>
-      <w:r>
-        <w:t xml:space="preserve">Bare barn fra rike familier går på skole</w:t>
-      </w:r>
-    </w:p>
-    <w:p>
-      <w:pPr>
-        <w:keepNext w:val="false"/>
-        <w:spacing w:after="30"/>
-        <w:ind w:left="420"/>
-      </w:pPr>
-      <w:r>
-        <w:t xml:space="preserve">Foreldrene må selv betale for skolen</w:t>
+        <w:t xml:space="preserve">1. Hva ble bestemt i Norge på 1700-tallet?</w:t>
+      </w:r>
+    </w:p>
+    <w:p>
+      <w:pPr>
+        <w:keepNext/>
+        <w:spacing w:after="30"/>
+        <w:ind w:left="420"/>
+      </w:pPr>
+      <w:r>
+        <w:t xml:space="preserve">At alle barn skulle gå på skole</w:t>
+      </w:r>
+    </w:p>
+    <w:p>
+      <w:pPr>
+        <w:keepNext/>
+        <w:spacing w:after="30"/>
+        <w:ind w:left="420"/>
+      </w:pPr>
+      <w:r>
+        <w:t xml:space="preserve">At bare barn fra rike familier skulle gå på skole</w:t>
+      </w:r>
+    </w:p>
+    <w:p>
+      <w:pPr>
+        <w:keepNext w:val="false"/>
+        <w:spacing w:after="30"/>
+        <w:ind w:left="420"/>
+      </w:pPr>
+      <w:r>
+        <w:t xml:space="preserve">At bare gutter skulle gå på skole</w:t>
       </w:r>
     </w:p>
     <w:p>
@@ -853,7 +853,7 @@
           <w:b/>
           <w:bCs/>
         </w:rPr>
-        <w:t xml:space="preserve">20. Hva skjer med elevene etter sommerferien?</w:t>
+        <w:t xml:space="preserve">20. Hva skjer med elevene i grunnskolen etter sommerferien?</w:t>
       </w:r>
     </w:p>
     <w:p>
@@ -992,7 +992,7 @@
         <w:ind w:left="420"/>
       </w:pPr>
       <w:r>
-        <w:t xml:space="preserve">Alle elever har den samme læreplanen</w:t>
+        <w:t xml:space="preserve">Læreplanene er like i hele landet</w:t>
       </w:r>
     </w:p>
     <w:p>
@@ -1508,27 +1508,27 @@
         <w:ind w:left="420"/>
       </w:pPr>
       <w:r>
-        <w:t xml:space="preserve">De lærer at alle må hjelpe til</w:t>
-      </w:r>
-    </w:p>
-    <w:p>
-      <w:pPr>
-        <w:keepNext/>
-        <w:spacing w:after="30"/>
-        <w:ind w:left="420"/>
-      </w:pPr>
-      <w:r>
-        <w:t xml:space="preserve">De lærer å konkurrere mot gruppen</w:t>
-      </w:r>
-    </w:p>
-    <w:p>
-      <w:pPr>
-        <w:keepNext w:val="false"/>
-        <w:spacing w:after="30"/>
-        <w:ind w:left="420"/>
-      </w:pPr>
-      <w:r>
-        <w:t xml:space="preserve">De lærer å jobbe uten hjelp</w:t>
+        <w:t xml:space="preserve">For å lære å samarbeide med andre</w:t>
+      </w:r>
+    </w:p>
+    <w:p>
+      <w:pPr>
+        <w:keepNext/>
+        <w:spacing w:after="30"/>
+        <w:ind w:left="420"/>
+      </w:pPr>
+      <w:r>
+        <w:t xml:space="preserve">For å lære å konkurrere mot hverandre</w:t>
+      </w:r>
+    </w:p>
+    <w:p>
+      <w:pPr>
+        <w:keepNext w:val="false"/>
+        <w:spacing w:after="30"/>
+        <w:ind w:left="420"/>
+      </w:pPr>
+      <w:r>
+        <w:t xml:space="preserve">For å lære å jobbe uten hjelp fra andre</w:t>
       </w:r>
     </w:p>
     <w:p>
@@ -1594,7 +1594,7 @@
         <w:ind w:left="420"/>
       </w:pPr>
       <w:r>
-        <w:t xml:space="preserve">Et fagbrev i et praktisk yrke</w:t>
+        <w:t xml:space="preserve">Et fagbrev eller svennebrev</w:t>
       </w:r>
     </w:p>
     <w:p>
@@ -1723,27 +1723,27 @@
         <w:ind w:left="420"/>
       </w:pPr>
       <w:r>
-        <w:t xml:space="preserve">Nei, men de må kjøpe bøkene selv</w:t>
-      </w:r>
-    </w:p>
-    <w:p>
-      <w:pPr>
-        <w:keepNext/>
-        <w:spacing w:after="30"/>
-        <w:ind w:left="420"/>
-      </w:pPr>
-      <w:r>
-        <w:t xml:space="preserve">Ja, de betaler mye hvert semester</w:t>
-      </w:r>
-    </w:p>
-    <w:p>
-      <w:pPr>
-        <w:keepNext w:val="false"/>
-        <w:spacing w:after="30"/>
-        <w:ind w:left="420"/>
-      </w:pPr>
-      <w:r>
-        <w:t xml:space="preserve">Nei, kommunen betaler for dem</w:t>
+        <w:t xml:space="preserve">Nei, de fleste betaler bare en liten semesteravgift</w:t>
+      </w:r>
+    </w:p>
+    <w:p>
+      <w:pPr>
+        <w:keepNext/>
+        <w:spacing w:after="30"/>
+        <w:ind w:left="420"/>
+      </w:pPr>
+      <w:r>
+        <w:t xml:space="preserve">Ja, alle studenter betaler mye hvert semester</w:t>
+      </w:r>
+    </w:p>
+    <w:p>
+      <w:pPr>
+        <w:keepNext w:val="false"/>
+        <w:spacing w:after="30"/>
+        <w:ind w:left="420"/>
+      </w:pPr>
+      <w:r>
+        <w:t xml:space="preserve">Nei, kommunen betaler hele studiet for dem</w:t>
       </w:r>
     </w:p>
     <w:p>
@@ -1895,27 +1895,27 @@
         <w:ind w:left="420"/>
       </w:pPr>
       <w:r>
-        <w:t xml:space="preserve">Etter at man er ferdig å studere</w:t>
-      </w:r>
-    </w:p>
-    <w:p>
-      <w:pPr>
-        <w:keepNext/>
-        <w:spacing w:after="30"/>
-        <w:ind w:left="420"/>
-      </w:pPr>
-      <w:r>
-        <w:t xml:space="preserve">Hver måned mens man studerer</w:t>
-      </w:r>
-    </w:p>
-    <w:p>
-      <w:pPr>
-        <w:keepNext w:val="false"/>
-        <w:spacing w:after="30"/>
-        <w:ind w:left="420"/>
-      </w:pPr>
-      <w:r>
-        <w:t xml:space="preserve">Når man har fått fast jobb</w:t>
+        <w:t xml:space="preserve">Etter at man er ferdig med å studere</w:t>
+      </w:r>
+    </w:p>
+    <w:p>
+      <w:pPr>
+        <w:keepNext/>
+        <w:spacing w:after="30"/>
+        <w:ind w:left="420"/>
+      </w:pPr>
+      <w:r>
+        <w:t xml:space="preserve">Hver måned mens man fortsatt studerer</w:t>
+      </w:r>
+    </w:p>
+    <w:p>
+      <w:pPr>
+        <w:keepNext w:val="false"/>
+        <w:spacing w:after="30"/>
+        <w:ind w:left="420"/>
+      </w:pPr>
+      <w:r>
+        <w:t xml:space="preserve">Først når man har fått fast jobb</w:t>
       </w:r>
     </w:p>
     <w:p>
@@ -2229,37 +2229,37 @@
           <w:b/>
           <w:bCs/>
         </w:rPr>
-        <w:t xml:space="preserve">52. Hva må voksne (25 år eller eldre) ha for å få rett til videregående skole?</w:t>
-      </w:r>
-    </w:p>
-    <w:p>
-      <w:pPr>
-        <w:keepNext/>
-        <w:spacing w:after="30"/>
-        <w:ind w:left="420"/>
-      </w:pPr>
-      <w:r>
-        <w:t xml:space="preserve">Grunnskole fra Norge eller utlandet</w:t>
-      </w:r>
-    </w:p>
-    <w:p>
-      <w:pPr>
-        <w:keepNext/>
-        <w:spacing w:after="30"/>
-        <w:ind w:left="420"/>
-      </w:pPr>
-      <w:r>
-        <w:t xml:space="preserve">Minst to år i Norge før du søker</w:t>
-      </w:r>
-    </w:p>
-    <w:p>
-      <w:pPr>
-        <w:keepNext w:val="false"/>
-        <w:spacing w:after="30"/>
-        <w:ind w:left="420"/>
-      </w:pPr>
-      <w:r>
-        <w:t xml:space="preserve">En bestått norsktest på nivå B2</w:t>
+        <w:t xml:space="preserve">52. Hva må voksne ha for å få rett til videregående opplæring?</w:t>
+      </w:r>
+    </w:p>
+    <w:p>
+      <w:pPr>
+        <w:keepNext/>
+        <w:spacing w:after="30"/>
+        <w:ind w:left="420"/>
+      </w:pPr>
+      <w:r>
+        <w:t xml:space="preserve">Fullført grunnskole, i Norge eller utlandet</w:t>
+      </w:r>
+    </w:p>
+    <w:p>
+      <w:pPr>
+        <w:keepNext/>
+        <w:spacing w:after="30"/>
+        <w:ind w:left="420"/>
+      </w:pPr>
+      <w:r>
+        <w:t xml:space="preserve">Minst to år med fast bosted i Norge</w:t>
+      </w:r>
+    </w:p>
+    <w:p>
+      <w:pPr>
+        <w:keepNext w:val="false"/>
+        <w:spacing w:after="30"/>
+        <w:ind w:left="420"/>
+      </w:pPr>
+      <w:r>
+        <w:t xml:space="preserve">En bestått norskprøve på nivå B2 eller C1</w:t>
       </w:r>
     </w:p>
     <w:p>
@@ -2444,7 +2444,7 @@
           <w:b/>
           <w:bCs/>
         </w:rPr>
-        <w:t xml:space="preserve">57. Hvilke nivåer har norskopplæringen?</w:t>
+        <w:t xml:space="preserve">57. Hvilke nivåer har norskopplæringen for voksne?</w:t>
       </w:r>
     </w:p>
     <w:p>
@@ -2679,7 +2679,7 @@
         <w:ind w:left="420"/>
       </w:pPr>
       <w:r>
-        <w:t xml:space="preserve">Å lese norske lærebøker hjemme</w:t>
+        <w:t xml:space="preserve">Å snakke morsmålet hjemme og på jobb</w:t>
       </w:r>
     </w:p>
     <w:p>
@@ -2702,7 +2702,7 @@
           <w:b/>
           <w:bCs/>
         </w:rPr>
-        <w:t xml:space="preserve">63. Hvor mange år har barn rett til opplæring?</w:t>
+        <w:t xml:space="preserve">63. Hvor mange år tar grunnskole og videregående vanligvis til sammen?</w:t>
       </w:r>
     </w:p>
     <w:p>
@@ -3433,7 +3433,7 @@
           <w:b/>
           <w:bCs/>
         </w:rPr>
-        <w:t xml:space="preserve">80. Hva bestemmer hvem som får plass på videregående?</w:t>
+        <w:t xml:space="preserve">80. Hva avgjør ofte hvilken videregående skole du kommer inn på?</w:t>
       </w:r>
     </w:p>
     <w:p>
@@ -3815,7 +3815,7 @@
         <w:ind w:left="420"/>
       </w:pPr>
       <w:r>
-        <w:t xml:space="preserve">En som kontrollerer arbeidsplassene</w:t>
+        <w:t xml:space="preserve">En som kontrollerer skatten til bedriften</w:t>
       </w:r>
     </w:p>
     <w:p>
@@ -4301,27 +4301,27 @@
           <w:b/>
           <w:bCs/>
         </w:rPr>
-        <w:t xml:space="preserve">100. Hva er forskjellen på lov og avtale i arbeidslivet?</w:t>
-      </w:r>
-    </w:p>
-    <w:p>
-      <w:pPr>
-        <w:keepNext/>
-        <w:spacing w:after="30"/>
-        <w:ind w:left="420"/>
-      </w:pPr>
-      <w:r>
-        <w:t xml:space="preserve">Lover gjelder for alle, avtaler for noen bransjer</w:t>
-      </w:r>
-    </w:p>
-    <w:p>
-      <w:pPr>
-        <w:keepNext/>
-        <w:spacing w:after="30"/>
-        <w:ind w:left="420"/>
-      </w:pPr>
-      <w:r>
-        <w:t xml:space="preserve">Lover gjelder for noen bransjer, avtaler for alle</w:t>
+        <w:t xml:space="preserve">100. Hva er forskjellen på lov og tariffavtale i arbeidslivet?</w:t>
+      </w:r>
+    </w:p>
+    <w:p>
+      <w:pPr>
+        <w:keepNext/>
+        <w:spacing w:after="30"/>
+        <w:ind w:left="420"/>
+      </w:pPr>
+      <w:r>
+        <w:t xml:space="preserve">Lover gjelder for alle, tariffavtaler der de er inngått</w:t>
+      </w:r>
+    </w:p>
+    <w:p>
+      <w:pPr>
+        <w:keepNext/>
+        <w:spacing w:after="30"/>
+        <w:ind w:left="420"/>
+      </w:pPr>
+      <w:r>
+        <w:t xml:space="preserve">Tariffavtaler gjelder for alle, lover for noen få</w:t>
       </w:r>
     </w:p>
     <w:p>
@@ -4612,7 +4612,7 @@
         <w:ind w:left="420"/>
       </w:pPr>
       <w:r>
-        <w:t xml:space="preserve">I alle kommuner i landet</w:t>
+        <w:t xml:space="preserve">Over hele landet, nær der folk bor</w:t>
       </w:r>
     </w:p>
     <w:p>
@@ -4999,7 +4999,7 @@
         <w:ind w:left="420"/>
       </w:pPr>
       <w:r>
-        <w:t xml:space="preserve">Si fra til Skatteetaten på nett</w:t>
+        <w:t xml:space="preserve">Endre skattekortet hos Skatteetaten</w:t>
       </w:r>
     </w:p>
     <w:p>
@@ -5214,27 +5214,27 @@
         <w:ind w:left="420"/>
       </w:pPr>
       <w:r>
-        <w:t xml:space="preserve">Jobb uten kontrakt og uten å betale skatt</w:t>
-      </w:r>
-    </w:p>
-    <w:p>
-      <w:pPr>
-        <w:keepNext/>
-        <w:spacing w:after="30"/>
-        <w:ind w:left="420"/>
-      </w:pPr>
-      <w:r>
-        <w:t xml:space="preserve">Jobb med ulovlige varer, som narkotika</w:t>
-      </w:r>
-    </w:p>
-    <w:p>
-      <w:pPr>
-        <w:keepNext w:val="false"/>
-        <w:spacing w:after="30"/>
-        <w:ind w:left="420"/>
-      </w:pPr>
-      <w:r>
-        <w:t xml:space="preserve">Jobb med ekstra lønn for farlig arbeid</w:t>
+        <w:t xml:space="preserve">Jobb der lønnen ikke blir meldt til Skatteetaten</w:t>
+      </w:r>
+    </w:p>
+    <w:p>
+      <w:pPr>
+        <w:keepNext/>
+        <w:spacing w:after="30"/>
+        <w:ind w:left="420"/>
+      </w:pPr>
+      <w:r>
+        <w:t xml:space="preserve">Jobb med ulovlige varer, for eksempel narkotika</w:t>
+      </w:r>
+    </w:p>
+    <w:p>
+      <w:pPr>
+        <w:keepNext w:val="false"/>
+        <w:spacing w:after="30"/>
+        <w:ind w:left="420"/>
+      </w:pPr>
+      <w:r>
+        <w:t xml:space="preserve">Jobb med ekstra lønn fordi arbeidet er farlig</w:t>
       </w:r>
     </w:p>
     <w:p>
@@ -5257,17 +5257,17 @@
         <w:ind w:left="420"/>
       </w:pPr>
       <w:r>
-        <w:t xml:space="preserve">Du får ikke feriepenger og dagpenger</w:t>
-      </w:r>
-    </w:p>
-    <w:p>
-      <w:pPr>
-        <w:keepNext/>
-        <w:spacing w:after="30"/>
-        <w:ind w:left="420"/>
-      </w:pPr>
-      <w:r>
-        <w:t xml:space="preserve">Du får sykepenger og forsikring på jobb</w:t>
+        <w:t xml:space="preserve">Du kan miste sykepenger, dagpenger og pensjon</w:t>
+      </w:r>
+    </w:p>
+    <w:p>
+      <w:pPr>
+        <w:keepNext/>
+        <w:spacing w:after="30"/>
+        <w:ind w:left="420"/>
+      </w:pPr>
+      <w:r>
+        <w:t xml:space="preserve">Du får mer lønn og trygge rettigheter</w:t>
       </w:r>
     </w:p>
     <w:p>
@@ -5548,7 +5548,7 @@
           <w:b/>
           <w:bCs/>
         </w:rPr>
-        <w:t xml:space="preserve">129. Hvor mange av innbyggerne jobbet i jordbruk i 1950?</w:t>
+        <w:t xml:space="preserve">129. Hvor mange av dem som jobbet, var i jordbruket i 1950?</w:t>
       </w:r>
     </w:p>
     <w:p>
@@ -5687,7 +5687,7 @@
         <w:ind w:left="420"/>
       </w:pPr>
       <w:r>
-        <w:t xml:space="preserve">Å gi et fast håndtrykk og se på dem</w:t>
+        <w:t xml:space="preserve">Å hilse høflig og se dem i øynene</w:t>
       </w:r>
     </w:p>
     <w:p>
@@ -5806,37 +5806,37 @@
           <w:b/>
           <w:bCs/>
         </w:rPr>
-        <w:t xml:space="preserve">135. Hva gjelder for ledige jobber i Norge, selv om få er arbeidsledige?</w:t>
-      </w:r>
-    </w:p>
-    <w:p>
-      <w:pPr>
-        <w:keepNext/>
-        <w:spacing w:after="30"/>
-        <w:ind w:left="420"/>
-      </w:pPr>
-      <w:r>
-        <w:t xml:space="preserve">Det er ofte mange som søker på jobbene</w:t>
-      </w:r>
-    </w:p>
-    <w:p>
-      <w:pPr>
-        <w:keepNext/>
-        <w:spacing w:after="30"/>
-        <w:ind w:left="420"/>
-      </w:pPr>
-      <w:r>
-        <w:t xml:space="preserve">Du får komme på intervju hvis du søker</w:t>
-      </w:r>
-    </w:p>
-    <w:p>
-      <w:pPr>
-        <w:keepNext w:val="false"/>
-        <w:spacing w:after="30"/>
-        <w:ind w:left="420"/>
-      </w:pPr>
-      <w:r>
-        <w:t xml:space="preserve">Man trenger ikke CV når få er arbeidsledige</w:t>
+        <w:t xml:space="preserve">135. Det er få arbeidsledige i Norge. Hva er likevel vanlig når en jobb lyses ut?</w:t>
+      </w:r>
+    </w:p>
+    <w:p>
+      <w:pPr>
+        <w:keepNext/>
+        <w:spacing w:after="30"/>
+        <w:ind w:left="420"/>
+      </w:pPr>
+      <w:r>
+        <w:t xml:space="preserve">At mange søker på den samme jobben</w:t>
+      </w:r>
+    </w:p>
+    <w:p>
+      <w:pPr>
+        <w:keepNext/>
+        <w:spacing w:after="30"/>
+        <w:ind w:left="420"/>
+      </w:pPr>
+      <w:r>
+        <w:t xml:space="preserve">At de som søker, får komme på intervju</w:t>
+      </w:r>
+    </w:p>
+    <w:p>
+      <w:pPr>
+        <w:keepNext w:val="false"/>
+        <w:spacing w:after="30"/>
+        <w:ind w:left="420"/>
+      </w:pPr>
+      <w:r>
+        <w:t xml:space="preserve">At du ikke trenger å sende CV</w:t>
       </w:r>
     </w:p>
     <w:p>
@@ -6504,7 +6504,7 @@
         <w:ind w:left="420"/>
       </w:pPr>
       <w:r>
-        <w:t xml:space="preserve">Staten, fylket eller kommunen</w:t>
+        <w:t xml:space="preserve">Staten, fylkeskommunen eller kommunen</w:t>
       </w:r>
     </w:p>
     <w:p>
@@ -6580,37 +6580,37 @@
           <w:b/>
           <w:bCs/>
         </w:rPr>
-        <w:t xml:space="preserve">153. Hvor mange jobber i Norge blir ikke lyst ut?</w:t>
-      </w:r>
-    </w:p>
-    <w:p>
-      <w:pPr>
-        <w:keepNext/>
-        <w:spacing w:after="30"/>
-        <w:ind w:left="420"/>
-      </w:pPr>
-      <w:r>
-        <w:t xml:space="preserve">Mellom 60 og 80 prosent</w:t>
-      </w:r>
-    </w:p>
-    <w:p>
-      <w:pPr>
-        <w:keepNext/>
-        <w:spacing w:after="30"/>
-        <w:ind w:left="420"/>
-      </w:pPr>
-      <w:r>
-        <w:t xml:space="preserve">Mellom 10 og 20 prosent</w:t>
-      </w:r>
-    </w:p>
-    <w:p>
-      <w:pPr>
-        <w:keepNext w:val="false"/>
-        <w:spacing w:after="30"/>
-        <w:ind w:left="420"/>
-      </w:pPr>
-      <w:r>
-        <w:t xml:space="preserve">Mellom 30 og 40 prosent</w:t>
+        <w:t xml:space="preserve">153. Mange jobber blir ikke lyst ut. Hvordan kan du få vite om dem?</w:t>
+      </w:r>
+    </w:p>
+    <w:p>
+      <w:pPr>
+        <w:keepNext/>
+        <w:spacing w:after="30"/>
+        <w:ind w:left="420"/>
+      </w:pPr>
+      <w:r>
+        <w:t xml:space="preserve">Gjennom nettverket ditt</w:t>
+      </w:r>
+    </w:p>
+    <w:p>
+      <w:pPr>
+        <w:keepNext/>
+        <w:spacing w:after="30"/>
+        <w:ind w:left="420"/>
+      </w:pPr>
+      <w:r>
+        <w:t xml:space="preserve">Gjennom skattemeldingen</w:t>
+      </w:r>
+    </w:p>
+    <w:p>
+      <w:pPr>
+        <w:keepNext w:val="false"/>
+        <w:spacing w:after="30"/>
+        <w:ind w:left="420"/>
+      </w:pPr>
+      <w:r>
+        <w:t xml:space="preserve">Gjennom Lånekassen</w:t>
       </w:r>
     </w:p>
     <w:p>
@@ -6942,7 +6942,7 @@
         <w:ind w:left="420"/>
       </w:pPr>
       <w:r>
-        <w:t xml:space="preserve">Å tenke kritisk om det du leser</w:t>
+        <w:t xml:space="preserve">Å vurdere om informasjonen stemmer</w:t>
       </w:r>
     </w:p>
     <w:p>
@@ -6962,7 +6962,7 @@
         <w:ind w:left="420"/>
       </w:pPr>
       <w:r>
-        <w:t xml:space="preserve">Å ikke like det du leser</w:t>
+        <w:t xml:space="preserve">Å lese det du liker best</w:t>
       </w:r>
     </w:p>
     <w:p>
@@ -7243,7 +7243,7 @@
         <w:ind w:left="420"/>
       </w:pPr>
       <w:r>
-        <w:t xml:space="preserve">Oppgi hvem som har laget det</w:t>
+        <w:t xml:space="preserve">Få lov og oppgi hvem som har laget det</w:t>
       </w:r>
     </w:p>
     <w:p>
@@ -7263,7 +7263,7 @@
         <w:ind w:left="420"/>
       </w:pPr>
       <w:r>
-        <w:t xml:space="preserve">Spørre vennene dine om lov</w:t>
+        <w:t xml:space="preserve">Spørre vennene dine om det er greit</w:t>
       </w:r>
     </w:p>
     <w:p>
@@ -7716,7 +7716,7 @@
         <w:ind w:left="420"/>
       </w:pPr>
       <w:r>
-        <w:t xml:space="preserve">Rasistiske og diskriminerende utsagn</w:t>
+        <w:t xml:space="preserve">Trusler og hatefulle ytringer mot noen</w:t>
       </w:r>
     </w:p>
     <w:p>
@@ -7974,7 +7974,7 @@
         <w:ind w:left="420"/>
       </w:pPr>
       <w:r>
-        <w:t xml:space="preserve">Ting som hører til deg og dine</w:t>
+        <w:t xml:space="preserve">Ting som bare gjelder deg og familien din</w:t>
       </w:r>
     </w:p>
     <w:p>
@@ -8050,37 +8050,37 @@
           <w:b/>
           <w:bCs/>
         </w:rPr>
-        <w:t xml:space="preserve">187. Noen deler et privat bilde av deg og skriver løgn om deg. Hva er dette?</w:t>
-      </w:r>
-    </w:p>
-    <w:p>
-      <w:pPr>
-        <w:keepNext/>
-        <w:spacing w:after="30"/>
-        <w:ind w:left="420"/>
-      </w:pPr>
-      <w:r>
-        <w:t xml:space="preserve">Ulovlig, og du kan melde det til politiet</w:t>
-      </w:r>
-    </w:p>
-    <w:p>
-      <w:pPr>
-        <w:keepNext/>
-        <w:spacing w:after="30"/>
-        <w:ind w:left="420"/>
-      </w:pPr>
-      <w:r>
-        <w:t xml:space="preserve">Lovlig, fordi det er ytringsfrihet</w:t>
-      </w:r>
-    </w:p>
-    <w:p>
-      <w:pPr>
-        <w:keepNext w:val="false"/>
-        <w:spacing w:after="30"/>
-        <w:ind w:left="420"/>
-      </w:pPr>
-      <w:r>
-        <w:t xml:space="preserve">Lovlig, hvis profilen er offentlig</w:t>
+        <w:t xml:space="preserve">187. Noen deler et privat bilde av deg uten å spørre deg. Hva er dette?</w:t>
+      </w:r>
+    </w:p>
+    <w:p>
+      <w:pPr>
+        <w:keepNext/>
+        <w:spacing w:after="30"/>
+        <w:ind w:left="420"/>
+      </w:pPr>
+      <w:r>
+        <w:t xml:space="preserve">Det kan være ulovlig, og du kan melde det</w:t>
+      </w:r>
+    </w:p>
+    <w:p>
+      <w:pPr>
+        <w:keepNext/>
+        <w:spacing w:after="30"/>
+        <w:ind w:left="420"/>
+      </w:pPr>
+      <w:r>
+        <w:t xml:space="preserve">Det er lovlig, fordi det er ytringsfrihet</w:t>
+      </w:r>
+    </w:p>
+    <w:p>
+      <w:pPr>
+        <w:keepNext w:val="false"/>
+        <w:spacing w:after="30"/>
+        <w:ind w:left="420"/>
+      </w:pPr>
+      <w:r>
+        <w:t xml:space="preserve">Det er lovlig, hvis profilen er offentlig</w:t>
       </w:r>
     </w:p>
     <w:p>
@@ -8123,7 +8123,7 @@
         <w:ind w:left="420"/>
       </w:pPr>
       <w:r>
-        <w:t xml:space="preserve">Det er nærmeste venner som ser det du deler</w:t>
+        <w:t xml:space="preserve">De nærmeste vennene dine er de eneste som ser det</w:t>
       </w:r>
     </w:p>
     <w:p>
@@ -8232,27 +8232,27 @@
         <w:ind w:left="420"/>
       </w:pPr>
       <w:r>
-        <w:t xml:space="preserve">En kilde som sier hvem som står bak</w:t>
-      </w:r>
-    </w:p>
-    <w:p>
-      <w:pPr>
-        <w:keepNext/>
-        <w:spacing w:after="30"/>
-        <w:ind w:left="420"/>
-      </w:pPr>
-      <w:r>
-        <w:t xml:space="preserve">En kilde som har mange følgere</w:t>
-      </w:r>
-    </w:p>
-    <w:p>
-      <w:pPr>
-        <w:keepNext w:val="false"/>
-        <w:spacing w:after="30"/>
-        <w:ind w:left="420"/>
-      </w:pPr>
-      <w:r>
-        <w:t xml:space="preserve">En kilde som bruker store overskrifter</w:t>
+        <w:t xml:space="preserve">En kjent kilde som viser hvor fakta kommer fra</w:t>
+      </w:r>
+    </w:p>
+    <w:p>
+      <w:pPr>
+        <w:keepNext/>
+        <w:spacing w:after="30"/>
+        <w:ind w:left="420"/>
+      </w:pPr>
+      <w:r>
+        <w:t xml:space="preserve">En kilde som har svært mange følgere</w:t>
+      </w:r>
+    </w:p>
+    <w:p>
+      <w:pPr>
+        <w:keepNext w:val="false"/>
+        <w:spacing w:after="30"/>
+        <w:ind w:left="420"/>
+      </w:pPr>
+      <w:r>
+        <w:t xml:space="preserve">En kilde som bruker store, sterke overskrifter</w:t>
       </w:r>
     </w:p>
     <w:p>
@@ -9254,7 +9254,7 @@
           <w:b/>
           <w:bCs/>
         </w:rPr>
-        <w:t xml:space="preserve">215. Hva er et personnummer?</w:t>
+        <w:t xml:space="preserve">215. Hva er et fødselsnummer (personnummer)?</w:t>
       </w:r>
     </w:p>
     <w:p>
@@ -9833,7 +9833,7 @@
         <w:ind w:left="420"/>
       </w:pPr>
       <w:r>
-        <w:t xml:space="preserve">Den kommer fra en kollega du kjenner</w:t>
+        <w:t xml:space="preserve">Den har riktig navn og logo fra banken</w:t>
       </w:r>
     </w:p>
     <w:p>
@@ -9866,27 +9866,27 @@
         <w:ind w:left="420"/>
       </w:pPr>
       <w:r>
-        <w:t xml:space="preserve">Andre kan se hva du gjør på nettet</w:t>
-      </w:r>
-    </w:p>
-    <w:p>
-      <w:pPr>
-        <w:keepNext/>
-        <w:spacing w:after="30"/>
-        <w:ind w:left="420"/>
-      </w:pPr>
-      <w:r>
-        <w:t xml:space="preserve">Wifi er ulovlig å bruke i Norge</w:t>
-      </w:r>
-    </w:p>
-    <w:p>
-      <w:pPr>
-        <w:keepNext w:val="false"/>
-        <w:spacing w:after="30"/>
-        <w:ind w:left="420"/>
-      </w:pPr>
-      <w:r>
-        <w:t xml:space="preserve">Nettbanken fungerer ikke på kafé</w:t>
+        <w:t xml:space="preserve">Noen kan lage et falskt wifi og lure deg</w:t>
+      </w:r>
+    </w:p>
+    <w:p>
+      <w:pPr>
+        <w:keepNext/>
+        <w:spacing w:after="30"/>
+        <w:ind w:left="420"/>
+      </w:pPr>
+      <w:r>
+        <w:t xml:space="preserve">Wifi er ulovlig å bruke på kafé i Norge</w:t>
+      </w:r>
+    </w:p>
+    <w:p>
+      <w:pPr>
+        <w:keepNext w:val="false"/>
+        <w:spacing w:after="30"/>
+        <w:ind w:left="420"/>
+      </w:pPr>
+      <w:r>
+        <w:t xml:space="preserve">Nettbanken virker ikke når du er på kafé</w:t>
       </w:r>
     </w:p>
     <w:p>

</xml_diff>

<commit_message>
Legg til Ny i Norge (80 spørsmål) på siste main
Ny underkategori under Familie, helse og hverdagsliv med fire emner.
Trekningen fordeler jevnt mellom emner og fyller opp når et emne er lite.
Validering, byggeskript, md-fil, tester og dokumentasjon er utvidet.
Cursors kategorivalg, prøvemodus (38), diplom og Les her er beholdt.

Co-Authored-By: Claude Sonnet 5.5 <noreply@anthropic.com>
Claude-Session: https://claude.ai/code/session_011UYoyR9gVzG4pSPdKNw8ZV
</commit_message>
<xml_diff>
--- a/sporsmalsbank/ut/Spørsmålsbank_samfunnskunnskap.docx
+++ b/sporsmalsbank/ut/Spørsmålsbank_samfunnskunnskap.docx
@@ -15,7 +15,7 @@
         <w:spacing w:after="100"/>
       </w:pPr>
       <w:r>
-        <w:t xml:space="preserve">240 flervalgsspørsmål. Det første svaralternativet er alltid riktig.</w:t>
+        <w:t xml:space="preserve">320 flervalgsspørsmål. Det første svaralternativet er alltid riktig.</w:t>
       </w:r>
     </w:p>
     <w:p>
@@ -10360,6 +10360,3454 @@
       </w:pPr>
       <w:r>
         <w:t xml:space="preserve">En video som er tatt opp med dårlig lyd</w:t>
+      </w:r>
+    </w:p>
+    <w:p>
+      <w:pPr>
+        <w:pStyle w:val="Heading1"/>
+      </w:pPr>
+      <w:r>
+        <w:t xml:space="preserve">Ny i Norge (80 spørsmål)</w:t>
+      </w:r>
+    </w:p>
+    <w:p>
+      <w:pPr>
+        <w:keepNext/>
+        <w:spacing w:after="60" w:before="180"/>
+      </w:pPr>
+      <w:r>
+        <w:rPr>
+          <w:b/>
+          <w:bCs/>
+        </w:rPr>
+        <w:t xml:space="preserve">241. Omtrent hvor mange barn blir født i Norge hvert år?</w:t>
+      </w:r>
+    </w:p>
+    <w:p>
+      <w:pPr>
+        <w:keepNext/>
+        <w:spacing w:after="30"/>
+        <w:ind w:left="420"/>
+      </w:pPr>
+      <w:r>
+        <w:t xml:space="preserve">Omtrent 50 000 barn</w:t>
+      </w:r>
+    </w:p>
+    <w:p>
+      <w:pPr>
+        <w:keepNext/>
+        <w:spacing w:after="30"/>
+        <w:ind w:left="420"/>
+      </w:pPr>
+      <w:r>
+        <w:t xml:space="preserve">Omtrent 5 000 barn</w:t>
+      </w:r>
+    </w:p>
+    <w:p>
+      <w:pPr>
+        <w:keepNext w:val="false"/>
+        <w:spacing w:after="30"/>
+        <w:ind w:left="420"/>
+      </w:pPr>
+      <w:r>
+        <w:t xml:space="preserve">Omtrent 500 000 barn</w:t>
+      </w:r>
+    </w:p>
+    <w:p>
+      <w:pPr>
+        <w:keepNext/>
+        <w:spacing w:after="60" w:before="180"/>
+      </w:pPr>
+      <w:r>
+        <w:rPr>
+          <w:b/>
+          <w:bCs/>
+        </w:rPr>
+        <w:t xml:space="preserve">242. Hvor mange barn får en kvinne i Norge i gjennomsnitt?</w:t>
+      </w:r>
+    </w:p>
+    <w:p>
+      <w:pPr>
+        <w:keepNext/>
+        <w:spacing w:after="30"/>
+        <w:ind w:left="420"/>
+      </w:pPr>
+      <w:r>
+        <w:t xml:space="preserve">Omtrent 1,4 barn</w:t>
+      </w:r>
+    </w:p>
+    <w:p>
+      <w:pPr>
+        <w:keepNext/>
+        <w:spacing w:after="30"/>
+        <w:ind w:left="420"/>
+      </w:pPr>
+      <w:r>
+        <w:t xml:space="preserve">Omtrent 3 barn</w:t>
+      </w:r>
+    </w:p>
+    <w:p>
+      <w:pPr>
+        <w:keepNext w:val="false"/>
+        <w:spacing w:after="30"/>
+        <w:ind w:left="420"/>
+      </w:pPr>
+      <w:r>
+        <w:t xml:space="preserve">Omtrent 5 barn</w:t>
+      </w:r>
+    </w:p>
+    <w:p>
+      <w:pPr>
+        <w:keepNext/>
+        <w:spacing w:after="60" w:before="180"/>
+      </w:pPr>
+      <w:r>
+        <w:rPr>
+          <w:b/>
+          <w:bCs/>
+        </w:rPr>
+        <w:t xml:space="preserve">243. Hvor gammel er en kvinne i Norge når hun får første barn?</w:t>
+      </w:r>
+    </w:p>
+    <w:p>
+      <w:pPr>
+        <w:keepNext/>
+        <w:spacing w:after="30"/>
+        <w:ind w:left="420"/>
+      </w:pPr>
+      <w:r>
+        <w:t xml:space="preserve">Omtrent 30 år gammel</w:t>
+      </w:r>
+    </w:p>
+    <w:p>
+      <w:pPr>
+        <w:keepNext/>
+        <w:spacing w:after="30"/>
+        <w:ind w:left="420"/>
+      </w:pPr>
+      <w:r>
+        <w:t xml:space="preserve">Omtrent 20 år gammel</w:t>
+      </w:r>
+    </w:p>
+    <w:p>
+      <w:pPr>
+        <w:keepNext w:val="false"/>
+        <w:spacing w:after="30"/>
+        <w:ind w:left="420"/>
+      </w:pPr>
+      <w:r>
+        <w:t xml:space="preserve">Omtrent 40 år gammel</w:t>
+      </w:r>
+    </w:p>
+    <w:p>
+      <w:pPr>
+        <w:keepNext/>
+        <w:spacing w:after="60" w:before="180"/>
+      </w:pPr>
+      <w:r>
+        <w:rPr>
+          <w:b/>
+          <w:bCs/>
+        </w:rPr>
+        <w:t xml:space="preserve">244. Hva sier norsk lov om omskjæring av jenter?</w:t>
+      </w:r>
+    </w:p>
+    <w:p>
+      <w:pPr>
+        <w:keepNext/>
+        <w:spacing w:after="30"/>
+        <w:ind w:left="420"/>
+      </w:pPr>
+      <w:r>
+        <w:t xml:space="preserve">Det er forbudt, og straffen kan være opptil 15 år i fengsel</w:t>
+      </w:r>
+    </w:p>
+    <w:p>
+      <w:pPr>
+        <w:keepNext/>
+        <w:spacing w:after="30"/>
+        <w:ind w:left="420"/>
+      </w:pPr>
+      <w:r>
+        <w:t xml:space="preserve">Det er lov hvis foreldrene ønsker det og legen er enig</w:t>
+      </w:r>
+    </w:p>
+    <w:p>
+      <w:pPr>
+        <w:keepNext w:val="false"/>
+        <w:spacing w:after="30"/>
+        <w:ind w:left="420"/>
+      </w:pPr>
+      <w:r>
+        <w:t xml:space="preserve">Det er lov hvis jenta er over ti år gammel</w:t>
+      </w:r>
+    </w:p>
+    <w:p>
+      <w:pPr>
+        <w:keepNext/>
+        <w:spacing w:after="60" w:before="180"/>
+      </w:pPr>
+      <w:r>
+        <w:rPr>
+          <w:b/>
+          <w:bCs/>
+        </w:rPr>
+        <w:t xml:space="preserve">245. Hva er en barnehage?</w:t>
+      </w:r>
+    </w:p>
+    <w:p>
+      <w:pPr>
+        <w:keepNext/>
+        <w:spacing w:after="30"/>
+        <w:ind w:left="420"/>
+      </w:pPr>
+      <w:r>
+        <w:t xml:space="preserve">Et sted for små barn mens foreldrene er på jobb eller skole</w:t>
+      </w:r>
+    </w:p>
+    <w:p>
+      <w:pPr>
+        <w:keepNext/>
+        <w:spacing w:after="30"/>
+        <w:ind w:left="420"/>
+      </w:pPr>
+      <w:r>
+        <w:t xml:space="preserve">Et sted der barn lærer å lese og skrive før de begynner på skolen</w:t>
+      </w:r>
+    </w:p>
+    <w:p>
+      <w:pPr>
+        <w:keepNext w:val="false"/>
+        <w:spacing w:after="30"/>
+        <w:ind w:left="420"/>
+      </w:pPr>
+      <w:r>
+        <w:t xml:space="preserve">Et sted der barn bor når foreldrene er syke</w:t>
+      </w:r>
+    </w:p>
+    <w:p>
+      <w:pPr>
+        <w:keepNext/>
+        <w:spacing w:after="60" w:before="180"/>
+      </w:pPr>
+      <w:r>
+        <w:rPr>
+          <w:b/>
+          <w:bCs/>
+        </w:rPr>
+        <w:t xml:space="preserve">246. Hva betyr ordet «egenandel»?</w:t>
+      </w:r>
+    </w:p>
+    <w:p>
+      <w:pPr>
+        <w:keepNext/>
+        <w:spacing w:after="30"/>
+        <w:ind w:left="420"/>
+      </w:pPr>
+      <w:r>
+        <w:t xml:space="preserve">En del av prisen som du betaler selv</w:t>
+      </w:r>
+    </w:p>
+    <w:p>
+      <w:pPr>
+        <w:keepNext/>
+        <w:spacing w:after="30"/>
+        <w:ind w:left="420"/>
+      </w:pPr>
+      <w:r>
+        <w:t xml:space="preserve">Penger som du får fra staten</w:t>
+      </w:r>
+    </w:p>
+    <w:p>
+      <w:pPr>
+        <w:keepNext w:val="false"/>
+        <w:spacing w:after="30"/>
+        <w:ind w:left="420"/>
+      </w:pPr>
+      <w:r>
+        <w:t xml:space="preserve">Penger som du låner av banken</w:t>
+      </w:r>
+    </w:p>
+    <w:p>
+      <w:pPr>
+        <w:keepNext/>
+        <w:spacing w:after="60" w:before="180"/>
+      </w:pPr>
+      <w:r>
+        <w:rPr>
+          <w:b/>
+          <w:bCs/>
+        </w:rPr>
+        <w:t xml:space="preserve">247. Hva betaler foreldre for en plass i barnehagen?</w:t>
+      </w:r>
+    </w:p>
+    <w:p>
+      <w:pPr>
+        <w:keepNext/>
+        <w:spacing w:after="30"/>
+        <w:ind w:left="420"/>
+      </w:pPr>
+      <w:r>
+        <w:t xml:space="preserve">En egenandel hver måned</w:t>
+      </w:r>
+    </w:p>
+    <w:p>
+      <w:pPr>
+        <w:keepNext/>
+        <w:spacing w:after="30"/>
+        <w:ind w:left="420"/>
+      </w:pPr>
+      <w:r>
+        <w:t xml:space="preserve">Foreldrene betaler full pris selv</w:t>
+      </w:r>
+    </w:p>
+    <w:p>
+      <w:pPr>
+        <w:keepNext w:val="false"/>
+        <w:spacing w:after="30"/>
+        <w:ind w:left="420"/>
+      </w:pPr>
+      <w:r>
+        <w:t xml:space="preserve">Barnehagen er gratis for foreldrene</w:t>
+      </w:r>
+    </w:p>
+    <w:p>
+      <w:pPr>
+        <w:keepNext/>
+        <w:spacing w:after="60" w:before="180"/>
+      </w:pPr>
+      <w:r>
+        <w:rPr>
+          <w:b/>
+          <w:bCs/>
+        </w:rPr>
+        <w:t xml:space="preserve">248. Hvem kan få kontantstøtte?</w:t>
+      </w:r>
+    </w:p>
+    <w:p>
+      <w:pPr>
+        <w:keepNext/>
+        <w:spacing w:after="30"/>
+        <w:ind w:left="420"/>
+      </w:pPr>
+      <w:r>
+        <w:t xml:space="preserve">Foreldre med små barn som ikke har barnehageplass</w:t>
+      </w:r>
+    </w:p>
+    <w:p>
+      <w:pPr>
+        <w:keepNext/>
+        <w:spacing w:after="30"/>
+        <w:ind w:left="420"/>
+      </w:pPr>
+      <w:r>
+        <w:t xml:space="preserve">Foreldre som har barn på ungdomsskolen og videregående</w:t>
+      </w:r>
+    </w:p>
+    <w:p>
+      <w:pPr>
+        <w:keepNext w:val="false"/>
+        <w:spacing w:after="30"/>
+        <w:ind w:left="420"/>
+      </w:pPr>
+      <w:r>
+        <w:t xml:space="preserve">Foreldre som tar utdanning i utlandet</w:t>
+      </w:r>
+    </w:p>
+    <w:p>
+      <w:pPr>
+        <w:keepNext/>
+        <w:spacing w:after="60" w:before="180"/>
+      </w:pPr>
+      <w:r>
+        <w:rPr>
+          <w:b/>
+          <w:bCs/>
+        </w:rPr>
+        <w:t xml:space="preserve">249. Hva er foreldrepenger?</w:t>
+      </w:r>
+    </w:p>
+    <w:p>
+      <w:pPr>
+        <w:keepNext/>
+        <w:spacing w:after="30"/>
+        <w:ind w:left="420"/>
+      </w:pPr>
+      <w:r>
+        <w:t xml:space="preserve">Penger fra Nav når foreldre er hjemme med et nytt barn</w:t>
+      </w:r>
+    </w:p>
+    <w:p>
+      <w:pPr>
+        <w:keepNext/>
+        <w:spacing w:after="30"/>
+        <w:ind w:left="420"/>
+      </w:pPr>
+      <w:r>
+        <w:t xml:space="preserve">Penger fra barnehagen når barnet begynner</w:t>
+      </w:r>
+    </w:p>
+    <w:p>
+      <w:pPr>
+        <w:keepNext w:val="false"/>
+        <w:spacing w:after="30"/>
+        <w:ind w:left="420"/>
+      </w:pPr>
+      <w:r>
+        <w:t xml:space="preserve">Penger fra skolen når barnet er syk</w:t>
+      </w:r>
+    </w:p>
+    <w:p>
+      <w:pPr>
+        <w:keepNext/>
+        <w:spacing w:after="60" w:before="180"/>
+      </w:pPr>
+      <w:r>
+        <w:rPr>
+          <w:b/>
+          <w:bCs/>
+        </w:rPr>
+        <w:t xml:space="preserve">250. Hvem betaler barnetrygd til foreldrene?</w:t>
+      </w:r>
+    </w:p>
+    <w:p>
+      <w:pPr>
+        <w:keepNext/>
+        <w:spacing w:after="30"/>
+        <w:ind w:left="420"/>
+      </w:pPr>
+      <w:r>
+        <w:t xml:space="preserve">Staten</w:t>
+      </w:r>
+    </w:p>
+    <w:p>
+      <w:pPr>
+        <w:keepNext/>
+        <w:spacing w:after="30"/>
+        <w:ind w:left="420"/>
+      </w:pPr>
+      <w:r>
+        <w:t xml:space="preserve">Arbeidsgiveren</w:t>
+      </w:r>
+    </w:p>
+    <w:p>
+      <w:pPr>
+        <w:keepNext w:val="false"/>
+        <w:spacing w:after="30"/>
+        <w:ind w:left="420"/>
+      </w:pPr>
+      <w:r>
+        <w:t xml:space="preserve">Barnehagen</w:t>
+      </w:r>
+    </w:p>
+    <w:p>
+      <w:pPr>
+        <w:keepNext/>
+        <w:spacing w:after="60" w:before="180"/>
+      </w:pPr>
+      <w:r>
+        <w:rPr>
+          <w:b/>
+          <w:bCs/>
+        </w:rPr>
+        <w:t xml:space="preserve">251. Hvor lenge får foreldre barnetrygd for et barn?</w:t>
+      </w:r>
+    </w:p>
+    <w:p>
+      <w:pPr>
+        <w:keepNext/>
+        <w:spacing w:after="30"/>
+        <w:ind w:left="420"/>
+      </w:pPr>
+      <w:r>
+        <w:t xml:space="preserve">Til barnet er 18 år</w:t>
+      </w:r>
+    </w:p>
+    <w:p>
+      <w:pPr>
+        <w:keepNext/>
+        <w:spacing w:after="30"/>
+        <w:ind w:left="420"/>
+      </w:pPr>
+      <w:r>
+        <w:t xml:space="preserve">Til barnet er 12 år</w:t>
+      </w:r>
+    </w:p>
+    <w:p>
+      <w:pPr>
+        <w:keepNext w:val="false"/>
+        <w:spacing w:after="30"/>
+        <w:ind w:left="420"/>
+      </w:pPr>
+      <w:r>
+        <w:t xml:space="preserve">Til barnet begynner på skole</w:t>
+      </w:r>
+    </w:p>
+    <w:p>
+      <w:pPr>
+        <w:keepNext/>
+        <w:spacing w:after="60" w:before="180"/>
+      </w:pPr>
+      <w:r>
+        <w:rPr>
+          <w:b/>
+          <w:bCs/>
+        </w:rPr>
+        <w:t xml:space="preserve">252. Hvor mye barnetrygd får et barn i en rik familie?</w:t>
+      </w:r>
+    </w:p>
+    <w:p>
+      <w:pPr>
+        <w:keepNext/>
+        <w:spacing w:after="30"/>
+        <w:ind w:left="420"/>
+      </w:pPr>
+      <w:r>
+        <w:t xml:space="preserve">Like mye som et barn i en fattig familie</w:t>
+      </w:r>
+    </w:p>
+    <w:p>
+      <w:pPr>
+        <w:keepNext/>
+        <w:spacing w:after="30"/>
+        <w:ind w:left="420"/>
+      </w:pPr>
+      <w:r>
+        <w:t xml:space="preserve">Mer enn et barn i en fattig familie</w:t>
+      </w:r>
+    </w:p>
+    <w:p>
+      <w:pPr>
+        <w:keepNext w:val="false"/>
+        <w:spacing w:after="30"/>
+        <w:ind w:left="420"/>
+      </w:pPr>
+      <w:r>
+        <w:t xml:space="preserve">Mindre enn et barn i en fattig familie</w:t>
+      </w:r>
+    </w:p>
+    <w:p>
+      <w:pPr>
+        <w:keepNext/>
+        <w:spacing w:after="60" w:before="180"/>
+      </w:pPr>
+      <w:r>
+        <w:rPr>
+          <w:b/>
+          <w:bCs/>
+        </w:rPr>
+        <w:t xml:space="preserve">253. Hvor mange år varer grunnskolen i Norge?</w:t>
+      </w:r>
+    </w:p>
+    <w:p>
+      <w:pPr>
+        <w:keepNext/>
+        <w:spacing w:after="30"/>
+        <w:ind w:left="420"/>
+      </w:pPr>
+      <w:r>
+        <w:t xml:space="preserve">Ti år</w:t>
+      </w:r>
+    </w:p>
+    <w:p>
+      <w:pPr>
+        <w:keepNext/>
+        <w:spacing w:after="30"/>
+        <w:ind w:left="420"/>
+      </w:pPr>
+      <w:r>
+        <w:t xml:space="preserve">Syv år</w:t>
+      </w:r>
+    </w:p>
+    <w:p>
+      <w:pPr>
+        <w:keepNext w:val="false"/>
+        <w:spacing w:after="30"/>
+        <w:ind w:left="420"/>
+      </w:pPr>
+      <w:r>
+        <w:t xml:space="preserve">Tretten år</w:t>
+      </w:r>
+    </w:p>
+    <w:p>
+      <w:pPr>
+        <w:keepNext/>
+        <w:spacing w:after="60" w:before="180"/>
+      </w:pPr>
+      <w:r>
+        <w:rPr>
+          <w:b/>
+          <w:bCs/>
+        </w:rPr>
+        <w:t xml:space="preserve">254. Hvilke klasser er barneskolen?</w:t>
+      </w:r>
+    </w:p>
+    <w:p>
+      <w:pPr>
+        <w:keepNext/>
+        <w:spacing w:after="30"/>
+        <w:ind w:left="420"/>
+      </w:pPr>
+      <w:r>
+        <w:t xml:space="preserve">1. til 7. klasse</w:t>
+      </w:r>
+    </w:p>
+    <w:p>
+      <w:pPr>
+        <w:keepNext/>
+        <w:spacing w:after="30"/>
+        <w:ind w:left="420"/>
+      </w:pPr>
+      <w:r>
+        <w:t xml:space="preserve">1. til 4. klasse</w:t>
+      </w:r>
+    </w:p>
+    <w:p>
+      <w:pPr>
+        <w:keepNext w:val="false"/>
+        <w:spacing w:after="30"/>
+        <w:ind w:left="420"/>
+      </w:pPr>
+      <w:r>
+        <w:t xml:space="preserve">5. til 10. klasse</w:t>
+      </w:r>
+    </w:p>
+    <w:p>
+      <w:pPr>
+        <w:keepNext/>
+        <w:spacing w:after="60" w:before="180"/>
+      </w:pPr>
+      <w:r>
+        <w:rPr>
+          <w:b/>
+          <w:bCs/>
+        </w:rPr>
+        <w:t xml:space="preserve">255. Hvor gamle er elever på ungdomsskolen?</w:t>
+      </w:r>
+    </w:p>
+    <w:p>
+      <w:pPr>
+        <w:keepNext/>
+        <w:spacing w:after="30"/>
+        <w:ind w:left="420"/>
+      </w:pPr>
+      <w:r>
+        <w:t xml:space="preserve">Omtrent 13 til 16 år</w:t>
+      </w:r>
+    </w:p>
+    <w:p>
+      <w:pPr>
+        <w:keepNext/>
+        <w:spacing w:after="30"/>
+        <w:ind w:left="420"/>
+      </w:pPr>
+      <w:r>
+        <w:t xml:space="preserve">Omtrent 7 til 10 år</w:t>
+      </w:r>
+    </w:p>
+    <w:p>
+      <w:pPr>
+        <w:keepNext w:val="false"/>
+        <w:spacing w:after="30"/>
+        <w:ind w:left="420"/>
+      </w:pPr>
+      <w:r>
+        <w:t xml:space="preserve">Omtrent 16 til 19 år</w:t>
+      </w:r>
+    </w:p>
+    <w:p>
+      <w:pPr>
+        <w:keepNext/>
+        <w:spacing w:after="60" w:before="180"/>
+      </w:pPr>
+      <w:r>
+        <w:rPr>
+          <w:b/>
+          <w:bCs/>
+        </w:rPr>
+        <w:t xml:space="preserve">256. Fra hvilken alder må barn gå på skole i Norge?</w:t>
+      </w:r>
+    </w:p>
+    <w:p>
+      <w:pPr>
+        <w:keepNext/>
+        <w:spacing w:after="30"/>
+        <w:ind w:left="420"/>
+      </w:pPr>
+      <w:r>
+        <w:t xml:space="preserve">Fra de er seks år, i 1. klasse</w:t>
+      </w:r>
+    </w:p>
+    <w:p>
+      <w:pPr>
+        <w:keepNext/>
+        <w:spacing w:after="30"/>
+        <w:ind w:left="420"/>
+      </w:pPr>
+      <w:r>
+        <w:t xml:space="preserve">Fra de er tre år, som i barnehagen</w:t>
+      </w:r>
+    </w:p>
+    <w:p>
+      <w:pPr>
+        <w:keepNext w:val="false"/>
+        <w:spacing w:after="30"/>
+        <w:ind w:left="420"/>
+      </w:pPr>
+      <w:r>
+        <w:t xml:space="preserve">Fra de er ti år, i 5. klasse</w:t>
+      </w:r>
+    </w:p>
+    <w:p>
+      <w:pPr>
+        <w:keepNext/>
+        <w:spacing w:after="60" w:before="180"/>
+      </w:pPr>
+      <w:r>
+        <w:rPr>
+          <w:b/>
+          <w:bCs/>
+        </w:rPr>
+        <w:t xml:space="preserve">257. Hva koster det å gå på offentlig grunnskole?</w:t>
+      </w:r>
+    </w:p>
+    <w:p>
+      <w:pPr>
+        <w:keepNext/>
+        <w:spacing w:after="30"/>
+        <w:ind w:left="420"/>
+      </w:pPr>
+      <w:r>
+        <w:t xml:space="preserve">Ingenting, skolen er gratis</w:t>
+      </w:r>
+    </w:p>
+    <w:p>
+      <w:pPr>
+        <w:keepNext/>
+        <w:spacing w:after="30"/>
+        <w:ind w:left="420"/>
+      </w:pPr>
+      <w:r>
+        <w:t xml:space="preserve">En liten pris hver måned</w:t>
+      </w:r>
+    </w:p>
+    <w:p>
+      <w:pPr>
+        <w:keepNext w:val="false"/>
+        <w:spacing w:after="30"/>
+        <w:ind w:left="420"/>
+      </w:pPr>
+      <w:r>
+        <w:t xml:space="preserve">Halv pris for lav inntekt</w:t>
+      </w:r>
+    </w:p>
+    <w:p>
+      <w:pPr>
+        <w:keepNext/>
+        <w:spacing w:after="60" w:before="180"/>
+      </w:pPr>
+      <w:r>
+        <w:rPr>
+          <w:b/>
+          <w:bCs/>
+        </w:rPr>
+        <w:t xml:space="preserve">258. Hva er SFO?</w:t>
+      </w:r>
+    </w:p>
+    <w:p>
+      <w:pPr>
+        <w:keepNext/>
+        <w:spacing w:after="30"/>
+        <w:ind w:left="420"/>
+      </w:pPr>
+      <w:r>
+        <w:t xml:space="preserve">Et tilbud for barn på skolen før og etter skoletid</w:t>
+      </w:r>
+    </w:p>
+    <w:p>
+      <w:pPr>
+        <w:keepNext/>
+        <w:spacing w:after="30"/>
+        <w:ind w:left="420"/>
+      </w:pPr>
+      <w:r>
+        <w:t xml:space="preserve">Et fag på barneskolen der barna lærer om sport og friluftsliv</w:t>
+      </w:r>
+    </w:p>
+    <w:p>
+      <w:pPr>
+        <w:keepNext w:val="false"/>
+        <w:spacing w:after="30"/>
+        <w:ind w:left="420"/>
+      </w:pPr>
+      <w:r>
+        <w:t xml:space="preserve">En skole for barn som trenger ekstra hjelp</w:t>
+      </w:r>
+    </w:p>
+    <w:p>
+      <w:pPr>
+        <w:keepNext/>
+        <w:spacing w:after="60" w:before="180"/>
+      </w:pPr>
+      <w:r>
+        <w:rPr>
+          <w:b/>
+          <w:bCs/>
+        </w:rPr>
+        <w:t xml:space="preserve">259. Omtrent hvor mange barn i 1. til 4. klasse går på SFO?</w:t>
+      </w:r>
+    </w:p>
+    <w:p>
+      <w:pPr>
+        <w:keepNext/>
+        <w:spacing w:after="30"/>
+        <w:ind w:left="420"/>
+      </w:pPr>
+      <w:r>
+        <w:t xml:space="preserve">Omtrent åtte av ti barn</w:t>
+      </w:r>
+    </w:p>
+    <w:p>
+      <w:pPr>
+        <w:keepNext/>
+        <w:spacing w:after="30"/>
+        <w:ind w:left="420"/>
+      </w:pPr>
+      <w:r>
+        <w:t xml:space="preserve">Omtrent to av ti barn</w:t>
+      </w:r>
+    </w:p>
+    <w:p>
+      <w:pPr>
+        <w:keepNext w:val="false"/>
+        <w:spacing w:after="30"/>
+        <w:ind w:left="420"/>
+      </w:pPr>
+      <w:r>
+        <w:t xml:space="preserve">Omtrent én av ti barn</w:t>
+      </w:r>
+    </w:p>
+    <w:p>
+      <w:pPr>
+        <w:keepNext/>
+        <w:spacing w:after="60" w:before="180"/>
+      </w:pPr>
+      <w:r>
+        <w:rPr>
+          <w:b/>
+          <w:bCs/>
+        </w:rPr>
+        <w:t xml:space="preserve">260. Hvor mange fullfører videregående skole i Norge?</w:t>
+      </w:r>
+    </w:p>
+    <w:p>
+      <w:pPr>
+        <w:keepNext/>
+        <w:spacing w:after="30"/>
+        <w:ind w:left="420"/>
+      </w:pPr>
+      <w:r>
+        <w:t xml:space="preserve">Nesten åtte av ti elever</w:t>
+      </w:r>
+    </w:p>
+    <w:p>
+      <w:pPr>
+        <w:keepNext/>
+        <w:spacing w:after="30"/>
+        <w:ind w:left="420"/>
+      </w:pPr>
+      <w:r>
+        <w:t xml:space="preserve">Omtrent fire av ti elever</w:t>
+      </w:r>
+    </w:p>
+    <w:p>
+      <w:pPr>
+        <w:keepNext w:val="false"/>
+        <w:spacing w:after="30"/>
+        <w:ind w:left="420"/>
+      </w:pPr>
+      <w:r>
+        <w:t xml:space="preserve">Omtrent seks av ti elever</w:t>
+      </w:r>
+    </w:p>
+    <w:p>
+      <w:pPr>
+        <w:keepNext/>
+        <w:spacing w:after="60" w:before="180"/>
+      </w:pPr>
+      <w:r>
+        <w:rPr>
+          <w:b/>
+          <w:bCs/>
+        </w:rPr>
+        <w:t xml:space="preserve">261. Hvor mange elever velger yrkesfag på videregående?</w:t>
+      </w:r>
+    </w:p>
+    <w:p>
+      <w:pPr>
+        <w:keepNext/>
+        <w:spacing w:after="30"/>
+        <w:ind w:left="420"/>
+      </w:pPr>
+      <w:r>
+        <w:t xml:space="preserve">Omtrent halvparten</w:t>
+      </w:r>
+    </w:p>
+    <w:p>
+      <w:pPr>
+        <w:keepNext/>
+        <w:spacing w:after="30"/>
+        <w:ind w:left="420"/>
+      </w:pPr>
+      <w:r>
+        <w:t xml:space="preserve">Omtrent én av ti elever</w:t>
+      </w:r>
+    </w:p>
+    <w:p>
+      <w:pPr>
+        <w:keepNext w:val="false"/>
+        <w:spacing w:after="30"/>
+        <w:ind w:left="420"/>
+      </w:pPr>
+      <w:r>
+        <w:t xml:space="preserve">Omtrent ni av ti elever</w:t>
+      </w:r>
+    </w:p>
+    <w:p>
+      <w:pPr>
+        <w:keepNext/>
+        <w:spacing w:after="60" w:before="180"/>
+      </w:pPr>
+      <w:r>
+        <w:rPr>
+          <w:b/>
+          <w:bCs/>
+        </w:rPr>
+        <w:t xml:space="preserve">262. Hva gir studiespesialisering deg?</w:t>
+      </w:r>
+    </w:p>
+    <w:p>
+      <w:pPr>
+        <w:keepNext/>
+        <w:spacing w:after="30"/>
+        <w:ind w:left="420"/>
+      </w:pPr>
+      <w:r>
+        <w:t xml:space="preserve">Rett til å søke på universitet og høgskole</w:t>
+      </w:r>
+    </w:p>
+    <w:p>
+      <w:pPr>
+        <w:keepNext/>
+        <w:spacing w:after="30"/>
+        <w:ind w:left="420"/>
+      </w:pPr>
+      <w:r>
+        <w:t xml:space="preserve">Rett til å få fagbrev som lærling</w:t>
+      </w:r>
+    </w:p>
+    <w:p>
+      <w:pPr>
+        <w:keepNext w:val="false"/>
+        <w:spacing w:after="30"/>
+        <w:ind w:left="420"/>
+      </w:pPr>
+      <w:r>
+        <w:t xml:space="preserve">Rett til å starte i 1. klasse på SFO</w:t>
+      </w:r>
+    </w:p>
+    <w:p>
+      <w:pPr>
+        <w:keepNext/>
+        <w:spacing w:after="60" w:before="180"/>
+      </w:pPr>
+      <w:r>
+        <w:rPr>
+          <w:b/>
+          <w:bCs/>
+        </w:rPr>
+        <w:t xml:space="preserve">263. Hva kan du få etter yrkesfag og læretid?</w:t>
+      </w:r>
+    </w:p>
+    <w:p>
+      <w:pPr>
+        <w:keepNext/>
+        <w:spacing w:after="30"/>
+        <w:ind w:left="420"/>
+      </w:pPr>
+      <w:r>
+        <w:t xml:space="preserve">Fagbrev</w:t>
+      </w:r>
+    </w:p>
+    <w:p>
+      <w:pPr>
+        <w:keepNext/>
+        <w:spacing w:after="30"/>
+        <w:ind w:left="420"/>
+      </w:pPr>
+      <w:r>
+        <w:t xml:space="preserve">Bachelorgrad</w:t>
+      </w:r>
+    </w:p>
+    <w:p>
+      <w:pPr>
+        <w:keepNext w:val="false"/>
+        <w:spacing w:after="30"/>
+        <w:ind w:left="420"/>
+      </w:pPr>
+      <w:r>
+        <w:t xml:space="preserve">Studielån</w:t>
+      </w:r>
+    </w:p>
+    <w:p>
+      <w:pPr>
+        <w:keepNext/>
+        <w:spacing w:after="60" w:before="180"/>
+      </w:pPr>
+      <w:r>
+        <w:rPr>
+          <w:b/>
+          <w:bCs/>
+        </w:rPr>
+        <w:t xml:space="preserve">264. Hva er en lærling?</w:t>
+      </w:r>
+    </w:p>
+    <w:p>
+      <w:pPr>
+        <w:keepNext/>
+        <w:spacing w:after="30"/>
+        <w:ind w:left="420"/>
+      </w:pPr>
+      <w:r>
+        <w:t xml:space="preserve">En person som lærer et yrke på en arbeidsplass</w:t>
+      </w:r>
+    </w:p>
+    <w:p>
+      <w:pPr>
+        <w:keepNext/>
+        <w:spacing w:after="30"/>
+        <w:ind w:left="420"/>
+      </w:pPr>
+      <w:r>
+        <w:t xml:space="preserve">En elev som tar ekstra fag på ungdomsskolen i helgene</w:t>
+      </w:r>
+    </w:p>
+    <w:p>
+      <w:pPr>
+        <w:keepNext w:val="false"/>
+        <w:spacing w:after="30"/>
+        <w:ind w:left="420"/>
+      </w:pPr>
+      <w:r>
+        <w:t xml:space="preserve">En student som tar bachelor på universitetet</w:t>
+      </w:r>
+    </w:p>
+    <w:p>
+      <w:pPr>
+        <w:keepNext/>
+        <w:spacing w:after="60" w:before="180"/>
+      </w:pPr>
+      <w:r>
+        <w:rPr>
+          <w:b/>
+          <w:bCs/>
+        </w:rPr>
+        <w:t xml:space="preserve">265. Hva er en bachelorgrad?</w:t>
+      </w:r>
+    </w:p>
+    <w:p>
+      <w:pPr>
+        <w:keepNext/>
+        <w:spacing w:after="30"/>
+        <w:ind w:left="420"/>
+      </w:pPr>
+      <w:r>
+        <w:t xml:space="preserve">En utdanning på universitetet som tar omtrent tre år</w:t>
+      </w:r>
+    </w:p>
+    <w:p>
+      <w:pPr>
+        <w:keepNext/>
+        <w:spacing w:after="30"/>
+        <w:ind w:left="420"/>
+      </w:pPr>
+      <w:r>
+        <w:t xml:space="preserve">En utdanning på videregående som tar to år</w:t>
+      </w:r>
+    </w:p>
+    <w:p>
+      <w:pPr>
+        <w:keepNext w:val="false"/>
+        <w:spacing w:after="30"/>
+        <w:ind w:left="420"/>
+      </w:pPr>
+      <w:r>
+        <w:t xml:space="preserve">En utdanning for lærlinger som tar fire år</w:t>
+      </w:r>
+    </w:p>
+    <w:p>
+      <w:pPr>
+        <w:keepNext/>
+        <w:spacing w:after="60" w:before="180"/>
+      </w:pPr>
+      <w:r>
+        <w:rPr>
+          <w:b/>
+          <w:bCs/>
+        </w:rPr>
+        <w:t xml:space="preserve">266. Hva er et stipend?</w:t>
+      </w:r>
+    </w:p>
+    <w:p>
+      <w:pPr>
+        <w:keepNext/>
+        <w:spacing w:after="30"/>
+        <w:ind w:left="420"/>
+      </w:pPr>
+      <w:r>
+        <w:t xml:space="preserve">Penger til studenter som de ikke må betale tilbake</w:t>
+      </w:r>
+    </w:p>
+    <w:p>
+      <w:pPr>
+        <w:keepNext/>
+        <w:spacing w:after="30"/>
+        <w:ind w:left="420"/>
+      </w:pPr>
+      <w:r>
+        <w:t xml:space="preserve">Penger til studenter som de må betale tilbake senere</w:t>
+      </w:r>
+    </w:p>
+    <w:p>
+      <w:pPr>
+        <w:keepNext w:val="false"/>
+        <w:spacing w:after="30"/>
+        <w:ind w:left="420"/>
+      </w:pPr>
+      <w:r>
+        <w:t xml:space="preserve">Penger til lærlinger fra arbeidsgiveren</w:t>
+      </w:r>
+    </w:p>
+    <w:p>
+      <w:pPr>
+        <w:keepNext/>
+        <w:spacing w:after="60" w:before="180"/>
+      </w:pPr>
+      <w:r>
+        <w:rPr>
+          <w:b/>
+          <w:bCs/>
+        </w:rPr>
+        <w:t xml:space="preserve">267. Hvem gir studielån i Norge?</w:t>
+      </w:r>
+    </w:p>
+    <w:p>
+      <w:pPr>
+        <w:keepNext/>
+        <w:spacing w:after="30"/>
+        <w:ind w:left="420"/>
+      </w:pPr>
+      <w:r>
+        <w:t xml:space="preserve">Lånekassen</w:t>
+      </w:r>
+    </w:p>
+    <w:p>
+      <w:pPr>
+        <w:keepNext/>
+        <w:spacing w:after="30"/>
+        <w:ind w:left="420"/>
+      </w:pPr>
+      <w:r>
+        <w:t xml:space="preserve">Nav</w:t>
+      </w:r>
+    </w:p>
+    <w:p>
+      <w:pPr>
+        <w:keepNext w:val="false"/>
+        <w:spacing w:after="30"/>
+        <w:ind w:left="420"/>
+      </w:pPr>
+      <w:r>
+        <w:t xml:space="preserve">Skatteetaten</w:t>
+      </w:r>
+    </w:p>
+    <w:p>
+      <w:pPr>
+        <w:keepNext/>
+        <w:spacing w:after="60" w:before="180"/>
+      </w:pPr>
+      <w:r>
+        <w:rPr>
+          <w:b/>
+          <w:bCs/>
+        </w:rPr>
+        <w:t xml:space="preserve">268. Hvor mye studiegjeld har mange studenter etter studiene?</w:t>
+      </w:r>
+    </w:p>
+    <w:p>
+      <w:pPr>
+        <w:keepNext/>
+        <w:spacing w:after="30"/>
+        <w:ind w:left="420"/>
+      </w:pPr>
+      <w:r>
+        <w:t xml:space="preserve">Over 300 000 kroner</w:t>
+      </w:r>
+    </w:p>
+    <w:p>
+      <w:pPr>
+        <w:keepNext/>
+        <w:spacing w:after="30"/>
+        <w:ind w:left="420"/>
+      </w:pPr>
+      <w:r>
+        <w:t xml:space="preserve">Under 30 000 kroner</w:t>
+      </w:r>
+    </w:p>
+    <w:p>
+      <w:pPr>
+        <w:keepNext w:val="false"/>
+        <w:spacing w:after="30"/>
+        <w:ind w:left="420"/>
+      </w:pPr>
+      <w:r>
+        <w:t xml:space="preserve">Omtrent 3 000 kroner</w:t>
+      </w:r>
+    </w:p>
+    <w:p>
+      <w:pPr>
+        <w:keepNext/>
+        <w:spacing w:after="60" w:before="180"/>
+      </w:pPr>
+      <w:r>
+        <w:rPr>
+          <w:b/>
+          <w:bCs/>
+        </w:rPr>
+        <w:t xml:space="preserve">269. Hva betyr det å være myndig?</w:t>
+      </w:r>
+    </w:p>
+    <w:p>
+      <w:pPr>
+        <w:keepNext/>
+        <w:spacing w:after="30"/>
+        <w:ind w:left="420"/>
+      </w:pPr>
+      <w:r>
+        <w:t xml:space="preserve">Du bestemmer selv over livet og pengene dine</w:t>
+      </w:r>
+    </w:p>
+    <w:p>
+      <w:pPr>
+        <w:keepNext/>
+        <w:spacing w:after="30"/>
+        <w:ind w:left="420"/>
+      </w:pPr>
+      <w:r>
+        <w:t xml:space="preserve">Du må begynne å jobbe full tid</w:t>
+      </w:r>
+    </w:p>
+    <w:p>
+      <w:pPr>
+        <w:keepNext w:val="false"/>
+        <w:spacing w:after="30"/>
+        <w:ind w:left="420"/>
+      </w:pPr>
+      <w:r>
+        <w:t xml:space="preserve">Du må bo hjemme hos foreldrene</w:t>
+      </w:r>
+    </w:p>
+    <w:p>
+      <w:pPr>
+        <w:keepNext/>
+        <w:spacing w:after="60" w:before="180"/>
+      </w:pPr>
+      <w:r>
+        <w:rPr>
+          <w:b/>
+          <w:bCs/>
+        </w:rPr>
+        <w:t xml:space="preserve">270. Når blir en person myndig i Norge?</w:t>
+      </w:r>
+    </w:p>
+    <w:p>
+      <w:pPr>
+        <w:keepNext/>
+        <w:spacing w:after="30"/>
+        <w:ind w:left="420"/>
+      </w:pPr>
+      <w:r>
+        <w:t xml:space="preserve">Når personen er 18 år</w:t>
+      </w:r>
+    </w:p>
+    <w:p>
+      <w:pPr>
+        <w:keepNext/>
+        <w:spacing w:after="30"/>
+        <w:ind w:left="420"/>
+      </w:pPr>
+      <w:r>
+        <w:t xml:space="preserve">Når personen er 16 år</w:t>
+      </w:r>
+    </w:p>
+    <w:p>
+      <w:pPr>
+        <w:keepNext w:val="false"/>
+        <w:spacing w:after="30"/>
+        <w:ind w:left="420"/>
+      </w:pPr>
+      <w:r>
+        <w:t xml:space="preserve">Når personen er 21 år</w:t>
+      </w:r>
+    </w:p>
+    <w:p>
+      <w:pPr>
+        <w:keepNext/>
+        <w:spacing w:after="60" w:before="180"/>
+      </w:pPr>
+      <w:r>
+        <w:rPr>
+          <w:b/>
+          <w:bCs/>
+        </w:rPr>
+        <w:t xml:space="preserve">271. Hvem har ansvar for barn under 18 år?</w:t>
+      </w:r>
+    </w:p>
+    <w:p>
+      <w:pPr>
+        <w:keepNext/>
+        <w:spacing w:after="30"/>
+        <w:ind w:left="420"/>
+      </w:pPr>
+      <w:r>
+        <w:t xml:space="preserve">Foreldrene</w:t>
+      </w:r>
+    </w:p>
+    <w:p>
+      <w:pPr>
+        <w:keepNext/>
+        <w:spacing w:after="30"/>
+        <w:ind w:left="420"/>
+      </w:pPr>
+      <w:r>
+        <w:t xml:space="preserve">Barna selv</w:t>
+      </w:r>
+    </w:p>
+    <w:p>
+      <w:pPr>
+        <w:keepNext w:val="false"/>
+        <w:spacing w:after="30"/>
+        <w:ind w:left="420"/>
+      </w:pPr>
+      <w:r>
+        <w:t xml:space="preserve">Skolen</w:t>
+      </w:r>
+    </w:p>
+    <w:p>
+      <w:pPr>
+        <w:keepNext/>
+        <w:spacing w:after="60" w:before="180"/>
+      </w:pPr>
+      <w:r>
+        <w:rPr>
+          <w:b/>
+          <w:bCs/>
+        </w:rPr>
+        <w:t xml:space="preserve">272. Hvor gamle er mange nordmenn når de gifter seg?</w:t>
+      </w:r>
+    </w:p>
+    <w:p>
+      <w:pPr>
+        <w:keepNext/>
+        <w:spacing w:after="30"/>
+        <w:ind w:left="420"/>
+      </w:pPr>
+      <w:r>
+        <w:t xml:space="preserve">Mellom 30 og 40 år gamle</w:t>
+      </w:r>
+    </w:p>
+    <w:p>
+      <w:pPr>
+        <w:keepNext/>
+        <w:spacing w:after="30"/>
+        <w:ind w:left="420"/>
+      </w:pPr>
+      <w:r>
+        <w:t xml:space="preserve">Mellom 18 og 20 år gamle</w:t>
+      </w:r>
+    </w:p>
+    <w:p>
+      <w:pPr>
+        <w:keepNext w:val="false"/>
+        <w:spacing w:after="30"/>
+        <w:ind w:left="420"/>
+      </w:pPr>
+      <w:r>
+        <w:t xml:space="preserve">Mellom 50 og 60 år gamle</w:t>
+      </w:r>
+    </w:p>
+    <w:p>
+      <w:pPr>
+        <w:keepNext/>
+        <w:spacing w:after="60" w:before="180"/>
+      </w:pPr>
+      <w:r>
+        <w:rPr>
+          <w:b/>
+          <w:bCs/>
+        </w:rPr>
+        <w:t xml:space="preserve">273. Hva betyr det å være samboer?</w:t>
+      </w:r>
+    </w:p>
+    <w:p>
+      <w:pPr>
+        <w:keepNext/>
+        <w:spacing w:after="30"/>
+        <w:ind w:left="420"/>
+      </w:pPr>
+      <w:r>
+        <w:t xml:space="preserve">Å bo sammen som par uten å være gift</w:t>
+      </w:r>
+    </w:p>
+    <w:p>
+      <w:pPr>
+        <w:keepNext/>
+        <w:spacing w:after="30"/>
+        <w:ind w:left="420"/>
+      </w:pPr>
+      <w:r>
+        <w:t xml:space="preserve">Å bo sammen med foreldrene som voksen</w:t>
+      </w:r>
+    </w:p>
+    <w:p>
+      <w:pPr>
+        <w:keepNext w:val="false"/>
+        <w:spacing w:after="30"/>
+        <w:ind w:left="420"/>
+      </w:pPr>
+      <w:r>
+        <w:t xml:space="preserve">Å bo sammen med en venn for å spare penger</w:t>
+      </w:r>
+    </w:p>
+    <w:p>
+      <w:pPr>
+        <w:keepNext/>
+        <w:spacing w:after="60" w:before="180"/>
+      </w:pPr>
+      <w:r>
+        <w:rPr>
+          <w:b/>
+          <w:bCs/>
+        </w:rPr>
+        <w:t xml:space="preserve">274. Hva er skilsmisse?</w:t>
+      </w:r>
+    </w:p>
+    <w:p>
+      <w:pPr>
+        <w:keepNext/>
+        <w:spacing w:after="30"/>
+        <w:ind w:left="420"/>
+      </w:pPr>
+      <w:r>
+        <w:t xml:space="preserve">Når et gift par avslutter ekteskapet</w:t>
+      </w:r>
+    </w:p>
+    <w:p>
+      <w:pPr>
+        <w:keepNext/>
+        <w:spacing w:after="30"/>
+        <w:ind w:left="420"/>
+      </w:pPr>
+      <w:r>
+        <w:t xml:space="preserve">Når et par flytter sammen uten å gifte seg</w:t>
+      </w:r>
+    </w:p>
+    <w:p>
+      <w:pPr>
+        <w:keepNext w:val="false"/>
+        <w:spacing w:after="30"/>
+        <w:ind w:left="420"/>
+      </w:pPr>
+      <w:r>
+        <w:t xml:space="preserve">Når et par får et barn og blir foreldre</w:t>
+      </w:r>
+    </w:p>
+    <w:p>
+      <w:pPr>
+        <w:keepNext/>
+        <w:spacing w:after="60" w:before="180"/>
+      </w:pPr>
+      <w:r>
+        <w:rPr>
+          <w:b/>
+          <w:bCs/>
+        </w:rPr>
+        <w:t xml:space="preserve">275. Hva betyr likestilling?</w:t>
+      </w:r>
+    </w:p>
+    <w:p>
+      <w:pPr>
+        <w:keepNext/>
+        <w:spacing w:after="30"/>
+        <w:ind w:left="420"/>
+      </w:pPr>
+      <w:r>
+        <w:t xml:space="preserve">Kvinner og menn har samme rettigheter og muligheter</w:t>
+      </w:r>
+    </w:p>
+    <w:p>
+      <w:pPr>
+        <w:keepNext/>
+        <w:spacing w:after="30"/>
+        <w:ind w:left="420"/>
+      </w:pPr>
+      <w:r>
+        <w:t xml:space="preserve">Kvinner og menn må gjøre det samme arbeidet</w:t>
+      </w:r>
+    </w:p>
+    <w:p>
+      <w:pPr>
+        <w:keepNext w:val="false"/>
+        <w:spacing w:after="30"/>
+        <w:ind w:left="420"/>
+      </w:pPr>
+      <w:r>
+        <w:t xml:space="preserve">Kvinner og menn må være like gamle</w:t>
+      </w:r>
+    </w:p>
+    <w:p>
+      <w:pPr>
+        <w:keepNext/>
+        <w:spacing w:after="60" w:before="180"/>
+      </w:pPr>
+      <w:r>
+        <w:rPr>
+          <w:b/>
+          <w:bCs/>
+        </w:rPr>
+        <w:t xml:space="preserve">276. Hva er et boliglån?</w:t>
+      </w:r>
+    </w:p>
+    <w:p>
+      <w:pPr>
+        <w:keepNext/>
+        <w:spacing w:after="30"/>
+        <w:ind w:left="420"/>
+      </w:pPr>
+      <w:r>
+        <w:t xml:space="preserve">Penger fra banken som du bruker til å kjøpe bolig</w:t>
+      </w:r>
+    </w:p>
+    <w:p>
+      <w:pPr>
+        <w:keepNext/>
+        <w:spacing w:after="30"/>
+        <w:ind w:left="420"/>
+      </w:pPr>
+      <w:r>
+        <w:t xml:space="preserve">Penger fra staten som du får når du flytter</w:t>
+      </w:r>
+    </w:p>
+    <w:p>
+      <w:pPr>
+        <w:keepNext w:val="false"/>
+        <w:spacing w:after="30"/>
+        <w:ind w:left="420"/>
+      </w:pPr>
+      <w:r>
+        <w:t xml:space="preserve">Penger som du betaler til utleier hver måned</w:t>
+      </w:r>
+    </w:p>
+    <w:p>
+      <w:pPr>
+        <w:keepNext/>
+        <w:spacing w:after="60" w:before="180"/>
+      </w:pPr>
+      <w:r>
+        <w:rPr>
+          <w:b/>
+          <w:bCs/>
+        </w:rPr>
+        <w:t xml:space="preserve">277. Hvor mye gjeld tar mange med seg når de kjøper bolig?</w:t>
+      </w:r>
+    </w:p>
+    <w:p>
+      <w:pPr>
+        <w:keepNext/>
+        <w:spacing w:after="30"/>
+        <w:ind w:left="420"/>
+      </w:pPr>
+      <w:r>
+        <w:t xml:space="preserve">Over to millioner kroner</w:t>
+      </w:r>
+    </w:p>
+    <w:p>
+      <w:pPr>
+        <w:keepNext/>
+        <w:spacing w:after="30"/>
+        <w:ind w:left="420"/>
+      </w:pPr>
+      <w:r>
+        <w:t xml:space="preserve">Omtrent 200 000 kroner til hver bolig</w:t>
+      </w:r>
+    </w:p>
+    <w:p>
+      <w:pPr>
+        <w:keepNext w:val="false"/>
+        <w:spacing w:after="30"/>
+        <w:ind w:left="420"/>
+      </w:pPr>
+      <w:r>
+        <w:t xml:space="preserve">Omtrent 20 000 kroner til hver bolig</w:t>
+      </w:r>
+    </w:p>
+    <w:p>
+      <w:pPr>
+        <w:keepNext/>
+        <w:spacing w:after="60" w:before="180"/>
+      </w:pPr>
+      <w:r>
+        <w:rPr>
+          <w:b/>
+          <w:bCs/>
+        </w:rPr>
+        <w:t xml:space="preserve">278. Hvilken etat betaler ut pensjon fra folketrygden?</w:t>
+      </w:r>
+    </w:p>
+    <w:p>
+      <w:pPr>
+        <w:keepNext/>
+        <w:spacing w:after="30"/>
+        <w:ind w:left="420"/>
+      </w:pPr>
+      <w:r>
+        <w:t xml:space="preserve">Nav</w:t>
+      </w:r>
+    </w:p>
+    <w:p>
+      <w:pPr>
+        <w:keepNext/>
+        <w:spacing w:after="30"/>
+        <w:ind w:left="420"/>
+      </w:pPr>
+      <w:r>
+        <w:t xml:space="preserve">Lånekassen</w:t>
+      </w:r>
+    </w:p>
+    <w:p>
+      <w:pPr>
+        <w:keepNext w:val="false"/>
+        <w:spacing w:after="30"/>
+        <w:ind w:left="420"/>
+      </w:pPr>
+      <w:r>
+        <w:t xml:space="preserve">Skatteetaten</w:t>
+      </w:r>
+    </w:p>
+    <w:p>
+      <w:pPr>
+        <w:keepNext/>
+        <w:spacing w:after="60" w:before="180"/>
+      </w:pPr>
+      <w:r>
+        <w:rPr>
+          <w:b/>
+          <w:bCs/>
+        </w:rPr>
+        <w:t xml:space="preserve">279. Hvor gamle er mange nordmenn når de slutter å jobbe?</w:t>
+      </w:r>
+    </w:p>
+    <w:p>
+      <w:pPr>
+        <w:keepNext/>
+        <w:spacing w:after="30"/>
+        <w:ind w:left="420"/>
+      </w:pPr>
+      <w:r>
+        <w:t xml:space="preserve">Omtrent 67 år gamle</w:t>
+      </w:r>
+    </w:p>
+    <w:p>
+      <w:pPr>
+        <w:keepNext/>
+        <w:spacing w:after="30"/>
+        <w:ind w:left="420"/>
+      </w:pPr>
+      <w:r>
+        <w:t xml:space="preserve">Omtrent 50 år gamle</w:t>
+      </w:r>
+    </w:p>
+    <w:p>
+      <w:pPr>
+        <w:keepNext w:val="false"/>
+        <w:spacing w:after="30"/>
+        <w:ind w:left="420"/>
+      </w:pPr>
+      <w:r>
+        <w:t xml:space="preserve">Omtrent 80 år gamle</w:t>
+      </w:r>
+    </w:p>
+    <w:p>
+      <w:pPr>
+        <w:keepNext/>
+        <w:spacing w:after="60" w:before="180"/>
+      </w:pPr>
+      <w:r>
+        <w:rPr>
+          <w:b/>
+          <w:bCs/>
+        </w:rPr>
+        <w:t xml:space="preserve">280. Hva er kremasjon?</w:t>
+      </w:r>
+    </w:p>
+    <w:p>
+      <w:pPr>
+        <w:keepNext/>
+        <w:spacing w:after="30"/>
+        <w:ind w:left="420"/>
+      </w:pPr>
+      <w:r>
+        <w:t xml:space="preserve">Når en død person blir brent</w:t>
+      </w:r>
+    </w:p>
+    <w:p>
+      <w:pPr>
+        <w:keepNext/>
+        <w:spacing w:after="30"/>
+        <w:ind w:left="420"/>
+      </w:pPr>
+      <w:r>
+        <w:t xml:space="preserve">Når en død person blir lagt i jorden</w:t>
+      </w:r>
+    </w:p>
+    <w:p>
+      <w:pPr>
+        <w:keepNext w:val="false"/>
+        <w:spacing w:after="30"/>
+        <w:ind w:left="420"/>
+      </w:pPr>
+      <w:r>
+        <w:t xml:space="preserve">Når en død person blir sendt til hjemlandet</w:t>
+      </w:r>
+    </w:p>
+    <w:p>
+      <w:pPr>
+        <w:keepNext/>
+        <w:spacing w:after="60" w:before="180"/>
+      </w:pPr>
+      <w:r>
+        <w:rPr>
+          <w:b/>
+          <w:bCs/>
+        </w:rPr>
+        <w:t xml:space="preserve">281. Hva er arv?</w:t>
+      </w:r>
+    </w:p>
+    <w:p>
+      <w:pPr>
+        <w:keepNext/>
+        <w:spacing w:after="30"/>
+        <w:ind w:left="420"/>
+      </w:pPr>
+      <w:r>
+        <w:t xml:space="preserve">Penger og ting du får når et familiemedlem dør</w:t>
+      </w:r>
+    </w:p>
+    <w:p>
+      <w:pPr>
+        <w:keepNext/>
+        <w:spacing w:after="30"/>
+        <w:ind w:left="420"/>
+      </w:pPr>
+      <w:r>
+        <w:t xml:space="preserve">Penger du får når du gifter deg med noen</w:t>
+      </w:r>
+    </w:p>
+    <w:p>
+      <w:pPr>
+        <w:keepNext w:val="false"/>
+        <w:spacing w:after="30"/>
+        <w:ind w:left="420"/>
+      </w:pPr>
+      <w:r>
+        <w:t xml:space="preserve">Penger du får fra staten når du fyller 18 år og blir myndig</w:t>
+      </w:r>
+    </w:p>
+    <w:p>
+      <w:pPr>
+        <w:keepNext/>
+        <w:spacing w:after="60" w:before="180"/>
+      </w:pPr>
+      <w:r>
+        <w:rPr>
+          <w:b/>
+          <w:bCs/>
+        </w:rPr>
+        <w:t xml:space="preserve">282. Hva er et testament?</w:t>
+      </w:r>
+    </w:p>
+    <w:p>
+      <w:pPr>
+        <w:keepNext/>
+        <w:spacing w:after="30"/>
+        <w:ind w:left="420"/>
+      </w:pPr>
+      <w:r>
+        <w:t xml:space="preserve">Et dokument om hvem som skal arve etter en person</w:t>
+      </w:r>
+    </w:p>
+    <w:p>
+      <w:pPr>
+        <w:keepNext/>
+        <w:spacing w:after="30"/>
+        <w:ind w:left="420"/>
+      </w:pPr>
+      <w:r>
+        <w:t xml:space="preserve">Et dokument om hvem som eier en bolig</w:t>
+      </w:r>
+    </w:p>
+    <w:p>
+      <w:pPr>
+        <w:keepNext w:val="false"/>
+        <w:spacing w:after="30"/>
+        <w:ind w:left="420"/>
+      </w:pPr>
+      <w:r>
+        <w:t xml:space="preserve">Et dokument om hvem som er gift med hvem</w:t>
+      </w:r>
+    </w:p>
+    <w:p>
+      <w:pPr>
+        <w:keepNext/>
+        <w:spacing w:after="60" w:before="180"/>
+      </w:pPr>
+      <w:r>
+        <w:rPr>
+          <w:b/>
+          <w:bCs/>
+        </w:rPr>
+        <w:t xml:space="preserve">283. Hva er en innvandrer?</w:t>
+      </w:r>
+    </w:p>
+    <w:p>
+      <w:pPr>
+        <w:keepNext/>
+        <w:spacing w:after="30"/>
+        <w:ind w:left="420"/>
+      </w:pPr>
+      <w:r>
+        <w:t xml:space="preserve">En person som har flyttet til Norge fra et annet land</w:t>
+      </w:r>
+    </w:p>
+    <w:p>
+      <w:pPr>
+        <w:keepNext/>
+        <w:spacing w:after="30"/>
+        <w:ind w:left="420"/>
+      </w:pPr>
+      <w:r>
+        <w:t xml:space="preserve">En person som er på ferie hos familie i Norge i to uker</w:t>
+      </w:r>
+    </w:p>
+    <w:p>
+      <w:pPr>
+        <w:keepNext w:val="false"/>
+        <w:spacing w:after="30"/>
+        <w:ind w:left="420"/>
+      </w:pPr>
+      <w:r>
+        <w:t xml:space="preserve">En person som er født og oppvokst i Norge</w:t>
+      </w:r>
+    </w:p>
+    <w:p>
+      <w:pPr>
+        <w:keepNext/>
+        <w:spacing w:after="60" w:before="180"/>
+      </w:pPr>
+      <w:r>
+        <w:rPr>
+          <w:b/>
+          <w:bCs/>
+        </w:rPr>
+        <w:t xml:space="preserve">284. Hva betyr ordet «oppholdstillatelse»?</w:t>
+      </w:r>
+    </w:p>
+    <w:p>
+      <w:pPr>
+        <w:keepNext/>
+        <w:spacing w:after="30"/>
+        <w:ind w:left="420"/>
+      </w:pPr>
+      <w:r>
+        <w:t xml:space="preserve">En tillatelse til å bo i Norge</w:t>
+      </w:r>
+    </w:p>
+    <w:p>
+      <w:pPr>
+        <w:keepNext/>
+        <w:spacing w:after="30"/>
+        <w:ind w:left="420"/>
+      </w:pPr>
+      <w:r>
+        <w:t xml:space="preserve">En tillatelse til å kjøre bil i Norge</w:t>
+      </w:r>
+    </w:p>
+    <w:p>
+      <w:pPr>
+        <w:keepNext w:val="false"/>
+        <w:spacing w:after="30"/>
+        <w:ind w:left="420"/>
+      </w:pPr>
+      <w:r>
+        <w:t xml:space="preserve">En tillatelse til å jobbe på sykehus</w:t>
+      </w:r>
+    </w:p>
+    <w:p>
+      <w:pPr>
+        <w:keepNext/>
+        <w:spacing w:after="60" w:before="180"/>
+      </w:pPr>
+      <w:r>
+        <w:rPr>
+          <w:b/>
+          <w:bCs/>
+        </w:rPr>
+        <w:t xml:space="preserve">285. Hvem behandler søknader om oppholdstillatelse i Norge?</w:t>
+      </w:r>
+    </w:p>
+    <w:p>
+      <w:pPr>
+        <w:keepNext/>
+        <w:spacing w:after="30"/>
+        <w:ind w:left="420"/>
+      </w:pPr>
+      <w:r>
+        <w:t xml:space="preserve">Utlendingsdirektoratet (UDI)</w:t>
+      </w:r>
+    </w:p>
+    <w:p>
+      <w:pPr>
+        <w:keepNext/>
+        <w:spacing w:after="30"/>
+        <w:ind w:left="420"/>
+      </w:pPr>
+      <w:r>
+        <w:t xml:space="preserve">Arbeids- og velferdsetaten (Nav)</w:t>
+      </w:r>
+    </w:p>
+    <w:p>
+      <w:pPr>
+        <w:keepNext w:val="false"/>
+        <w:spacing w:after="30"/>
+        <w:ind w:left="420"/>
+      </w:pPr>
+      <w:r>
+        <w:t xml:space="preserve">Integrerings- og mangfoldsdirektoratet (IMDi)</w:t>
+      </w:r>
+    </w:p>
+    <w:p>
+      <w:pPr>
+        <w:keepNext/>
+        <w:spacing w:after="60" w:before="180"/>
+      </w:pPr>
+      <w:r>
+        <w:rPr>
+          <w:b/>
+          <w:bCs/>
+        </w:rPr>
+        <w:t xml:space="preserve">286. Hva er nettsiden til UDI?</w:t>
+      </w:r>
+    </w:p>
+    <w:p>
+      <w:pPr>
+        <w:keepNext/>
+        <w:spacing w:after="30"/>
+        <w:ind w:left="420"/>
+      </w:pPr>
+      <w:r>
+        <w:t xml:space="preserve">udi.no</w:t>
+      </w:r>
+    </w:p>
+    <w:p>
+      <w:pPr>
+        <w:keepNext/>
+        <w:spacing w:after="30"/>
+        <w:ind w:left="420"/>
+      </w:pPr>
+      <w:r>
+        <w:t xml:space="preserve">nav.no</w:t>
+      </w:r>
+    </w:p>
+    <w:p>
+      <w:pPr>
+        <w:keepNext w:val="false"/>
+        <w:spacing w:after="30"/>
+        <w:ind w:left="420"/>
+      </w:pPr>
+      <w:r>
+        <w:t xml:space="preserve">skatteetaten.no</w:t>
+      </w:r>
+    </w:p>
+    <w:p>
+      <w:pPr>
+        <w:keepNext/>
+        <w:spacing w:after="60" w:before="180"/>
+      </w:pPr>
+      <w:r>
+        <w:rPr>
+          <w:b/>
+          <w:bCs/>
+        </w:rPr>
+        <w:t xml:space="preserve">287. Hvor registrerer borgere fra EU og EØS seg når de flytter til Norge?</w:t>
+      </w:r>
+    </w:p>
+    <w:p>
+      <w:pPr>
+        <w:keepNext/>
+        <w:spacing w:after="30"/>
+        <w:ind w:left="420"/>
+      </w:pPr>
+      <w:r>
+        <w:t xml:space="preserve">Hos politiet</w:t>
+      </w:r>
+    </w:p>
+    <w:p>
+      <w:pPr>
+        <w:keepNext/>
+        <w:spacing w:after="30"/>
+        <w:ind w:left="420"/>
+      </w:pPr>
+      <w:r>
+        <w:t xml:space="preserve">Hos Nav</w:t>
+      </w:r>
+    </w:p>
+    <w:p>
+      <w:pPr>
+        <w:keepNext w:val="false"/>
+        <w:spacing w:after="30"/>
+        <w:ind w:left="420"/>
+      </w:pPr>
+      <w:r>
+        <w:t xml:space="preserve">Hos kommunen</w:t>
+      </w:r>
+    </w:p>
+    <w:p>
+      <w:pPr>
+        <w:keepNext/>
+        <w:spacing w:after="60" w:before="180"/>
+      </w:pPr>
+      <w:r>
+        <w:rPr>
+          <w:b/>
+          <w:bCs/>
+        </w:rPr>
+        <w:t xml:space="preserve">288. Hva er en midlertidig oppholdstillatelse?</w:t>
+      </w:r>
+    </w:p>
+    <w:p>
+      <w:pPr>
+        <w:keepNext/>
+        <w:spacing w:after="30"/>
+        <w:ind w:left="420"/>
+      </w:pPr>
+      <w:r>
+        <w:t xml:space="preserve">En tillatelse som varer en periode, og du må søke på nytt</w:t>
+      </w:r>
+    </w:p>
+    <w:p>
+      <w:pPr>
+        <w:keepNext/>
+        <w:spacing w:after="30"/>
+        <w:ind w:left="420"/>
+      </w:pPr>
+      <w:r>
+        <w:t xml:space="preserve">En tillatelse som du får for resten av livet</w:t>
+      </w:r>
+    </w:p>
+    <w:p>
+      <w:pPr>
+        <w:keepNext w:val="false"/>
+        <w:spacing w:after="30"/>
+        <w:ind w:left="420"/>
+      </w:pPr>
+      <w:r>
+        <w:t xml:space="preserve">En tillatelse som du får som turist</w:t>
+      </w:r>
+    </w:p>
+    <w:p>
+      <w:pPr>
+        <w:keepNext/>
+        <w:spacing w:after="60" w:before="180"/>
+      </w:pPr>
+      <w:r>
+        <w:rPr>
+          <w:b/>
+          <w:bCs/>
+        </w:rPr>
+        <w:t xml:space="preserve">289. Hva betyr permanent oppholdstillatelse?</w:t>
+      </w:r>
+    </w:p>
+    <w:p>
+      <w:pPr>
+        <w:keepNext/>
+        <w:spacing w:after="30"/>
+        <w:ind w:left="420"/>
+      </w:pPr>
+      <w:r>
+        <w:t xml:space="preserve">Du kan bo i Norge uten å søke om ny tillatelse</w:t>
+      </w:r>
+    </w:p>
+    <w:p>
+      <w:pPr>
+        <w:keepNext/>
+        <w:spacing w:after="30"/>
+        <w:ind w:left="420"/>
+      </w:pPr>
+      <w:r>
+        <w:t xml:space="preserve">Du har fått norsk pass og norsk statsborgerskap</w:t>
+      </w:r>
+    </w:p>
+    <w:p>
+      <w:pPr>
+        <w:keepNext w:val="false"/>
+        <w:spacing w:after="30"/>
+        <w:ind w:left="420"/>
+      </w:pPr>
+      <w:r>
+        <w:t xml:space="preserve">Du må søke om ny tillatelse hvert år</w:t>
+      </w:r>
+    </w:p>
+    <w:p>
+      <w:pPr>
+        <w:keepNext/>
+        <w:spacing w:after="60" w:before="180"/>
+      </w:pPr>
+      <w:r>
+        <w:rPr>
+          <w:b/>
+          <w:bCs/>
+        </w:rPr>
+        <w:t xml:space="preserve">290. Hva er et statsborgerskap?</w:t>
+      </w:r>
+    </w:p>
+    <w:p>
+      <w:pPr>
+        <w:keepNext/>
+        <w:spacing w:after="30"/>
+        <w:ind w:left="420"/>
+      </w:pPr>
+      <w:r>
+        <w:t xml:space="preserve">Du tilhører et land og har rettigheter og plikter der</w:t>
+      </w:r>
+    </w:p>
+    <w:p>
+      <w:pPr>
+        <w:keepNext/>
+        <w:spacing w:after="30"/>
+        <w:ind w:left="420"/>
+      </w:pPr>
+      <w:r>
+        <w:t xml:space="preserve">Du har lov til å besøke et land som turist i tre måneder</w:t>
+      </w:r>
+    </w:p>
+    <w:p>
+      <w:pPr>
+        <w:keepNext w:val="false"/>
+        <w:spacing w:after="30"/>
+        <w:ind w:left="420"/>
+      </w:pPr>
+      <w:r>
+        <w:t xml:space="preserve">Du har lov til å jobbe i et land i ett år</w:t>
+      </w:r>
+    </w:p>
+    <w:p>
+      <w:pPr>
+        <w:keepNext/>
+        <w:spacing w:after="60" w:before="180"/>
+      </w:pPr>
+      <w:r>
+        <w:rPr>
+          <w:b/>
+          <w:bCs/>
+        </w:rPr>
+        <w:t xml:space="preserve">291. Hva er en flyktning?</w:t>
+      </w:r>
+    </w:p>
+    <w:p>
+      <w:pPr>
+        <w:keepNext/>
+        <w:spacing w:after="30"/>
+        <w:ind w:left="420"/>
+      </w:pPr>
+      <w:r>
+        <w:t xml:space="preserve">En person som må forlate landet sitt fordi livet er i fare</w:t>
+      </w:r>
+    </w:p>
+    <w:p>
+      <w:pPr>
+        <w:keepNext/>
+        <w:spacing w:after="30"/>
+        <w:ind w:left="420"/>
+      </w:pPr>
+      <w:r>
+        <w:t xml:space="preserve">En person som flytter til et nytt land for å jobbe</w:t>
+      </w:r>
+    </w:p>
+    <w:p>
+      <w:pPr>
+        <w:keepNext w:val="false"/>
+        <w:spacing w:after="30"/>
+        <w:ind w:left="420"/>
+      </w:pPr>
+      <w:r>
+        <w:t xml:space="preserve">En person som flytter til et nytt land for å studere</w:t>
+      </w:r>
+    </w:p>
+    <w:p>
+      <w:pPr>
+        <w:keepNext/>
+        <w:spacing w:after="60" w:before="180"/>
+      </w:pPr>
+      <w:r>
+        <w:rPr>
+          <w:b/>
+          <w:bCs/>
+        </w:rPr>
+        <w:t xml:space="preserve">292. Hva er en arbeidsinnvandrer?</w:t>
+      </w:r>
+    </w:p>
+    <w:p>
+      <w:pPr>
+        <w:keepNext/>
+        <w:spacing w:after="30"/>
+        <w:ind w:left="420"/>
+      </w:pPr>
+      <w:r>
+        <w:t xml:space="preserve">En person som flytter til Norge for å jobbe</w:t>
+      </w:r>
+    </w:p>
+    <w:p>
+      <w:pPr>
+        <w:keepNext/>
+        <w:spacing w:after="30"/>
+        <w:ind w:left="420"/>
+      </w:pPr>
+      <w:r>
+        <w:t xml:space="preserve">En person som får hjelp av FN til å flytte</w:t>
+      </w:r>
+    </w:p>
+    <w:p>
+      <w:pPr>
+        <w:keepNext w:val="false"/>
+        <w:spacing w:after="30"/>
+        <w:ind w:left="420"/>
+      </w:pPr>
+      <w:r>
+        <w:t xml:space="preserve">En person som flytter for å være sammen med familie</w:t>
+      </w:r>
+    </w:p>
+    <w:p>
+      <w:pPr>
+        <w:keepNext/>
+        <w:spacing w:after="60" w:before="180"/>
+      </w:pPr>
+      <w:r>
+        <w:rPr>
+          <w:b/>
+          <w:bCs/>
+        </w:rPr>
+        <w:t xml:space="preserve">293. Hva er en asylsøker?</w:t>
+      </w:r>
+    </w:p>
+    <w:p>
+      <w:pPr>
+        <w:keepNext/>
+        <w:spacing w:after="30"/>
+        <w:ind w:left="420"/>
+      </w:pPr>
+      <w:r>
+        <w:t xml:space="preserve">En person som har søkt om beskyttelse og venter på svar</w:t>
+      </w:r>
+    </w:p>
+    <w:p>
+      <w:pPr>
+        <w:keepNext/>
+        <w:spacing w:after="30"/>
+        <w:ind w:left="420"/>
+      </w:pPr>
+      <w:r>
+        <w:t xml:space="preserve">En person som har fått norsk statsborgerskap for noen år siden</w:t>
+      </w:r>
+    </w:p>
+    <w:p>
+      <w:pPr>
+        <w:keepNext w:val="false"/>
+        <w:spacing w:after="30"/>
+        <w:ind w:left="420"/>
+      </w:pPr>
+      <w:r>
+        <w:t xml:space="preserve">En person som jobber for UDI og behandler saker</w:t>
+      </w:r>
+    </w:p>
+    <w:p>
+      <w:pPr>
+        <w:keepNext/>
+        <w:spacing w:after="60" w:before="180"/>
+      </w:pPr>
+      <w:r>
+        <w:rPr>
+          <w:b/>
+          <w:bCs/>
+        </w:rPr>
+        <w:t xml:space="preserve">294. Hva er asyl?</w:t>
+      </w:r>
+    </w:p>
+    <w:p>
+      <w:pPr>
+        <w:keepNext/>
+        <w:spacing w:after="30"/>
+        <w:ind w:left="420"/>
+      </w:pPr>
+      <w:r>
+        <w:t xml:space="preserve">Beskyttelse for en person som er forfulgt i hjemlandet</w:t>
+      </w:r>
+    </w:p>
+    <w:p>
+      <w:pPr>
+        <w:keepNext/>
+        <w:spacing w:after="30"/>
+        <w:ind w:left="420"/>
+      </w:pPr>
+      <w:r>
+        <w:t xml:space="preserve">Tillatelse til å jobbe i Norge i ett år</w:t>
+      </w:r>
+    </w:p>
+    <w:p>
+      <w:pPr>
+        <w:keepNext w:val="false"/>
+        <w:spacing w:after="30"/>
+        <w:ind w:left="420"/>
+      </w:pPr>
+      <w:r>
+        <w:t xml:space="preserve">Tillatelse til å besøke familie i Norge</w:t>
+      </w:r>
+    </w:p>
+    <w:p>
+      <w:pPr>
+        <w:keepNext/>
+        <w:spacing w:after="60" w:before="180"/>
+      </w:pPr>
+      <w:r>
+        <w:rPr>
+          <w:b/>
+          <w:bCs/>
+        </w:rPr>
+        <w:t xml:space="preserve">295. Hvordan vurderer Norge en søknad om asyl?</w:t>
+      </w:r>
+    </w:p>
+    <w:p>
+      <w:pPr>
+        <w:keepNext/>
+        <w:spacing w:after="30"/>
+        <w:ind w:left="420"/>
+      </w:pPr>
+      <w:r>
+        <w:t xml:space="preserve">Hver søker får sin egen vurdering</w:t>
+      </w:r>
+    </w:p>
+    <w:p>
+      <w:pPr>
+        <w:keepNext/>
+        <w:spacing w:after="30"/>
+        <w:ind w:left="420"/>
+      </w:pPr>
+      <w:r>
+        <w:t xml:space="preserve">Familien får én felles vurdering</w:t>
+      </w:r>
+    </w:p>
+    <w:p>
+      <w:pPr>
+        <w:keepNext w:val="false"/>
+        <w:spacing w:after="30"/>
+        <w:ind w:left="420"/>
+      </w:pPr>
+      <w:r>
+        <w:t xml:space="preserve">Søkere fra samme land får samme svar</w:t>
+      </w:r>
+    </w:p>
+    <w:p>
+      <w:pPr>
+        <w:keepNext/>
+        <w:spacing w:after="60" w:before="180"/>
+      </w:pPr>
+      <w:r>
+        <w:rPr>
+          <w:b/>
+          <w:bCs/>
+        </w:rPr>
+        <w:t xml:space="preserve">296. Hvem er kvoteflyktninger?</w:t>
+      </w:r>
+    </w:p>
+    <w:p>
+      <w:pPr>
+        <w:keepNext/>
+        <w:spacing w:after="30"/>
+        <w:ind w:left="420"/>
+      </w:pPr>
+      <w:r>
+        <w:t xml:space="preserve">Flyktninger som er valgt ut før de kommer til Norge</w:t>
+      </w:r>
+    </w:p>
+    <w:p>
+      <w:pPr>
+        <w:keepNext/>
+        <w:spacing w:after="30"/>
+        <w:ind w:left="420"/>
+      </w:pPr>
+      <w:r>
+        <w:t xml:space="preserve">Flyktninger som kommer til den norske grensen på egen hånd</w:t>
+      </w:r>
+    </w:p>
+    <w:p>
+      <w:pPr>
+        <w:keepNext w:val="false"/>
+        <w:spacing w:after="30"/>
+        <w:ind w:left="420"/>
+      </w:pPr>
+      <w:r>
+        <w:t xml:space="preserve">Flyktninger som får jobb i Norge først</w:t>
+      </w:r>
+    </w:p>
+    <w:p>
+      <w:pPr>
+        <w:keepNext/>
+        <w:spacing w:after="60" w:before="180"/>
+      </w:pPr>
+      <w:r>
+        <w:rPr>
+          <w:b/>
+          <w:bCs/>
+        </w:rPr>
+        <w:t xml:space="preserve">297. Hvilken organisasjon hjelper Norge med å velge kvoteflyktninger?</w:t>
+      </w:r>
+    </w:p>
+    <w:p>
+      <w:pPr>
+        <w:keepNext/>
+        <w:spacing w:after="30"/>
+        <w:ind w:left="420"/>
+      </w:pPr>
+      <w:r>
+        <w:t xml:space="preserve">UNHCR, FNs flyktningorganisasjon</w:t>
+      </w:r>
+    </w:p>
+    <w:p>
+      <w:pPr>
+        <w:keepNext/>
+        <w:spacing w:after="30"/>
+        <w:ind w:left="420"/>
+      </w:pPr>
+      <w:r>
+        <w:t xml:space="preserve">NATO, en forsvarsorganisasjon</w:t>
+      </w:r>
+    </w:p>
+    <w:p>
+      <w:pPr>
+        <w:keepNext w:val="false"/>
+        <w:spacing w:after="30"/>
+        <w:ind w:left="420"/>
+      </w:pPr>
+      <w:r>
+        <w:t xml:space="preserve">EU, et samarbeid mellom europeiske land</w:t>
+      </w:r>
+    </w:p>
+    <w:p>
+      <w:pPr>
+        <w:keepNext/>
+        <w:spacing w:after="60" w:before="180"/>
+      </w:pPr>
+      <w:r>
+        <w:rPr>
+          <w:b/>
+          <w:bCs/>
+        </w:rPr>
+        <w:t xml:space="preserve">298. Hvilken tillatelse får kvoteflyktninger først?</w:t>
+      </w:r>
+    </w:p>
+    <w:p>
+      <w:pPr>
+        <w:keepNext/>
+        <w:spacing w:after="30"/>
+        <w:ind w:left="420"/>
+      </w:pPr>
+      <w:r>
+        <w:t xml:space="preserve">En midlertidig tillatelse</w:t>
+      </w:r>
+    </w:p>
+    <w:p>
+      <w:pPr>
+        <w:keepNext/>
+        <w:spacing w:after="30"/>
+        <w:ind w:left="420"/>
+      </w:pPr>
+      <w:r>
+        <w:t xml:space="preserve">En permanent tillatelse</w:t>
+      </w:r>
+    </w:p>
+    <w:p>
+      <w:pPr>
+        <w:keepNext w:val="false"/>
+        <w:spacing w:after="30"/>
+        <w:ind w:left="420"/>
+      </w:pPr>
+      <w:r>
+        <w:t xml:space="preserve">Norsk statsborgerskap</w:t>
+      </w:r>
+    </w:p>
+    <w:p>
+      <w:pPr>
+        <w:keepNext/>
+        <w:spacing w:after="60" w:before="180"/>
+      </w:pPr>
+      <w:r>
+        <w:rPr>
+          <w:b/>
+          <w:bCs/>
+        </w:rPr>
+        <w:t xml:space="preserve">299. Hva er familiegjenforening?</w:t>
+      </w:r>
+    </w:p>
+    <w:p>
+      <w:pPr>
+        <w:keepNext/>
+        <w:spacing w:after="30"/>
+        <w:ind w:left="420"/>
+      </w:pPr>
+      <w:r>
+        <w:t xml:space="preserve">Et familiemedlem får flytte til familie som bor i Norge</w:t>
+      </w:r>
+    </w:p>
+    <w:p>
+      <w:pPr>
+        <w:keepNext/>
+        <w:spacing w:after="30"/>
+        <w:ind w:left="420"/>
+      </w:pPr>
+      <w:r>
+        <w:t xml:space="preserve">En familie får lavere skatt de første årene i Norge</w:t>
+      </w:r>
+    </w:p>
+    <w:p>
+      <w:pPr>
+        <w:keepNext w:val="false"/>
+        <w:spacing w:after="30"/>
+        <w:ind w:left="420"/>
+      </w:pPr>
+      <w:r>
+        <w:t xml:space="preserve">En familie får gratis bolig fra kommunen</w:t>
+      </w:r>
+    </w:p>
+    <w:p>
+      <w:pPr>
+        <w:keepNext/>
+        <w:spacing w:after="60" w:before="180"/>
+      </w:pPr>
+      <w:r>
+        <w:rPr>
+          <w:b/>
+          <w:bCs/>
+        </w:rPr>
+        <w:t xml:space="preserve">300. Hva er introduksjonsprogrammet?</w:t>
+      </w:r>
+    </w:p>
+    <w:p>
+      <w:pPr>
+        <w:keepNext/>
+        <w:spacing w:after="30"/>
+        <w:ind w:left="420"/>
+      </w:pPr>
+      <w:r>
+        <w:t xml:space="preserve">Et opplæringstilbud for nyankomne flyktninger</w:t>
+      </w:r>
+    </w:p>
+    <w:p>
+      <w:pPr>
+        <w:keepNext/>
+        <w:spacing w:after="30"/>
+        <w:ind w:left="420"/>
+      </w:pPr>
+      <w:r>
+        <w:t xml:space="preserve">Et program på TV for nye innbyggere</w:t>
+      </w:r>
+    </w:p>
+    <w:p>
+      <w:pPr>
+        <w:keepNext w:val="false"/>
+        <w:spacing w:after="30"/>
+        <w:ind w:left="420"/>
+      </w:pPr>
+      <w:r>
+        <w:t xml:space="preserve">Et kurs for norske barn om andre land</w:t>
+      </w:r>
+    </w:p>
+    <w:p>
+      <w:pPr>
+        <w:keepNext/>
+        <w:spacing w:after="60" w:before="180"/>
+      </w:pPr>
+      <w:r>
+        <w:rPr>
+          <w:b/>
+          <w:bCs/>
+        </w:rPr>
+        <w:t xml:space="preserve">301. Hva er målet med introduksjonsprogrammet?</w:t>
+      </w:r>
+    </w:p>
+    <w:p>
+      <w:pPr>
+        <w:keepNext/>
+        <w:spacing w:after="30"/>
+        <w:ind w:left="420"/>
+      </w:pPr>
+      <w:r>
+        <w:t xml:space="preserve">Å lære norsk og komme i jobb eller utdanning</w:t>
+      </w:r>
+    </w:p>
+    <w:p>
+      <w:pPr>
+        <w:keepNext/>
+        <w:spacing w:after="30"/>
+        <w:ind w:left="420"/>
+      </w:pPr>
+      <w:r>
+        <w:t xml:space="preserve">Å få norsk pass og statsborgerskap så raskt som mulig</w:t>
+      </w:r>
+    </w:p>
+    <w:p>
+      <w:pPr>
+        <w:keepNext w:val="false"/>
+        <w:spacing w:after="30"/>
+        <w:ind w:left="420"/>
+      </w:pPr>
+      <w:r>
+        <w:t xml:space="preserve">Å finne en ny bolig i en annen kommune</w:t>
+      </w:r>
+    </w:p>
+    <w:p>
+      <w:pPr>
+        <w:keepNext/>
+        <w:spacing w:after="60" w:before="180"/>
+      </w:pPr>
+      <w:r>
+        <w:rPr>
+          <w:b/>
+          <w:bCs/>
+        </w:rPr>
+        <w:t xml:space="preserve">302. Hvem tilbyr introduksjonsprogram?</w:t>
+      </w:r>
+    </w:p>
+    <w:p>
+      <w:pPr>
+        <w:keepNext/>
+        <w:spacing w:after="30"/>
+        <w:ind w:left="420"/>
+      </w:pPr>
+      <w:r>
+        <w:t xml:space="preserve">Kommunen</w:t>
+      </w:r>
+    </w:p>
+    <w:p>
+      <w:pPr>
+        <w:keepNext/>
+        <w:spacing w:after="30"/>
+        <w:ind w:left="420"/>
+      </w:pPr>
+      <w:r>
+        <w:t xml:space="preserve">Arbeidsgiveren</w:t>
+      </w:r>
+    </w:p>
+    <w:p>
+      <w:pPr>
+        <w:keepNext w:val="false"/>
+        <w:spacing w:after="30"/>
+        <w:ind w:left="420"/>
+      </w:pPr>
+      <w:r>
+        <w:t xml:space="preserve">Politiet</w:t>
+      </w:r>
+    </w:p>
+    <w:p>
+      <w:pPr>
+        <w:keepNext/>
+        <w:spacing w:after="60" w:before="180"/>
+      </w:pPr>
+      <w:r>
+        <w:rPr>
+          <w:b/>
+          <w:bCs/>
+        </w:rPr>
+        <w:t xml:space="preserve">303. Hvem får tilbud om introduksjonsprogram?</w:t>
+      </w:r>
+    </w:p>
+    <w:p>
+      <w:pPr>
+        <w:keepNext/>
+        <w:spacing w:after="30"/>
+        <w:ind w:left="420"/>
+      </w:pPr>
+      <w:r>
+        <w:t xml:space="preserve">Flyktninger som har fått opphold</w:t>
+      </w:r>
+    </w:p>
+    <w:p>
+      <w:pPr>
+        <w:keepNext/>
+        <w:spacing w:after="30"/>
+        <w:ind w:left="420"/>
+      </w:pPr>
+      <w:r>
+        <w:t xml:space="preserve">Arbeidsinnvandrere fra EU</w:t>
+      </w:r>
+    </w:p>
+    <w:p>
+      <w:pPr>
+        <w:keepNext w:val="false"/>
+        <w:spacing w:after="30"/>
+        <w:ind w:left="420"/>
+      </w:pPr>
+      <w:r>
+        <w:t xml:space="preserve">Studenter fra utlandet</w:t>
+      </w:r>
+    </w:p>
+    <w:p>
+      <w:pPr>
+        <w:keepNext/>
+        <w:spacing w:after="60" w:before="180"/>
+      </w:pPr>
+      <w:r>
+        <w:rPr>
+          <w:b/>
+          <w:bCs/>
+        </w:rPr>
+        <w:t xml:space="preserve">304. Hvor lenge kan et introduksjonsprogram vare?</w:t>
+      </w:r>
+    </w:p>
+    <w:p>
+      <w:pPr>
+        <w:keepNext/>
+        <w:spacing w:after="30"/>
+        <w:ind w:left="420"/>
+      </w:pPr>
+      <w:r>
+        <w:t xml:space="preserve">Fra tre måneder til tre år</w:t>
+      </w:r>
+    </w:p>
+    <w:p>
+      <w:pPr>
+        <w:keepNext/>
+        <w:spacing w:after="30"/>
+        <w:ind w:left="420"/>
+      </w:pPr>
+      <w:r>
+        <w:t xml:space="preserve">Fra én uke til noen få måneder</w:t>
+      </w:r>
+    </w:p>
+    <w:p>
+      <w:pPr>
+        <w:keepNext w:val="false"/>
+        <w:spacing w:after="30"/>
+        <w:ind w:left="420"/>
+      </w:pPr>
+      <w:r>
+        <w:t xml:space="preserve">Fra fem år til ti år, hvis man ønsker det</w:t>
+      </w:r>
+    </w:p>
+    <w:p>
+      <w:pPr>
+        <w:keepNext/>
+        <w:spacing w:after="60" w:before="180"/>
+      </w:pPr>
+      <w:r>
+        <w:rPr>
+          <w:b/>
+          <w:bCs/>
+        </w:rPr>
+        <w:t xml:space="preserve">305. Hva får deltakere i introduksjonsprogrammet?</w:t>
+      </w:r>
+    </w:p>
+    <w:p>
+      <w:pPr>
+        <w:keepNext/>
+        <w:spacing w:after="30"/>
+        <w:ind w:left="420"/>
+      </w:pPr>
+      <w:r>
+        <w:t xml:space="preserve">Økonomisk støtte</w:t>
+      </w:r>
+    </w:p>
+    <w:p>
+      <w:pPr>
+        <w:keepNext/>
+        <w:spacing w:after="30"/>
+        <w:ind w:left="420"/>
+      </w:pPr>
+      <w:r>
+        <w:t xml:space="preserve">Gratis bil</w:t>
+      </w:r>
+    </w:p>
+    <w:p>
+      <w:pPr>
+        <w:keepNext w:val="false"/>
+        <w:spacing w:after="30"/>
+        <w:ind w:left="420"/>
+      </w:pPr>
+      <w:r>
+        <w:t xml:space="preserve">Norsk pass</w:t>
+      </w:r>
+    </w:p>
+    <w:p>
+      <w:pPr>
+        <w:keepNext/>
+        <w:spacing w:after="60" w:before="180"/>
+      </w:pPr>
+      <w:r>
+        <w:rPr>
+          <w:b/>
+          <w:bCs/>
+        </w:rPr>
+        <w:t xml:space="preserve">306. Hvorfor får deltakerne økonomisk støtte?</w:t>
+      </w:r>
+    </w:p>
+    <w:p>
+      <w:pPr>
+        <w:keepNext/>
+        <w:spacing w:after="30"/>
+        <w:ind w:left="420"/>
+      </w:pPr>
+      <w:r>
+        <w:t xml:space="preserve">Slik at de kan leve mens de lærer norsk</w:t>
+      </w:r>
+    </w:p>
+    <w:p>
+      <w:pPr>
+        <w:keepNext/>
+        <w:spacing w:after="30"/>
+        <w:ind w:left="420"/>
+      </w:pPr>
+      <w:r>
+        <w:t xml:space="preserve">Fordi de har fått gode karakterer i norskprøven</w:t>
+      </w:r>
+    </w:p>
+    <w:p>
+      <w:pPr>
+        <w:keepNext w:val="false"/>
+        <w:spacing w:after="30"/>
+        <w:ind w:left="420"/>
+      </w:pPr>
+      <w:r>
+        <w:t xml:space="preserve">Fordi de skal betale for kurset</w:t>
+      </w:r>
+    </w:p>
+    <w:p>
+      <w:pPr>
+        <w:keepNext/>
+        <w:spacing w:after="60" w:before="180"/>
+      </w:pPr>
+      <w:r>
+        <w:rPr>
+          <w:b/>
+          <w:bCs/>
+        </w:rPr>
+        <w:t xml:space="preserve">307. Hva er en del av introduksjonsprogrammet?</w:t>
+      </w:r>
+    </w:p>
+    <w:p>
+      <w:pPr>
+        <w:keepNext/>
+        <w:spacing w:after="30"/>
+        <w:ind w:left="420"/>
+      </w:pPr>
+      <w:r>
+        <w:t xml:space="preserve">Opplæring i norsk</w:t>
+      </w:r>
+    </w:p>
+    <w:p>
+      <w:pPr>
+        <w:keepNext/>
+        <w:spacing w:after="30"/>
+        <w:ind w:left="420"/>
+      </w:pPr>
+      <w:r>
+        <w:t xml:space="preserve">Betalt reise hjem</w:t>
+      </w:r>
+    </w:p>
+    <w:p>
+      <w:pPr>
+        <w:keepNext w:val="false"/>
+        <w:spacing w:after="30"/>
+        <w:ind w:left="420"/>
+      </w:pPr>
+      <w:r>
+        <w:t xml:space="preserve">Studier i utlandet</w:t>
+      </w:r>
+    </w:p>
+    <w:p>
+      <w:pPr>
+        <w:keepNext/>
+        <w:spacing w:after="60" w:before="180"/>
+      </w:pPr>
+      <w:r>
+        <w:rPr>
+          <w:b/>
+          <w:bCs/>
+        </w:rPr>
+        <w:t xml:space="preserve">308. Hva betyr ordet «integrering»?</w:t>
+      </w:r>
+    </w:p>
+    <w:p>
+      <w:pPr>
+        <w:keepNext/>
+        <w:spacing w:after="30"/>
+        <w:ind w:left="420"/>
+      </w:pPr>
+      <w:r>
+        <w:t xml:space="preserve">Nyankomne blir en del av samfunnet</w:t>
+      </w:r>
+    </w:p>
+    <w:p>
+      <w:pPr>
+        <w:keepNext/>
+        <w:spacing w:after="30"/>
+        <w:ind w:left="420"/>
+      </w:pPr>
+      <w:r>
+        <w:t xml:space="preserve">Nyankomne må reise hjem igjen</w:t>
+      </w:r>
+    </w:p>
+    <w:p>
+      <w:pPr>
+        <w:keepNext w:val="false"/>
+        <w:spacing w:after="30"/>
+        <w:ind w:left="420"/>
+      </w:pPr>
+      <w:r>
+        <w:t xml:space="preserve">Nyankomne bor i egne områder</w:t>
+      </w:r>
+    </w:p>
+    <w:p>
+      <w:pPr>
+        <w:keepNext/>
+        <w:spacing w:after="60" w:before="180"/>
+      </w:pPr>
+      <w:r>
+        <w:rPr>
+          <w:b/>
+          <w:bCs/>
+        </w:rPr>
+        <w:t xml:space="preserve">309. Hva heter loven om introduksjonsprogrammet?</w:t>
+      </w:r>
+    </w:p>
+    <w:p>
+      <w:pPr>
+        <w:keepNext/>
+        <w:spacing w:after="30"/>
+        <w:ind w:left="420"/>
+      </w:pPr>
+      <w:r>
+        <w:t xml:space="preserve">Integreringsloven</w:t>
+      </w:r>
+    </w:p>
+    <w:p>
+      <w:pPr>
+        <w:keepNext/>
+        <w:spacing w:after="30"/>
+        <w:ind w:left="420"/>
+      </w:pPr>
+      <w:r>
+        <w:t xml:space="preserve">Folketrygdloven</w:t>
+      </w:r>
+    </w:p>
+    <w:p>
+      <w:pPr>
+        <w:keepNext w:val="false"/>
+        <w:spacing w:after="30"/>
+        <w:ind w:left="420"/>
+      </w:pPr>
+      <w:r>
+        <w:t xml:space="preserve">Utlendingsloven</w:t>
+      </w:r>
+    </w:p>
+    <w:p>
+      <w:pPr>
+        <w:keepNext/>
+        <w:spacing w:after="60" w:before="180"/>
+      </w:pPr>
+      <w:r>
+        <w:rPr>
+          <w:b/>
+          <w:bCs/>
+        </w:rPr>
+        <w:t xml:space="preserve">310. Hvem har vedtatt integreringsloven?</w:t>
+      </w:r>
+    </w:p>
+    <w:p>
+      <w:pPr>
+        <w:keepNext/>
+        <w:spacing w:after="30"/>
+        <w:ind w:left="420"/>
+      </w:pPr>
+      <w:r>
+        <w:t xml:space="preserve">Stortinget</w:t>
+      </w:r>
+    </w:p>
+    <w:p>
+      <w:pPr>
+        <w:keepNext/>
+        <w:spacing w:after="30"/>
+        <w:ind w:left="420"/>
+      </w:pPr>
+      <w:r>
+        <w:t xml:space="preserve">Kommunen</w:t>
+      </w:r>
+    </w:p>
+    <w:p>
+      <w:pPr>
+        <w:keepNext w:val="false"/>
+        <w:spacing w:after="30"/>
+        <w:ind w:left="420"/>
+      </w:pPr>
+      <w:r>
+        <w:t xml:space="preserve">UDI</w:t>
+      </w:r>
+    </w:p>
+    <w:p>
+      <w:pPr>
+        <w:keepNext/>
+        <w:spacing w:after="60" w:before="180"/>
+      </w:pPr>
+      <w:r>
+        <w:rPr>
+          <w:b/>
+          <w:bCs/>
+        </w:rPr>
+        <w:t xml:space="preserve">311. Hvor kan en flyktning spørre om introduksjonsprogrammet?</w:t>
+      </w:r>
+    </w:p>
+    <w:p>
+      <w:pPr>
+        <w:keepNext/>
+        <w:spacing w:after="30"/>
+        <w:ind w:left="420"/>
+      </w:pPr>
+      <w:r>
+        <w:t xml:space="preserve">I kommunen der personen bor</w:t>
+      </w:r>
+    </w:p>
+    <w:p>
+      <w:pPr>
+        <w:keepNext/>
+        <w:spacing w:after="30"/>
+        <w:ind w:left="420"/>
+      </w:pPr>
+      <w:r>
+        <w:t xml:space="preserve">Hos politiet i nærmeste by</w:t>
+      </w:r>
+    </w:p>
+    <w:p>
+      <w:pPr>
+        <w:keepNext w:val="false"/>
+        <w:spacing w:after="30"/>
+        <w:ind w:left="420"/>
+      </w:pPr>
+      <w:r>
+        <w:t xml:space="preserve">Hos banken som personen bruker</w:t>
+      </w:r>
+    </w:p>
+    <w:p>
+      <w:pPr>
+        <w:keepNext/>
+        <w:spacing w:after="60" w:before="180"/>
+      </w:pPr>
+      <w:r>
+        <w:rPr>
+          <w:b/>
+          <w:bCs/>
+        </w:rPr>
+        <w:t xml:space="preserve">312. Omtrent hvor mange mennesker bor i Norge?</w:t>
+      </w:r>
+    </w:p>
+    <w:p>
+      <w:pPr>
+        <w:keepNext/>
+        <w:spacing w:after="30"/>
+        <w:ind w:left="420"/>
+      </w:pPr>
+      <w:r>
+        <w:t xml:space="preserve">Over fem millioner</w:t>
+      </w:r>
+    </w:p>
+    <w:p>
+      <w:pPr>
+        <w:keepNext/>
+        <w:spacing w:after="30"/>
+        <w:ind w:left="420"/>
+      </w:pPr>
+      <w:r>
+        <w:t xml:space="preserve">Omtrent én million</w:t>
+      </w:r>
+    </w:p>
+    <w:p>
+      <w:pPr>
+        <w:keepNext w:val="false"/>
+        <w:spacing w:after="30"/>
+        <w:ind w:left="420"/>
+      </w:pPr>
+      <w:r>
+        <w:t xml:space="preserve">Nesten ti millioner</w:t>
+      </w:r>
+    </w:p>
+    <w:p>
+      <w:pPr>
+        <w:keepNext/>
+        <w:spacing w:after="60" w:before="180"/>
+      </w:pPr>
+      <w:r>
+        <w:rPr>
+          <w:b/>
+          <w:bCs/>
+        </w:rPr>
+        <w:t xml:space="preserve">313. Hva slags styre har Norge?</w:t>
+      </w:r>
+    </w:p>
+    <w:p>
+      <w:pPr>
+        <w:keepNext/>
+        <w:spacing w:after="30"/>
+        <w:ind w:left="420"/>
+      </w:pPr>
+      <w:r>
+        <w:t xml:space="preserve">Et demokrati der kongen har en symbolsk rolle</w:t>
+      </w:r>
+    </w:p>
+    <w:p>
+      <w:pPr>
+        <w:keepNext/>
+        <w:spacing w:after="30"/>
+        <w:ind w:left="420"/>
+      </w:pPr>
+      <w:r>
+        <w:t xml:space="preserve">Et demokrati der kongen bestemmer over landets lover</w:t>
+      </w:r>
+    </w:p>
+    <w:p>
+      <w:pPr>
+        <w:keepNext w:val="false"/>
+        <w:spacing w:after="30"/>
+        <w:ind w:left="420"/>
+      </w:pPr>
+      <w:r>
+        <w:t xml:space="preserve">Et land uten konge og uten valg</w:t>
+      </w:r>
+    </w:p>
+    <w:p>
+      <w:pPr>
+        <w:keepNext/>
+        <w:spacing w:after="60" w:before="180"/>
+      </w:pPr>
+      <w:r>
+        <w:rPr>
+          <w:b/>
+          <w:bCs/>
+        </w:rPr>
+        <w:t xml:space="preserve">314. Hvor ofte er det stortingsvalg i Norge?</w:t>
+      </w:r>
+    </w:p>
+    <w:p>
+      <w:pPr>
+        <w:keepNext/>
+        <w:spacing w:after="30"/>
+        <w:ind w:left="420"/>
+      </w:pPr>
+      <w:r>
+        <w:t xml:space="preserve">Hvert fjerde år</w:t>
+      </w:r>
+    </w:p>
+    <w:p>
+      <w:pPr>
+        <w:keepNext/>
+        <w:spacing w:after="30"/>
+        <w:ind w:left="420"/>
+      </w:pPr>
+      <w:r>
+        <w:t xml:space="preserve">Hvert annet år</w:t>
+      </w:r>
+    </w:p>
+    <w:p>
+      <w:pPr>
+        <w:keepNext w:val="false"/>
+        <w:spacing w:after="30"/>
+        <w:ind w:left="420"/>
+      </w:pPr>
+      <w:r>
+        <w:t xml:space="preserve">Hvert tiende år</w:t>
+      </w:r>
+    </w:p>
+    <w:p>
+      <w:pPr>
+        <w:keepNext/>
+        <w:spacing w:after="60" w:before="180"/>
+      </w:pPr>
+      <w:r>
+        <w:rPr>
+          <w:b/>
+          <w:bCs/>
+        </w:rPr>
+        <w:t xml:space="preserve">315. Hvem kan stemme ved stortingsvalg?</w:t>
+      </w:r>
+    </w:p>
+    <w:p>
+      <w:pPr>
+        <w:keepNext/>
+        <w:spacing w:after="30"/>
+        <w:ind w:left="420"/>
+      </w:pPr>
+      <w:r>
+        <w:t xml:space="preserve">Norske statsborgere som er 18 år eller eldre</w:t>
+      </w:r>
+    </w:p>
+    <w:p>
+      <w:pPr>
+        <w:keepNext/>
+        <w:spacing w:after="30"/>
+        <w:ind w:left="420"/>
+      </w:pPr>
+      <w:r>
+        <w:t xml:space="preserve">Personer som har bodd tre år i Norge</w:t>
+      </w:r>
+    </w:p>
+    <w:p>
+      <w:pPr>
+        <w:keepNext w:val="false"/>
+        <w:spacing w:after="30"/>
+        <w:ind w:left="420"/>
+      </w:pPr>
+      <w:r>
+        <w:t xml:space="preserve">Norske statsborgere fra 16 år</w:t>
+      </w:r>
+    </w:p>
+    <w:p>
+      <w:pPr>
+        <w:keepNext/>
+        <w:spacing w:after="60" w:before="180"/>
+      </w:pPr>
+      <w:r>
+        <w:rPr>
+          <w:b/>
+          <w:bCs/>
+        </w:rPr>
+        <w:t xml:space="preserve">316. Hva betyr velferdsstat?</w:t>
+      </w:r>
+    </w:p>
+    <w:p>
+      <w:pPr>
+        <w:keepNext/>
+        <w:spacing w:after="30"/>
+        <w:ind w:left="420"/>
+      </w:pPr>
+      <w:r>
+        <w:t xml:space="preserve">Staten hjelper innbyggerne med blant annet skole og helse</w:t>
+      </w:r>
+    </w:p>
+    <w:p>
+      <w:pPr>
+        <w:keepNext/>
+        <w:spacing w:after="30"/>
+        <w:ind w:left="420"/>
+      </w:pPr>
+      <w:r>
+        <w:t xml:space="preserve">Staten eier selskapene i landet og bestemmer lønnen</w:t>
+      </w:r>
+    </w:p>
+    <w:p>
+      <w:pPr>
+        <w:keepNext w:val="false"/>
+        <w:spacing w:after="30"/>
+        <w:ind w:left="420"/>
+      </w:pPr>
+      <w:r>
+        <w:t xml:space="preserve">Staten gir innbyggerne like mye penger i året</w:t>
+      </w:r>
+    </w:p>
+    <w:p>
+      <w:pPr>
+        <w:keepNext/>
+        <w:spacing w:after="60" w:before="180"/>
+      </w:pPr>
+      <w:r>
+        <w:rPr>
+          <w:b/>
+          <w:bCs/>
+        </w:rPr>
+        <w:t xml:space="preserve">317. Hva bruker staten til å betale for velferden?</w:t>
+      </w:r>
+    </w:p>
+    <w:p>
+      <w:pPr>
+        <w:keepNext/>
+        <w:spacing w:after="30"/>
+        <w:ind w:left="420"/>
+      </w:pPr>
+      <w:r>
+        <w:t xml:space="preserve">Skatt som innbyggerne betaler</w:t>
+      </w:r>
+    </w:p>
+    <w:p>
+      <w:pPr>
+        <w:keepNext/>
+        <w:spacing w:after="30"/>
+        <w:ind w:left="420"/>
+      </w:pPr>
+      <w:r>
+        <w:t xml:space="preserve">Penger fra andre land i EU</w:t>
+      </w:r>
+    </w:p>
+    <w:p>
+      <w:pPr>
+        <w:keepNext w:val="false"/>
+        <w:spacing w:after="30"/>
+        <w:ind w:left="420"/>
+      </w:pPr>
+      <w:r>
+        <w:t xml:space="preserve">Penger som kongen eier</w:t>
+      </w:r>
+    </w:p>
+    <w:p>
+      <w:pPr>
+        <w:keepNext/>
+        <w:spacing w:after="60" w:before="180"/>
+      </w:pPr>
+      <w:r>
+        <w:rPr>
+          <w:b/>
+          <w:bCs/>
+        </w:rPr>
+        <w:t xml:space="preserve">318. Når feirer Norge nasjonaldagen?</w:t>
+      </w:r>
+    </w:p>
+    <w:p>
+      <w:pPr>
+        <w:keepNext/>
+        <w:spacing w:after="30"/>
+        <w:ind w:left="420"/>
+      </w:pPr>
+      <w:r>
+        <w:t xml:space="preserve">17. mai</w:t>
+      </w:r>
+    </w:p>
+    <w:p>
+      <w:pPr>
+        <w:keepNext/>
+        <w:spacing w:after="30"/>
+        <w:ind w:left="420"/>
+      </w:pPr>
+      <w:r>
+        <w:t xml:space="preserve">1. mai</w:t>
+      </w:r>
+    </w:p>
+    <w:p>
+      <w:pPr>
+        <w:keepNext w:val="false"/>
+        <w:spacing w:after="30"/>
+        <w:ind w:left="420"/>
+      </w:pPr>
+      <w:r>
+        <w:t xml:space="preserve">8. mai</w:t>
+      </w:r>
+    </w:p>
+    <w:p>
+      <w:pPr>
+        <w:keepNext/>
+        <w:spacing w:after="60" w:before="180"/>
+      </w:pPr>
+      <w:r>
+        <w:rPr>
+          <w:b/>
+          <w:bCs/>
+        </w:rPr>
+        <w:t xml:space="preserve">319. Hvilket år fikk Norge grunnloven sin?</w:t>
+      </w:r>
+    </w:p>
+    <w:p>
+      <w:pPr>
+        <w:keepNext/>
+        <w:spacing w:after="30"/>
+        <w:ind w:left="420"/>
+      </w:pPr>
+      <w:r>
+        <w:t xml:space="preserve">1814</w:t>
+      </w:r>
+    </w:p>
+    <w:p>
+      <w:pPr>
+        <w:keepNext/>
+        <w:spacing w:after="30"/>
+        <w:ind w:left="420"/>
+      </w:pPr>
+      <w:r>
+        <w:t xml:space="preserve">1905</w:t>
+      </w:r>
+    </w:p>
+    <w:p>
+      <w:pPr>
+        <w:keepNext w:val="false"/>
+        <w:spacing w:after="30"/>
+        <w:ind w:left="420"/>
+      </w:pPr>
+      <w:r>
+        <w:t xml:space="preserve">1945</w:t>
+      </w:r>
+    </w:p>
+    <w:p>
+      <w:pPr>
+        <w:keepNext/>
+        <w:spacing w:after="60" w:before="180"/>
+      </w:pPr>
+      <w:r>
+        <w:rPr>
+          <w:b/>
+          <w:bCs/>
+        </w:rPr>
+        <w:t xml:space="preserve">320. Hvilken union gikk Norge ut av i 1905?</w:t>
+      </w:r>
+    </w:p>
+    <w:p>
+      <w:pPr>
+        <w:keepNext/>
+        <w:spacing w:after="30"/>
+        <w:ind w:left="420"/>
+      </w:pPr>
+      <w:r>
+        <w:t xml:space="preserve">Unionen med Sverige</w:t>
+      </w:r>
+    </w:p>
+    <w:p>
+      <w:pPr>
+        <w:keepNext/>
+        <w:spacing w:after="30"/>
+        <w:ind w:left="420"/>
+      </w:pPr>
+      <w:r>
+        <w:t xml:space="preserve">Unionen med Danmark</w:t>
+      </w:r>
+    </w:p>
+    <w:p>
+      <w:pPr>
+        <w:keepNext w:val="false"/>
+        <w:spacing w:after="30"/>
+        <w:ind w:left="420"/>
+      </w:pPr>
+      <w:r>
+        <w:t xml:space="preserve">Unionen med Finland</w:t>
       </w:r>
     </w:p>
     <w:sectPr>

</xml_diff>

<commit_message>
Legg til Ny i Norge (80 spørsmål) under Familie, helse og hverdagsliv, kategorivalg og emnebasert trekning
Co-Authored-By: Claude Sonnet 5.5 <noreply@anthropic.com>
Claude-Session: https://claude.ai/code/session_011UYoyR9gVzG4pSPdKNw8ZV
</commit_message>
<xml_diff>
--- a/sporsmalsbank/ut/Spørsmålsbank_samfunnskunnskap.docx
+++ b/sporsmalsbank/ut/Spørsmålsbank_samfunnskunnskap.docx
@@ -15,7 +15,7 @@
         <w:spacing w:after="100"/>
       </w:pPr>
       <w:r>
-        <w:t xml:space="preserve">240 flervalgsspørsmål. Det første svaralternativet er alltid riktig.</w:t>
+        <w:t xml:space="preserve">320 flervalgsspørsmål. Det første svaralternativet er alltid riktig.</w:t>
       </w:r>
     </w:p>
     <w:p>
@@ -10360,6 +10360,3454 @@
       </w:pPr>
       <w:r>
         <w:t xml:space="preserve">En video som er tatt opp med dårlig lyd</w:t>
+      </w:r>
+    </w:p>
+    <w:p>
+      <w:pPr>
+        <w:pStyle w:val="Heading1"/>
+      </w:pPr>
+      <w:r>
+        <w:t xml:space="preserve">Ny i Norge (80 spørsmål)</w:t>
+      </w:r>
+    </w:p>
+    <w:p>
+      <w:pPr>
+        <w:keepNext/>
+        <w:spacing w:after="60" w:before="180"/>
+      </w:pPr>
+      <w:r>
+        <w:rPr>
+          <w:b/>
+          <w:bCs/>
+        </w:rPr>
+        <w:t xml:space="preserve">241. Omtrent hvor mange barn blir født i Norge hvert år?</w:t>
+      </w:r>
+    </w:p>
+    <w:p>
+      <w:pPr>
+        <w:keepNext/>
+        <w:spacing w:after="30"/>
+        <w:ind w:left="420"/>
+      </w:pPr>
+      <w:r>
+        <w:t xml:space="preserve">Omtrent 50 000 barn</w:t>
+      </w:r>
+    </w:p>
+    <w:p>
+      <w:pPr>
+        <w:keepNext/>
+        <w:spacing w:after="30"/>
+        <w:ind w:left="420"/>
+      </w:pPr>
+      <w:r>
+        <w:t xml:space="preserve">Omtrent 5 000 barn</w:t>
+      </w:r>
+    </w:p>
+    <w:p>
+      <w:pPr>
+        <w:keepNext w:val="false"/>
+        <w:spacing w:after="30"/>
+        <w:ind w:left="420"/>
+      </w:pPr>
+      <w:r>
+        <w:t xml:space="preserve">Omtrent 500 000 barn</w:t>
+      </w:r>
+    </w:p>
+    <w:p>
+      <w:pPr>
+        <w:keepNext/>
+        <w:spacing w:after="60" w:before="180"/>
+      </w:pPr>
+      <w:r>
+        <w:rPr>
+          <w:b/>
+          <w:bCs/>
+        </w:rPr>
+        <w:t xml:space="preserve">242. Hvor mange barn får en kvinne i Norge i gjennomsnitt?</w:t>
+      </w:r>
+    </w:p>
+    <w:p>
+      <w:pPr>
+        <w:keepNext/>
+        <w:spacing w:after="30"/>
+        <w:ind w:left="420"/>
+      </w:pPr>
+      <w:r>
+        <w:t xml:space="preserve">Omtrent 1,4 barn</w:t>
+      </w:r>
+    </w:p>
+    <w:p>
+      <w:pPr>
+        <w:keepNext/>
+        <w:spacing w:after="30"/>
+        <w:ind w:left="420"/>
+      </w:pPr>
+      <w:r>
+        <w:t xml:space="preserve">Omtrent 3 barn</w:t>
+      </w:r>
+    </w:p>
+    <w:p>
+      <w:pPr>
+        <w:keepNext w:val="false"/>
+        <w:spacing w:after="30"/>
+        <w:ind w:left="420"/>
+      </w:pPr>
+      <w:r>
+        <w:t xml:space="preserve">Omtrent 5 barn</w:t>
+      </w:r>
+    </w:p>
+    <w:p>
+      <w:pPr>
+        <w:keepNext/>
+        <w:spacing w:after="60" w:before="180"/>
+      </w:pPr>
+      <w:r>
+        <w:rPr>
+          <w:b/>
+          <w:bCs/>
+        </w:rPr>
+        <w:t xml:space="preserve">243. Hvor gammel er en kvinne i Norge når hun får første barn?</w:t>
+      </w:r>
+    </w:p>
+    <w:p>
+      <w:pPr>
+        <w:keepNext/>
+        <w:spacing w:after="30"/>
+        <w:ind w:left="420"/>
+      </w:pPr>
+      <w:r>
+        <w:t xml:space="preserve">Omtrent 30 år gammel</w:t>
+      </w:r>
+    </w:p>
+    <w:p>
+      <w:pPr>
+        <w:keepNext/>
+        <w:spacing w:after="30"/>
+        <w:ind w:left="420"/>
+      </w:pPr>
+      <w:r>
+        <w:t xml:space="preserve">Omtrent 20 år gammel</w:t>
+      </w:r>
+    </w:p>
+    <w:p>
+      <w:pPr>
+        <w:keepNext w:val="false"/>
+        <w:spacing w:after="30"/>
+        <w:ind w:left="420"/>
+      </w:pPr>
+      <w:r>
+        <w:t xml:space="preserve">Omtrent 40 år gammel</w:t>
+      </w:r>
+    </w:p>
+    <w:p>
+      <w:pPr>
+        <w:keepNext/>
+        <w:spacing w:after="60" w:before="180"/>
+      </w:pPr>
+      <w:r>
+        <w:rPr>
+          <w:b/>
+          <w:bCs/>
+        </w:rPr>
+        <w:t xml:space="preserve">244. Hva sier norsk lov om omskjæring av jenter?</w:t>
+      </w:r>
+    </w:p>
+    <w:p>
+      <w:pPr>
+        <w:keepNext/>
+        <w:spacing w:after="30"/>
+        <w:ind w:left="420"/>
+      </w:pPr>
+      <w:r>
+        <w:t xml:space="preserve">Det er forbudt, og straffen kan være opptil 15 år i fengsel</w:t>
+      </w:r>
+    </w:p>
+    <w:p>
+      <w:pPr>
+        <w:keepNext/>
+        <w:spacing w:after="30"/>
+        <w:ind w:left="420"/>
+      </w:pPr>
+      <w:r>
+        <w:t xml:space="preserve">Det er lov hvis foreldrene ønsker det og legen er enig</w:t>
+      </w:r>
+    </w:p>
+    <w:p>
+      <w:pPr>
+        <w:keepNext w:val="false"/>
+        <w:spacing w:after="30"/>
+        <w:ind w:left="420"/>
+      </w:pPr>
+      <w:r>
+        <w:t xml:space="preserve">Det er lov hvis jenta er over ti år gammel</w:t>
+      </w:r>
+    </w:p>
+    <w:p>
+      <w:pPr>
+        <w:keepNext/>
+        <w:spacing w:after="60" w:before="180"/>
+      </w:pPr>
+      <w:r>
+        <w:rPr>
+          <w:b/>
+          <w:bCs/>
+        </w:rPr>
+        <w:t xml:space="preserve">245. Hva er en barnehage?</w:t>
+      </w:r>
+    </w:p>
+    <w:p>
+      <w:pPr>
+        <w:keepNext/>
+        <w:spacing w:after="30"/>
+        <w:ind w:left="420"/>
+      </w:pPr>
+      <w:r>
+        <w:t xml:space="preserve">Et sted for små barn mens foreldrene er på jobb eller skole</w:t>
+      </w:r>
+    </w:p>
+    <w:p>
+      <w:pPr>
+        <w:keepNext/>
+        <w:spacing w:after="30"/>
+        <w:ind w:left="420"/>
+      </w:pPr>
+      <w:r>
+        <w:t xml:space="preserve">Et sted der barn lærer å lese og skrive før de begynner på skolen</w:t>
+      </w:r>
+    </w:p>
+    <w:p>
+      <w:pPr>
+        <w:keepNext w:val="false"/>
+        <w:spacing w:after="30"/>
+        <w:ind w:left="420"/>
+      </w:pPr>
+      <w:r>
+        <w:t xml:space="preserve">Et sted der barn bor når foreldrene er syke</w:t>
+      </w:r>
+    </w:p>
+    <w:p>
+      <w:pPr>
+        <w:keepNext/>
+        <w:spacing w:after="60" w:before="180"/>
+      </w:pPr>
+      <w:r>
+        <w:rPr>
+          <w:b/>
+          <w:bCs/>
+        </w:rPr>
+        <w:t xml:space="preserve">246. Hva betyr ordet «egenandel»?</w:t>
+      </w:r>
+    </w:p>
+    <w:p>
+      <w:pPr>
+        <w:keepNext/>
+        <w:spacing w:after="30"/>
+        <w:ind w:left="420"/>
+      </w:pPr>
+      <w:r>
+        <w:t xml:space="preserve">En del av prisen som du betaler selv</w:t>
+      </w:r>
+    </w:p>
+    <w:p>
+      <w:pPr>
+        <w:keepNext/>
+        <w:spacing w:after="30"/>
+        <w:ind w:left="420"/>
+      </w:pPr>
+      <w:r>
+        <w:t xml:space="preserve">Penger som du får fra staten</w:t>
+      </w:r>
+    </w:p>
+    <w:p>
+      <w:pPr>
+        <w:keepNext w:val="false"/>
+        <w:spacing w:after="30"/>
+        <w:ind w:left="420"/>
+      </w:pPr>
+      <w:r>
+        <w:t xml:space="preserve">Penger som du låner av banken</w:t>
+      </w:r>
+    </w:p>
+    <w:p>
+      <w:pPr>
+        <w:keepNext/>
+        <w:spacing w:after="60" w:before="180"/>
+      </w:pPr>
+      <w:r>
+        <w:rPr>
+          <w:b/>
+          <w:bCs/>
+        </w:rPr>
+        <w:t xml:space="preserve">247. Hva betaler foreldre for en plass i barnehagen?</w:t>
+      </w:r>
+    </w:p>
+    <w:p>
+      <w:pPr>
+        <w:keepNext/>
+        <w:spacing w:after="30"/>
+        <w:ind w:left="420"/>
+      </w:pPr>
+      <w:r>
+        <w:t xml:space="preserve">En egenandel hver måned</w:t>
+      </w:r>
+    </w:p>
+    <w:p>
+      <w:pPr>
+        <w:keepNext/>
+        <w:spacing w:after="30"/>
+        <w:ind w:left="420"/>
+      </w:pPr>
+      <w:r>
+        <w:t xml:space="preserve">Foreldrene betaler full pris selv</w:t>
+      </w:r>
+    </w:p>
+    <w:p>
+      <w:pPr>
+        <w:keepNext w:val="false"/>
+        <w:spacing w:after="30"/>
+        <w:ind w:left="420"/>
+      </w:pPr>
+      <w:r>
+        <w:t xml:space="preserve">Barnehagen er gratis for foreldrene</w:t>
+      </w:r>
+    </w:p>
+    <w:p>
+      <w:pPr>
+        <w:keepNext/>
+        <w:spacing w:after="60" w:before="180"/>
+      </w:pPr>
+      <w:r>
+        <w:rPr>
+          <w:b/>
+          <w:bCs/>
+        </w:rPr>
+        <w:t xml:space="preserve">248. Hvem kan få kontantstøtte?</w:t>
+      </w:r>
+    </w:p>
+    <w:p>
+      <w:pPr>
+        <w:keepNext/>
+        <w:spacing w:after="30"/>
+        <w:ind w:left="420"/>
+      </w:pPr>
+      <w:r>
+        <w:t xml:space="preserve">Foreldre med små barn som ikke har barnehageplass</w:t>
+      </w:r>
+    </w:p>
+    <w:p>
+      <w:pPr>
+        <w:keepNext/>
+        <w:spacing w:after="30"/>
+        <w:ind w:left="420"/>
+      </w:pPr>
+      <w:r>
+        <w:t xml:space="preserve">Foreldre som har barn på ungdomsskolen og videregående</w:t>
+      </w:r>
+    </w:p>
+    <w:p>
+      <w:pPr>
+        <w:keepNext w:val="false"/>
+        <w:spacing w:after="30"/>
+        <w:ind w:left="420"/>
+      </w:pPr>
+      <w:r>
+        <w:t xml:space="preserve">Foreldre som tar utdanning i utlandet</w:t>
+      </w:r>
+    </w:p>
+    <w:p>
+      <w:pPr>
+        <w:keepNext/>
+        <w:spacing w:after="60" w:before="180"/>
+      </w:pPr>
+      <w:r>
+        <w:rPr>
+          <w:b/>
+          <w:bCs/>
+        </w:rPr>
+        <w:t xml:space="preserve">249. Hva er foreldrepenger?</w:t>
+      </w:r>
+    </w:p>
+    <w:p>
+      <w:pPr>
+        <w:keepNext/>
+        <w:spacing w:after="30"/>
+        <w:ind w:left="420"/>
+      </w:pPr>
+      <w:r>
+        <w:t xml:space="preserve">Penger fra Nav når foreldre er hjemme med et nytt barn</w:t>
+      </w:r>
+    </w:p>
+    <w:p>
+      <w:pPr>
+        <w:keepNext/>
+        <w:spacing w:after="30"/>
+        <w:ind w:left="420"/>
+      </w:pPr>
+      <w:r>
+        <w:t xml:space="preserve">Penger fra barnehagen når barnet begynner</w:t>
+      </w:r>
+    </w:p>
+    <w:p>
+      <w:pPr>
+        <w:keepNext w:val="false"/>
+        <w:spacing w:after="30"/>
+        <w:ind w:left="420"/>
+      </w:pPr>
+      <w:r>
+        <w:t xml:space="preserve">Penger fra skolen når barnet er syk</w:t>
+      </w:r>
+    </w:p>
+    <w:p>
+      <w:pPr>
+        <w:keepNext/>
+        <w:spacing w:after="60" w:before="180"/>
+      </w:pPr>
+      <w:r>
+        <w:rPr>
+          <w:b/>
+          <w:bCs/>
+        </w:rPr>
+        <w:t xml:space="preserve">250. Hvem betaler barnetrygd til foreldrene?</w:t>
+      </w:r>
+    </w:p>
+    <w:p>
+      <w:pPr>
+        <w:keepNext/>
+        <w:spacing w:after="30"/>
+        <w:ind w:left="420"/>
+      </w:pPr>
+      <w:r>
+        <w:t xml:space="preserve">Staten</w:t>
+      </w:r>
+    </w:p>
+    <w:p>
+      <w:pPr>
+        <w:keepNext/>
+        <w:spacing w:after="30"/>
+        <w:ind w:left="420"/>
+      </w:pPr>
+      <w:r>
+        <w:t xml:space="preserve">Arbeidsgiveren</w:t>
+      </w:r>
+    </w:p>
+    <w:p>
+      <w:pPr>
+        <w:keepNext w:val="false"/>
+        <w:spacing w:after="30"/>
+        <w:ind w:left="420"/>
+      </w:pPr>
+      <w:r>
+        <w:t xml:space="preserve">Barnehagen</w:t>
+      </w:r>
+    </w:p>
+    <w:p>
+      <w:pPr>
+        <w:keepNext/>
+        <w:spacing w:after="60" w:before="180"/>
+      </w:pPr>
+      <w:r>
+        <w:rPr>
+          <w:b/>
+          <w:bCs/>
+        </w:rPr>
+        <w:t xml:space="preserve">251. Hvor lenge får foreldre barnetrygd for et barn?</w:t>
+      </w:r>
+    </w:p>
+    <w:p>
+      <w:pPr>
+        <w:keepNext/>
+        <w:spacing w:after="30"/>
+        <w:ind w:left="420"/>
+      </w:pPr>
+      <w:r>
+        <w:t xml:space="preserve">Til barnet er 18 år</w:t>
+      </w:r>
+    </w:p>
+    <w:p>
+      <w:pPr>
+        <w:keepNext/>
+        <w:spacing w:after="30"/>
+        <w:ind w:left="420"/>
+      </w:pPr>
+      <w:r>
+        <w:t xml:space="preserve">Til barnet er 12 år</w:t>
+      </w:r>
+    </w:p>
+    <w:p>
+      <w:pPr>
+        <w:keepNext w:val="false"/>
+        <w:spacing w:after="30"/>
+        <w:ind w:left="420"/>
+      </w:pPr>
+      <w:r>
+        <w:t xml:space="preserve">Til barnet begynner på skole</w:t>
+      </w:r>
+    </w:p>
+    <w:p>
+      <w:pPr>
+        <w:keepNext/>
+        <w:spacing w:after="60" w:before="180"/>
+      </w:pPr>
+      <w:r>
+        <w:rPr>
+          <w:b/>
+          <w:bCs/>
+        </w:rPr>
+        <w:t xml:space="preserve">252. Hvor mye barnetrygd får et barn i en rik familie?</w:t>
+      </w:r>
+    </w:p>
+    <w:p>
+      <w:pPr>
+        <w:keepNext/>
+        <w:spacing w:after="30"/>
+        <w:ind w:left="420"/>
+      </w:pPr>
+      <w:r>
+        <w:t xml:space="preserve">Like mye som et barn i en fattig familie</w:t>
+      </w:r>
+    </w:p>
+    <w:p>
+      <w:pPr>
+        <w:keepNext/>
+        <w:spacing w:after="30"/>
+        <w:ind w:left="420"/>
+      </w:pPr>
+      <w:r>
+        <w:t xml:space="preserve">Mer enn et barn i en fattig familie</w:t>
+      </w:r>
+    </w:p>
+    <w:p>
+      <w:pPr>
+        <w:keepNext w:val="false"/>
+        <w:spacing w:after="30"/>
+        <w:ind w:left="420"/>
+      </w:pPr>
+      <w:r>
+        <w:t xml:space="preserve">Mindre enn et barn i en fattig familie</w:t>
+      </w:r>
+    </w:p>
+    <w:p>
+      <w:pPr>
+        <w:keepNext/>
+        <w:spacing w:after="60" w:before="180"/>
+      </w:pPr>
+      <w:r>
+        <w:rPr>
+          <w:b/>
+          <w:bCs/>
+        </w:rPr>
+        <w:t xml:space="preserve">253. Hvor mange år varer grunnskolen i Norge?</w:t>
+      </w:r>
+    </w:p>
+    <w:p>
+      <w:pPr>
+        <w:keepNext/>
+        <w:spacing w:after="30"/>
+        <w:ind w:left="420"/>
+      </w:pPr>
+      <w:r>
+        <w:t xml:space="preserve">Ti år</w:t>
+      </w:r>
+    </w:p>
+    <w:p>
+      <w:pPr>
+        <w:keepNext/>
+        <w:spacing w:after="30"/>
+        <w:ind w:left="420"/>
+      </w:pPr>
+      <w:r>
+        <w:t xml:space="preserve">Syv år</w:t>
+      </w:r>
+    </w:p>
+    <w:p>
+      <w:pPr>
+        <w:keepNext w:val="false"/>
+        <w:spacing w:after="30"/>
+        <w:ind w:left="420"/>
+      </w:pPr>
+      <w:r>
+        <w:t xml:space="preserve">Tretten år</w:t>
+      </w:r>
+    </w:p>
+    <w:p>
+      <w:pPr>
+        <w:keepNext/>
+        <w:spacing w:after="60" w:before="180"/>
+      </w:pPr>
+      <w:r>
+        <w:rPr>
+          <w:b/>
+          <w:bCs/>
+        </w:rPr>
+        <w:t xml:space="preserve">254. Hvilke klasser er barneskolen?</w:t>
+      </w:r>
+    </w:p>
+    <w:p>
+      <w:pPr>
+        <w:keepNext/>
+        <w:spacing w:after="30"/>
+        <w:ind w:left="420"/>
+      </w:pPr>
+      <w:r>
+        <w:t xml:space="preserve">1. til 7. klasse</w:t>
+      </w:r>
+    </w:p>
+    <w:p>
+      <w:pPr>
+        <w:keepNext/>
+        <w:spacing w:after="30"/>
+        <w:ind w:left="420"/>
+      </w:pPr>
+      <w:r>
+        <w:t xml:space="preserve">1. til 4. klasse</w:t>
+      </w:r>
+    </w:p>
+    <w:p>
+      <w:pPr>
+        <w:keepNext w:val="false"/>
+        <w:spacing w:after="30"/>
+        <w:ind w:left="420"/>
+      </w:pPr>
+      <w:r>
+        <w:t xml:space="preserve">5. til 10. klasse</w:t>
+      </w:r>
+    </w:p>
+    <w:p>
+      <w:pPr>
+        <w:keepNext/>
+        <w:spacing w:after="60" w:before="180"/>
+      </w:pPr>
+      <w:r>
+        <w:rPr>
+          <w:b/>
+          <w:bCs/>
+        </w:rPr>
+        <w:t xml:space="preserve">255. Hvor gamle er elever på ungdomsskolen?</w:t>
+      </w:r>
+    </w:p>
+    <w:p>
+      <w:pPr>
+        <w:keepNext/>
+        <w:spacing w:after="30"/>
+        <w:ind w:left="420"/>
+      </w:pPr>
+      <w:r>
+        <w:t xml:space="preserve">Omtrent 13 til 16 år</w:t>
+      </w:r>
+    </w:p>
+    <w:p>
+      <w:pPr>
+        <w:keepNext/>
+        <w:spacing w:after="30"/>
+        <w:ind w:left="420"/>
+      </w:pPr>
+      <w:r>
+        <w:t xml:space="preserve">Omtrent 7 til 10 år</w:t>
+      </w:r>
+    </w:p>
+    <w:p>
+      <w:pPr>
+        <w:keepNext w:val="false"/>
+        <w:spacing w:after="30"/>
+        <w:ind w:left="420"/>
+      </w:pPr>
+      <w:r>
+        <w:t xml:space="preserve">Omtrent 16 til 19 år</w:t>
+      </w:r>
+    </w:p>
+    <w:p>
+      <w:pPr>
+        <w:keepNext/>
+        <w:spacing w:after="60" w:before="180"/>
+      </w:pPr>
+      <w:r>
+        <w:rPr>
+          <w:b/>
+          <w:bCs/>
+        </w:rPr>
+        <w:t xml:space="preserve">256. Fra hvilken alder må barn gå på skole i Norge?</w:t>
+      </w:r>
+    </w:p>
+    <w:p>
+      <w:pPr>
+        <w:keepNext/>
+        <w:spacing w:after="30"/>
+        <w:ind w:left="420"/>
+      </w:pPr>
+      <w:r>
+        <w:t xml:space="preserve">Fra de er seks år, i 1. klasse</w:t>
+      </w:r>
+    </w:p>
+    <w:p>
+      <w:pPr>
+        <w:keepNext/>
+        <w:spacing w:after="30"/>
+        <w:ind w:left="420"/>
+      </w:pPr>
+      <w:r>
+        <w:t xml:space="preserve">Fra de er tre år, som i barnehagen</w:t>
+      </w:r>
+    </w:p>
+    <w:p>
+      <w:pPr>
+        <w:keepNext w:val="false"/>
+        <w:spacing w:after="30"/>
+        <w:ind w:left="420"/>
+      </w:pPr>
+      <w:r>
+        <w:t xml:space="preserve">Fra de er ti år, i 5. klasse</w:t>
+      </w:r>
+    </w:p>
+    <w:p>
+      <w:pPr>
+        <w:keepNext/>
+        <w:spacing w:after="60" w:before="180"/>
+      </w:pPr>
+      <w:r>
+        <w:rPr>
+          <w:b/>
+          <w:bCs/>
+        </w:rPr>
+        <w:t xml:space="preserve">257. Hva koster det å gå på offentlig grunnskole?</w:t>
+      </w:r>
+    </w:p>
+    <w:p>
+      <w:pPr>
+        <w:keepNext/>
+        <w:spacing w:after="30"/>
+        <w:ind w:left="420"/>
+      </w:pPr>
+      <w:r>
+        <w:t xml:space="preserve">Ingenting, skolen er gratis</w:t>
+      </w:r>
+    </w:p>
+    <w:p>
+      <w:pPr>
+        <w:keepNext/>
+        <w:spacing w:after="30"/>
+        <w:ind w:left="420"/>
+      </w:pPr>
+      <w:r>
+        <w:t xml:space="preserve">En liten pris hver måned</w:t>
+      </w:r>
+    </w:p>
+    <w:p>
+      <w:pPr>
+        <w:keepNext w:val="false"/>
+        <w:spacing w:after="30"/>
+        <w:ind w:left="420"/>
+      </w:pPr>
+      <w:r>
+        <w:t xml:space="preserve">Halv pris for lav inntekt</w:t>
+      </w:r>
+    </w:p>
+    <w:p>
+      <w:pPr>
+        <w:keepNext/>
+        <w:spacing w:after="60" w:before="180"/>
+      </w:pPr>
+      <w:r>
+        <w:rPr>
+          <w:b/>
+          <w:bCs/>
+        </w:rPr>
+        <w:t xml:space="preserve">258. Hva er SFO?</w:t>
+      </w:r>
+    </w:p>
+    <w:p>
+      <w:pPr>
+        <w:keepNext/>
+        <w:spacing w:after="30"/>
+        <w:ind w:left="420"/>
+      </w:pPr>
+      <w:r>
+        <w:t xml:space="preserve">Et tilbud for barn på skolen før og etter skoletid</w:t>
+      </w:r>
+    </w:p>
+    <w:p>
+      <w:pPr>
+        <w:keepNext/>
+        <w:spacing w:after="30"/>
+        <w:ind w:left="420"/>
+      </w:pPr>
+      <w:r>
+        <w:t xml:space="preserve">Et fag på barneskolen der barna lærer om sport og friluftsliv</w:t>
+      </w:r>
+    </w:p>
+    <w:p>
+      <w:pPr>
+        <w:keepNext w:val="false"/>
+        <w:spacing w:after="30"/>
+        <w:ind w:left="420"/>
+      </w:pPr>
+      <w:r>
+        <w:t xml:space="preserve">En skole for barn som trenger ekstra hjelp</w:t>
+      </w:r>
+    </w:p>
+    <w:p>
+      <w:pPr>
+        <w:keepNext/>
+        <w:spacing w:after="60" w:before="180"/>
+      </w:pPr>
+      <w:r>
+        <w:rPr>
+          <w:b/>
+          <w:bCs/>
+        </w:rPr>
+        <w:t xml:space="preserve">259. Omtrent hvor mange barn i 1. til 4. klasse går på SFO?</w:t>
+      </w:r>
+    </w:p>
+    <w:p>
+      <w:pPr>
+        <w:keepNext/>
+        <w:spacing w:after="30"/>
+        <w:ind w:left="420"/>
+      </w:pPr>
+      <w:r>
+        <w:t xml:space="preserve">Omtrent åtte av ti barn</w:t>
+      </w:r>
+    </w:p>
+    <w:p>
+      <w:pPr>
+        <w:keepNext/>
+        <w:spacing w:after="30"/>
+        <w:ind w:left="420"/>
+      </w:pPr>
+      <w:r>
+        <w:t xml:space="preserve">Omtrent to av ti barn</w:t>
+      </w:r>
+    </w:p>
+    <w:p>
+      <w:pPr>
+        <w:keepNext w:val="false"/>
+        <w:spacing w:after="30"/>
+        <w:ind w:left="420"/>
+      </w:pPr>
+      <w:r>
+        <w:t xml:space="preserve">Omtrent én av ti barn</w:t>
+      </w:r>
+    </w:p>
+    <w:p>
+      <w:pPr>
+        <w:keepNext/>
+        <w:spacing w:after="60" w:before="180"/>
+      </w:pPr>
+      <w:r>
+        <w:rPr>
+          <w:b/>
+          <w:bCs/>
+        </w:rPr>
+        <w:t xml:space="preserve">260. Hvor mange fullfører videregående skole i Norge?</w:t>
+      </w:r>
+    </w:p>
+    <w:p>
+      <w:pPr>
+        <w:keepNext/>
+        <w:spacing w:after="30"/>
+        <w:ind w:left="420"/>
+      </w:pPr>
+      <w:r>
+        <w:t xml:space="preserve">Nesten åtte av ti elever</w:t>
+      </w:r>
+    </w:p>
+    <w:p>
+      <w:pPr>
+        <w:keepNext/>
+        <w:spacing w:after="30"/>
+        <w:ind w:left="420"/>
+      </w:pPr>
+      <w:r>
+        <w:t xml:space="preserve">Omtrent fire av ti elever</w:t>
+      </w:r>
+    </w:p>
+    <w:p>
+      <w:pPr>
+        <w:keepNext w:val="false"/>
+        <w:spacing w:after="30"/>
+        <w:ind w:left="420"/>
+      </w:pPr>
+      <w:r>
+        <w:t xml:space="preserve">Omtrent seks av ti elever</w:t>
+      </w:r>
+    </w:p>
+    <w:p>
+      <w:pPr>
+        <w:keepNext/>
+        <w:spacing w:after="60" w:before="180"/>
+      </w:pPr>
+      <w:r>
+        <w:rPr>
+          <w:b/>
+          <w:bCs/>
+        </w:rPr>
+        <w:t xml:space="preserve">261. Hvor mange elever velger yrkesfag på videregående?</w:t>
+      </w:r>
+    </w:p>
+    <w:p>
+      <w:pPr>
+        <w:keepNext/>
+        <w:spacing w:after="30"/>
+        <w:ind w:left="420"/>
+      </w:pPr>
+      <w:r>
+        <w:t xml:space="preserve">Omtrent halvparten</w:t>
+      </w:r>
+    </w:p>
+    <w:p>
+      <w:pPr>
+        <w:keepNext/>
+        <w:spacing w:after="30"/>
+        <w:ind w:left="420"/>
+      </w:pPr>
+      <w:r>
+        <w:t xml:space="preserve">Omtrent én av ti elever</w:t>
+      </w:r>
+    </w:p>
+    <w:p>
+      <w:pPr>
+        <w:keepNext w:val="false"/>
+        <w:spacing w:after="30"/>
+        <w:ind w:left="420"/>
+      </w:pPr>
+      <w:r>
+        <w:t xml:space="preserve">Omtrent ni av ti elever</w:t>
+      </w:r>
+    </w:p>
+    <w:p>
+      <w:pPr>
+        <w:keepNext/>
+        <w:spacing w:after="60" w:before="180"/>
+      </w:pPr>
+      <w:r>
+        <w:rPr>
+          <w:b/>
+          <w:bCs/>
+        </w:rPr>
+        <w:t xml:space="preserve">262. Hva gir studiespesialisering deg?</w:t>
+      </w:r>
+    </w:p>
+    <w:p>
+      <w:pPr>
+        <w:keepNext/>
+        <w:spacing w:after="30"/>
+        <w:ind w:left="420"/>
+      </w:pPr>
+      <w:r>
+        <w:t xml:space="preserve">Rett til å søke på universitet og høgskole</w:t>
+      </w:r>
+    </w:p>
+    <w:p>
+      <w:pPr>
+        <w:keepNext/>
+        <w:spacing w:after="30"/>
+        <w:ind w:left="420"/>
+      </w:pPr>
+      <w:r>
+        <w:t xml:space="preserve">Rett til å få fagbrev som lærling</w:t>
+      </w:r>
+    </w:p>
+    <w:p>
+      <w:pPr>
+        <w:keepNext w:val="false"/>
+        <w:spacing w:after="30"/>
+        <w:ind w:left="420"/>
+      </w:pPr>
+      <w:r>
+        <w:t xml:space="preserve">Rett til å starte i 1. klasse på SFO</w:t>
+      </w:r>
+    </w:p>
+    <w:p>
+      <w:pPr>
+        <w:keepNext/>
+        <w:spacing w:after="60" w:before="180"/>
+      </w:pPr>
+      <w:r>
+        <w:rPr>
+          <w:b/>
+          <w:bCs/>
+        </w:rPr>
+        <w:t xml:space="preserve">263. Hva kan du få etter yrkesfag og læretid?</w:t>
+      </w:r>
+    </w:p>
+    <w:p>
+      <w:pPr>
+        <w:keepNext/>
+        <w:spacing w:after="30"/>
+        <w:ind w:left="420"/>
+      </w:pPr>
+      <w:r>
+        <w:t xml:space="preserve">Fagbrev</w:t>
+      </w:r>
+    </w:p>
+    <w:p>
+      <w:pPr>
+        <w:keepNext/>
+        <w:spacing w:after="30"/>
+        <w:ind w:left="420"/>
+      </w:pPr>
+      <w:r>
+        <w:t xml:space="preserve">Bachelorgrad</w:t>
+      </w:r>
+    </w:p>
+    <w:p>
+      <w:pPr>
+        <w:keepNext w:val="false"/>
+        <w:spacing w:after="30"/>
+        <w:ind w:left="420"/>
+      </w:pPr>
+      <w:r>
+        <w:t xml:space="preserve">Studielån</w:t>
+      </w:r>
+    </w:p>
+    <w:p>
+      <w:pPr>
+        <w:keepNext/>
+        <w:spacing w:after="60" w:before="180"/>
+      </w:pPr>
+      <w:r>
+        <w:rPr>
+          <w:b/>
+          <w:bCs/>
+        </w:rPr>
+        <w:t xml:space="preserve">264. Hva er en lærling?</w:t>
+      </w:r>
+    </w:p>
+    <w:p>
+      <w:pPr>
+        <w:keepNext/>
+        <w:spacing w:after="30"/>
+        <w:ind w:left="420"/>
+      </w:pPr>
+      <w:r>
+        <w:t xml:space="preserve">En person som lærer et yrke på en arbeidsplass</w:t>
+      </w:r>
+    </w:p>
+    <w:p>
+      <w:pPr>
+        <w:keepNext/>
+        <w:spacing w:after="30"/>
+        <w:ind w:left="420"/>
+      </w:pPr>
+      <w:r>
+        <w:t xml:space="preserve">En elev som tar ekstra fag på ungdomsskolen i helgene</w:t>
+      </w:r>
+    </w:p>
+    <w:p>
+      <w:pPr>
+        <w:keepNext w:val="false"/>
+        <w:spacing w:after="30"/>
+        <w:ind w:left="420"/>
+      </w:pPr>
+      <w:r>
+        <w:t xml:space="preserve">En student som tar bachelor på universitetet</w:t>
+      </w:r>
+    </w:p>
+    <w:p>
+      <w:pPr>
+        <w:keepNext/>
+        <w:spacing w:after="60" w:before="180"/>
+      </w:pPr>
+      <w:r>
+        <w:rPr>
+          <w:b/>
+          <w:bCs/>
+        </w:rPr>
+        <w:t xml:space="preserve">265. Hva er en bachelorgrad?</w:t>
+      </w:r>
+    </w:p>
+    <w:p>
+      <w:pPr>
+        <w:keepNext/>
+        <w:spacing w:after="30"/>
+        <w:ind w:left="420"/>
+      </w:pPr>
+      <w:r>
+        <w:t xml:space="preserve">En utdanning på universitetet som tar omtrent tre år</w:t>
+      </w:r>
+    </w:p>
+    <w:p>
+      <w:pPr>
+        <w:keepNext/>
+        <w:spacing w:after="30"/>
+        <w:ind w:left="420"/>
+      </w:pPr>
+      <w:r>
+        <w:t xml:space="preserve">En utdanning på videregående som tar to år</w:t>
+      </w:r>
+    </w:p>
+    <w:p>
+      <w:pPr>
+        <w:keepNext w:val="false"/>
+        <w:spacing w:after="30"/>
+        <w:ind w:left="420"/>
+      </w:pPr>
+      <w:r>
+        <w:t xml:space="preserve">En utdanning for lærlinger som tar fire år</w:t>
+      </w:r>
+    </w:p>
+    <w:p>
+      <w:pPr>
+        <w:keepNext/>
+        <w:spacing w:after="60" w:before="180"/>
+      </w:pPr>
+      <w:r>
+        <w:rPr>
+          <w:b/>
+          <w:bCs/>
+        </w:rPr>
+        <w:t xml:space="preserve">266. Hva er et stipend?</w:t>
+      </w:r>
+    </w:p>
+    <w:p>
+      <w:pPr>
+        <w:keepNext/>
+        <w:spacing w:after="30"/>
+        <w:ind w:left="420"/>
+      </w:pPr>
+      <w:r>
+        <w:t xml:space="preserve">Penger til studenter som de ikke må betale tilbake</w:t>
+      </w:r>
+    </w:p>
+    <w:p>
+      <w:pPr>
+        <w:keepNext/>
+        <w:spacing w:after="30"/>
+        <w:ind w:left="420"/>
+      </w:pPr>
+      <w:r>
+        <w:t xml:space="preserve">Penger til studenter som de må betale tilbake senere</w:t>
+      </w:r>
+    </w:p>
+    <w:p>
+      <w:pPr>
+        <w:keepNext w:val="false"/>
+        <w:spacing w:after="30"/>
+        <w:ind w:left="420"/>
+      </w:pPr>
+      <w:r>
+        <w:t xml:space="preserve">Penger til lærlinger fra arbeidsgiveren</w:t>
+      </w:r>
+    </w:p>
+    <w:p>
+      <w:pPr>
+        <w:keepNext/>
+        <w:spacing w:after="60" w:before="180"/>
+      </w:pPr>
+      <w:r>
+        <w:rPr>
+          <w:b/>
+          <w:bCs/>
+        </w:rPr>
+        <w:t xml:space="preserve">267. Hvem gir studielån i Norge?</w:t>
+      </w:r>
+    </w:p>
+    <w:p>
+      <w:pPr>
+        <w:keepNext/>
+        <w:spacing w:after="30"/>
+        <w:ind w:left="420"/>
+      </w:pPr>
+      <w:r>
+        <w:t xml:space="preserve">Lånekassen</w:t>
+      </w:r>
+    </w:p>
+    <w:p>
+      <w:pPr>
+        <w:keepNext/>
+        <w:spacing w:after="30"/>
+        <w:ind w:left="420"/>
+      </w:pPr>
+      <w:r>
+        <w:t xml:space="preserve">Nav</w:t>
+      </w:r>
+    </w:p>
+    <w:p>
+      <w:pPr>
+        <w:keepNext w:val="false"/>
+        <w:spacing w:after="30"/>
+        <w:ind w:left="420"/>
+      </w:pPr>
+      <w:r>
+        <w:t xml:space="preserve">Skatteetaten</w:t>
+      </w:r>
+    </w:p>
+    <w:p>
+      <w:pPr>
+        <w:keepNext/>
+        <w:spacing w:after="60" w:before="180"/>
+      </w:pPr>
+      <w:r>
+        <w:rPr>
+          <w:b/>
+          <w:bCs/>
+        </w:rPr>
+        <w:t xml:space="preserve">268. Hvor mye studiegjeld har mange studenter etter studiene?</w:t>
+      </w:r>
+    </w:p>
+    <w:p>
+      <w:pPr>
+        <w:keepNext/>
+        <w:spacing w:after="30"/>
+        <w:ind w:left="420"/>
+      </w:pPr>
+      <w:r>
+        <w:t xml:space="preserve">Over 300 000 kroner</w:t>
+      </w:r>
+    </w:p>
+    <w:p>
+      <w:pPr>
+        <w:keepNext/>
+        <w:spacing w:after="30"/>
+        <w:ind w:left="420"/>
+      </w:pPr>
+      <w:r>
+        <w:t xml:space="preserve">Under 30 000 kroner</w:t>
+      </w:r>
+    </w:p>
+    <w:p>
+      <w:pPr>
+        <w:keepNext w:val="false"/>
+        <w:spacing w:after="30"/>
+        <w:ind w:left="420"/>
+      </w:pPr>
+      <w:r>
+        <w:t xml:space="preserve">Omtrent 3 000 kroner</w:t>
+      </w:r>
+    </w:p>
+    <w:p>
+      <w:pPr>
+        <w:keepNext/>
+        <w:spacing w:after="60" w:before="180"/>
+      </w:pPr>
+      <w:r>
+        <w:rPr>
+          <w:b/>
+          <w:bCs/>
+        </w:rPr>
+        <w:t xml:space="preserve">269. Hva betyr det å være myndig?</w:t>
+      </w:r>
+    </w:p>
+    <w:p>
+      <w:pPr>
+        <w:keepNext/>
+        <w:spacing w:after="30"/>
+        <w:ind w:left="420"/>
+      </w:pPr>
+      <w:r>
+        <w:t xml:space="preserve">Du bestemmer selv over livet og pengene dine</w:t>
+      </w:r>
+    </w:p>
+    <w:p>
+      <w:pPr>
+        <w:keepNext/>
+        <w:spacing w:after="30"/>
+        <w:ind w:left="420"/>
+      </w:pPr>
+      <w:r>
+        <w:t xml:space="preserve">Du må begynne å jobbe full tid</w:t>
+      </w:r>
+    </w:p>
+    <w:p>
+      <w:pPr>
+        <w:keepNext w:val="false"/>
+        <w:spacing w:after="30"/>
+        <w:ind w:left="420"/>
+      </w:pPr>
+      <w:r>
+        <w:t xml:space="preserve">Du må bo hjemme hos foreldrene</w:t>
+      </w:r>
+    </w:p>
+    <w:p>
+      <w:pPr>
+        <w:keepNext/>
+        <w:spacing w:after="60" w:before="180"/>
+      </w:pPr>
+      <w:r>
+        <w:rPr>
+          <w:b/>
+          <w:bCs/>
+        </w:rPr>
+        <w:t xml:space="preserve">270. Når blir en person myndig i Norge?</w:t>
+      </w:r>
+    </w:p>
+    <w:p>
+      <w:pPr>
+        <w:keepNext/>
+        <w:spacing w:after="30"/>
+        <w:ind w:left="420"/>
+      </w:pPr>
+      <w:r>
+        <w:t xml:space="preserve">Når personen er 18 år</w:t>
+      </w:r>
+    </w:p>
+    <w:p>
+      <w:pPr>
+        <w:keepNext/>
+        <w:spacing w:after="30"/>
+        <w:ind w:left="420"/>
+      </w:pPr>
+      <w:r>
+        <w:t xml:space="preserve">Når personen er 16 år</w:t>
+      </w:r>
+    </w:p>
+    <w:p>
+      <w:pPr>
+        <w:keepNext w:val="false"/>
+        <w:spacing w:after="30"/>
+        <w:ind w:left="420"/>
+      </w:pPr>
+      <w:r>
+        <w:t xml:space="preserve">Når personen er 21 år</w:t>
+      </w:r>
+    </w:p>
+    <w:p>
+      <w:pPr>
+        <w:keepNext/>
+        <w:spacing w:after="60" w:before="180"/>
+      </w:pPr>
+      <w:r>
+        <w:rPr>
+          <w:b/>
+          <w:bCs/>
+        </w:rPr>
+        <w:t xml:space="preserve">271. Hvem har ansvar for barn under 18 år?</w:t>
+      </w:r>
+    </w:p>
+    <w:p>
+      <w:pPr>
+        <w:keepNext/>
+        <w:spacing w:after="30"/>
+        <w:ind w:left="420"/>
+      </w:pPr>
+      <w:r>
+        <w:t xml:space="preserve">Foreldrene</w:t>
+      </w:r>
+    </w:p>
+    <w:p>
+      <w:pPr>
+        <w:keepNext/>
+        <w:spacing w:after="30"/>
+        <w:ind w:left="420"/>
+      </w:pPr>
+      <w:r>
+        <w:t xml:space="preserve">Barna selv</w:t>
+      </w:r>
+    </w:p>
+    <w:p>
+      <w:pPr>
+        <w:keepNext w:val="false"/>
+        <w:spacing w:after="30"/>
+        <w:ind w:left="420"/>
+      </w:pPr>
+      <w:r>
+        <w:t xml:space="preserve">Skolen</w:t>
+      </w:r>
+    </w:p>
+    <w:p>
+      <w:pPr>
+        <w:keepNext/>
+        <w:spacing w:after="60" w:before="180"/>
+      </w:pPr>
+      <w:r>
+        <w:rPr>
+          <w:b/>
+          <w:bCs/>
+        </w:rPr>
+        <w:t xml:space="preserve">272. Hvor gamle er mange nordmenn når de gifter seg?</w:t>
+      </w:r>
+    </w:p>
+    <w:p>
+      <w:pPr>
+        <w:keepNext/>
+        <w:spacing w:after="30"/>
+        <w:ind w:left="420"/>
+      </w:pPr>
+      <w:r>
+        <w:t xml:space="preserve">Mellom 30 og 40 år gamle</w:t>
+      </w:r>
+    </w:p>
+    <w:p>
+      <w:pPr>
+        <w:keepNext/>
+        <w:spacing w:after="30"/>
+        <w:ind w:left="420"/>
+      </w:pPr>
+      <w:r>
+        <w:t xml:space="preserve">Mellom 18 og 20 år gamle</w:t>
+      </w:r>
+    </w:p>
+    <w:p>
+      <w:pPr>
+        <w:keepNext w:val="false"/>
+        <w:spacing w:after="30"/>
+        <w:ind w:left="420"/>
+      </w:pPr>
+      <w:r>
+        <w:t xml:space="preserve">Mellom 50 og 60 år gamle</w:t>
+      </w:r>
+    </w:p>
+    <w:p>
+      <w:pPr>
+        <w:keepNext/>
+        <w:spacing w:after="60" w:before="180"/>
+      </w:pPr>
+      <w:r>
+        <w:rPr>
+          <w:b/>
+          <w:bCs/>
+        </w:rPr>
+        <w:t xml:space="preserve">273. Hva betyr det å være samboer?</w:t>
+      </w:r>
+    </w:p>
+    <w:p>
+      <w:pPr>
+        <w:keepNext/>
+        <w:spacing w:after="30"/>
+        <w:ind w:left="420"/>
+      </w:pPr>
+      <w:r>
+        <w:t xml:space="preserve">Å bo sammen som par uten å være gift</w:t>
+      </w:r>
+    </w:p>
+    <w:p>
+      <w:pPr>
+        <w:keepNext/>
+        <w:spacing w:after="30"/>
+        <w:ind w:left="420"/>
+      </w:pPr>
+      <w:r>
+        <w:t xml:space="preserve">Å bo sammen med foreldrene som voksen</w:t>
+      </w:r>
+    </w:p>
+    <w:p>
+      <w:pPr>
+        <w:keepNext w:val="false"/>
+        <w:spacing w:after="30"/>
+        <w:ind w:left="420"/>
+      </w:pPr>
+      <w:r>
+        <w:t xml:space="preserve">Å bo sammen med en venn for å spare penger</w:t>
+      </w:r>
+    </w:p>
+    <w:p>
+      <w:pPr>
+        <w:keepNext/>
+        <w:spacing w:after="60" w:before="180"/>
+      </w:pPr>
+      <w:r>
+        <w:rPr>
+          <w:b/>
+          <w:bCs/>
+        </w:rPr>
+        <w:t xml:space="preserve">274. Hva er skilsmisse?</w:t>
+      </w:r>
+    </w:p>
+    <w:p>
+      <w:pPr>
+        <w:keepNext/>
+        <w:spacing w:after="30"/>
+        <w:ind w:left="420"/>
+      </w:pPr>
+      <w:r>
+        <w:t xml:space="preserve">Når et gift par avslutter ekteskapet</w:t>
+      </w:r>
+    </w:p>
+    <w:p>
+      <w:pPr>
+        <w:keepNext/>
+        <w:spacing w:after="30"/>
+        <w:ind w:left="420"/>
+      </w:pPr>
+      <w:r>
+        <w:t xml:space="preserve">Når et par flytter sammen uten å gifte seg</w:t>
+      </w:r>
+    </w:p>
+    <w:p>
+      <w:pPr>
+        <w:keepNext w:val="false"/>
+        <w:spacing w:after="30"/>
+        <w:ind w:left="420"/>
+      </w:pPr>
+      <w:r>
+        <w:t xml:space="preserve">Når et par får et barn og blir foreldre</w:t>
+      </w:r>
+    </w:p>
+    <w:p>
+      <w:pPr>
+        <w:keepNext/>
+        <w:spacing w:after="60" w:before="180"/>
+      </w:pPr>
+      <w:r>
+        <w:rPr>
+          <w:b/>
+          <w:bCs/>
+        </w:rPr>
+        <w:t xml:space="preserve">275. Hva betyr likestilling?</w:t>
+      </w:r>
+    </w:p>
+    <w:p>
+      <w:pPr>
+        <w:keepNext/>
+        <w:spacing w:after="30"/>
+        <w:ind w:left="420"/>
+      </w:pPr>
+      <w:r>
+        <w:t xml:space="preserve">Kvinner og menn har samme rettigheter og muligheter</w:t>
+      </w:r>
+    </w:p>
+    <w:p>
+      <w:pPr>
+        <w:keepNext/>
+        <w:spacing w:after="30"/>
+        <w:ind w:left="420"/>
+      </w:pPr>
+      <w:r>
+        <w:t xml:space="preserve">Kvinner og menn må gjøre det samme arbeidet</w:t>
+      </w:r>
+    </w:p>
+    <w:p>
+      <w:pPr>
+        <w:keepNext w:val="false"/>
+        <w:spacing w:after="30"/>
+        <w:ind w:left="420"/>
+      </w:pPr>
+      <w:r>
+        <w:t xml:space="preserve">Kvinner og menn må være like gamle</w:t>
+      </w:r>
+    </w:p>
+    <w:p>
+      <w:pPr>
+        <w:keepNext/>
+        <w:spacing w:after="60" w:before="180"/>
+      </w:pPr>
+      <w:r>
+        <w:rPr>
+          <w:b/>
+          <w:bCs/>
+        </w:rPr>
+        <w:t xml:space="preserve">276. Hva er et boliglån?</w:t>
+      </w:r>
+    </w:p>
+    <w:p>
+      <w:pPr>
+        <w:keepNext/>
+        <w:spacing w:after="30"/>
+        <w:ind w:left="420"/>
+      </w:pPr>
+      <w:r>
+        <w:t xml:space="preserve">Penger fra banken som du bruker til å kjøpe bolig</w:t>
+      </w:r>
+    </w:p>
+    <w:p>
+      <w:pPr>
+        <w:keepNext/>
+        <w:spacing w:after="30"/>
+        <w:ind w:left="420"/>
+      </w:pPr>
+      <w:r>
+        <w:t xml:space="preserve">Penger fra staten som du får når du flytter</w:t>
+      </w:r>
+    </w:p>
+    <w:p>
+      <w:pPr>
+        <w:keepNext w:val="false"/>
+        <w:spacing w:after="30"/>
+        <w:ind w:left="420"/>
+      </w:pPr>
+      <w:r>
+        <w:t xml:space="preserve">Penger som du betaler til utleier hver måned</w:t>
+      </w:r>
+    </w:p>
+    <w:p>
+      <w:pPr>
+        <w:keepNext/>
+        <w:spacing w:after="60" w:before="180"/>
+      </w:pPr>
+      <w:r>
+        <w:rPr>
+          <w:b/>
+          <w:bCs/>
+        </w:rPr>
+        <w:t xml:space="preserve">277. Hvor mye gjeld tar mange med seg når de kjøper bolig?</w:t>
+      </w:r>
+    </w:p>
+    <w:p>
+      <w:pPr>
+        <w:keepNext/>
+        <w:spacing w:after="30"/>
+        <w:ind w:left="420"/>
+      </w:pPr>
+      <w:r>
+        <w:t xml:space="preserve">Over to millioner kroner</w:t>
+      </w:r>
+    </w:p>
+    <w:p>
+      <w:pPr>
+        <w:keepNext/>
+        <w:spacing w:after="30"/>
+        <w:ind w:left="420"/>
+      </w:pPr>
+      <w:r>
+        <w:t xml:space="preserve">Omtrent 200 000 kroner til hver bolig</w:t>
+      </w:r>
+    </w:p>
+    <w:p>
+      <w:pPr>
+        <w:keepNext w:val="false"/>
+        <w:spacing w:after="30"/>
+        <w:ind w:left="420"/>
+      </w:pPr>
+      <w:r>
+        <w:t xml:space="preserve">Omtrent 20 000 kroner til hver bolig</w:t>
+      </w:r>
+    </w:p>
+    <w:p>
+      <w:pPr>
+        <w:keepNext/>
+        <w:spacing w:after="60" w:before="180"/>
+      </w:pPr>
+      <w:r>
+        <w:rPr>
+          <w:b/>
+          <w:bCs/>
+        </w:rPr>
+        <w:t xml:space="preserve">278. Hvilken etat betaler ut pensjon fra folketrygden?</w:t>
+      </w:r>
+    </w:p>
+    <w:p>
+      <w:pPr>
+        <w:keepNext/>
+        <w:spacing w:after="30"/>
+        <w:ind w:left="420"/>
+      </w:pPr>
+      <w:r>
+        <w:t xml:space="preserve">Nav</w:t>
+      </w:r>
+    </w:p>
+    <w:p>
+      <w:pPr>
+        <w:keepNext/>
+        <w:spacing w:after="30"/>
+        <w:ind w:left="420"/>
+      </w:pPr>
+      <w:r>
+        <w:t xml:space="preserve">Lånekassen</w:t>
+      </w:r>
+    </w:p>
+    <w:p>
+      <w:pPr>
+        <w:keepNext w:val="false"/>
+        <w:spacing w:after="30"/>
+        <w:ind w:left="420"/>
+      </w:pPr>
+      <w:r>
+        <w:t xml:space="preserve">Skatteetaten</w:t>
+      </w:r>
+    </w:p>
+    <w:p>
+      <w:pPr>
+        <w:keepNext/>
+        <w:spacing w:after="60" w:before="180"/>
+      </w:pPr>
+      <w:r>
+        <w:rPr>
+          <w:b/>
+          <w:bCs/>
+        </w:rPr>
+        <w:t xml:space="preserve">279. Hvor gamle er mange nordmenn når de slutter å jobbe?</w:t>
+      </w:r>
+    </w:p>
+    <w:p>
+      <w:pPr>
+        <w:keepNext/>
+        <w:spacing w:after="30"/>
+        <w:ind w:left="420"/>
+      </w:pPr>
+      <w:r>
+        <w:t xml:space="preserve">Omtrent 67 år gamle</w:t>
+      </w:r>
+    </w:p>
+    <w:p>
+      <w:pPr>
+        <w:keepNext/>
+        <w:spacing w:after="30"/>
+        <w:ind w:left="420"/>
+      </w:pPr>
+      <w:r>
+        <w:t xml:space="preserve">Omtrent 50 år gamle</w:t>
+      </w:r>
+    </w:p>
+    <w:p>
+      <w:pPr>
+        <w:keepNext w:val="false"/>
+        <w:spacing w:after="30"/>
+        <w:ind w:left="420"/>
+      </w:pPr>
+      <w:r>
+        <w:t xml:space="preserve">Omtrent 80 år gamle</w:t>
+      </w:r>
+    </w:p>
+    <w:p>
+      <w:pPr>
+        <w:keepNext/>
+        <w:spacing w:after="60" w:before="180"/>
+      </w:pPr>
+      <w:r>
+        <w:rPr>
+          <w:b/>
+          <w:bCs/>
+        </w:rPr>
+        <w:t xml:space="preserve">280. Hva er kremasjon?</w:t>
+      </w:r>
+    </w:p>
+    <w:p>
+      <w:pPr>
+        <w:keepNext/>
+        <w:spacing w:after="30"/>
+        <w:ind w:left="420"/>
+      </w:pPr>
+      <w:r>
+        <w:t xml:space="preserve">Når en død person blir brent</w:t>
+      </w:r>
+    </w:p>
+    <w:p>
+      <w:pPr>
+        <w:keepNext/>
+        <w:spacing w:after="30"/>
+        <w:ind w:left="420"/>
+      </w:pPr>
+      <w:r>
+        <w:t xml:space="preserve">Når en død person blir lagt i jorden</w:t>
+      </w:r>
+    </w:p>
+    <w:p>
+      <w:pPr>
+        <w:keepNext w:val="false"/>
+        <w:spacing w:after="30"/>
+        <w:ind w:left="420"/>
+      </w:pPr>
+      <w:r>
+        <w:t xml:space="preserve">Når en død person blir sendt til hjemlandet</w:t>
+      </w:r>
+    </w:p>
+    <w:p>
+      <w:pPr>
+        <w:keepNext/>
+        <w:spacing w:after="60" w:before="180"/>
+      </w:pPr>
+      <w:r>
+        <w:rPr>
+          <w:b/>
+          <w:bCs/>
+        </w:rPr>
+        <w:t xml:space="preserve">281. Hva er arv?</w:t>
+      </w:r>
+    </w:p>
+    <w:p>
+      <w:pPr>
+        <w:keepNext/>
+        <w:spacing w:after="30"/>
+        <w:ind w:left="420"/>
+      </w:pPr>
+      <w:r>
+        <w:t xml:space="preserve">Penger og ting du får når et familiemedlem dør</w:t>
+      </w:r>
+    </w:p>
+    <w:p>
+      <w:pPr>
+        <w:keepNext/>
+        <w:spacing w:after="30"/>
+        <w:ind w:left="420"/>
+      </w:pPr>
+      <w:r>
+        <w:t xml:space="preserve">Penger du får når du gifter deg med noen</w:t>
+      </w:r>
+    </w:p>
+    <w:p>
+      <w:pPr>
+        <w:keepNext w:val="false"/>
+        <w:spacing w:after="30"/>
+        <w:ind w:left="420"/>
+      </w:pPr>
+      <w:r>
+        <w:t xml:space="preserve">Penger du får fra staten når du fyller 18 år og blir myndig</w:t>
+      </w:r>
+    </w:p>
+    <w:p>
+      <w:pPr>
+        <w:keepNext/>
+        <w:spacing w:after="60" w:before="180"/>
+      </w:pPr>
+      <w:r>
+        <w:rPr>
+          <w:b/>
+          <w:bCs/>
+        </w:rPr>
+        <w:t xml:space="preserve">282. Hva er et testament?</w:t>
+      </w:r>
+    </w:p>
+    <w:p>
+      <w:pPr>
+        <w:keepNext/>
+        <w:spacing w:after="30"/>
+        <w:ind w:left="420"/>
+      </w:pPr>
+      <w:r>
+        <w:t xml:space="preserve">Et dokument om hvem som skal arve etter en person</w:t>
+      </w:r>
+    </w:p>
+    <w:p>
+      <w:pPr>
+        <w:keepNext/>
+        <w:spacing w:after="30"/>
+        <w:ind w:left="420"/>
+      </w:pPr>
+      <w:r>
+        <w:t xml:space="preserve">Et dokument om hvem som eier en bolig</w:t>
+      </w:r>
+    </w:p>
+    <w:p>
+      <w:pPr>
+        <w:keepNext w:val="false"/>
+        <w:spacing w:after="30"/>
+        <w:ind w:left="420"/>
+      </w:pPr>
+      <w:r>
+        <w:t xml:space="preserve">Et dokument om hvem som er gift med hvem</w:t>
+      </w:r>
+    </w:p>
+    <w:p>
+      <w:pPr>
+        <w:keepNext/>
+        <w:spacing w:after="60" w:before="180"/>
+      </w:pPr>
+      <w:r>
+        <w:rPr>
+          <w:b/>
+          <w:bCs/>
+        </w:rPr>
+        <w:t xml:space="preserve">283. Hva er en innvandrer?</w:t>
+      </w:r>
+    </w:p>
+    <w:p>
+      <w:pPr>
+        <w:keepNext/>
+        <w:spacing w:after="30"/>
+        <w:ind w:left="420"/>
+      </w:pPr>
+      <w:r>
+        <w:t xml:space="preserve">En person som har flyttet til Norge fra et annet land</w:t>
+      </w:r>
+    </w:p>
+    <w:p>
+      <w:pPr>
+        <w:keepNext/>
+        <w:spacing w:after="30"/>
+        <w:ind w:left="420"/>
+      </w:pPr>
+      <w:r>
+        <w:t xml:space="preserve">En person som er på ferie hos familie i Norge i to uker</w:t>
+      </w:r>
+    </w:p>
+    <w:p>
+      <w:pPr>
+        <w:keepNext w:val="false"/>
+        <w:spacing w:after="30"/>
+        <w:ind w:left="420"/>
+      </w:pPr>
+      <w:r>
+        <w:t xml:space="preserve">En person som er født og oppvokst i Norge</w:t>
+      </w:r>
+    </w:p>
+    <w:p>
+      <w:pPr>
+        <w:keepNext/>
+        <w:spacing w:after="60" w:before="180"/>
+      </w:pPr>
+      <w:r>
+        <w:rPr>
+          <w:b/>
+          <w:bCs/>
+        </w:rPr>
+        <w:t xml:space="preserve">284. Hva betyr ordet «oppholdstillatelse»?</w:t>
+      </w:r>
+    </w:p>
+    <w:p>
+      <w:pPr>
+        <w:keepNext/>
+        <w:spacing w:after="30"/>
+        <w:ind w:left="420"/>
+      </w:pPr>
+      <w:r>
+        <w:t xml:space="preserve">En tillatelse til å bo i Norge</w:t>
+      </w:r>
+    </w:p>
+    <w:p>
+      <w:pPr>
+        <w:keepNext/>
+        <w:spacing w:after="30"/>
+        <w:ind w:left="420"/>
+      </w:pPr>
+      <w:r>
+        <w:t xml:space="preserve">En tillatelse til å kjøre bil i Norge</w:t>
+      </w:r>
+    </w:p>
+    <w:p>
+      <w:pPr>
+        <w:keepNext w:val="false"/>
+        <w:spacing w:after="30"/>
+        <w:ind w:left="420"/>
+      </w:pPr>
+      <w:r>
+        <w:t xml:space="preserve">En tillatelse til å jobbe på sykehus</w:t>
+      </w:r>
+    </w:p>
+    <w:p>
+      <w:pPr>
+        <w:keepNext/>
+        <w:spacing w:after="60" w:before="180"/>
+      </w:pPr>
+      <w:r>
+        <w:rPr>
+          <w:b/>
+          <w:bCs/>
+        </w:rPr>
+        <w:t xml:space="preserve">285. Hvem behandler søknader om oppholdstillatelse i Norge?</w:t>
+      </w:r>
+    </w:p>
+    <w:p>
+      <w:pPr>
+        <w:keepNext/>
+        <w:spacing w:after="30"/>
+        <w:ind w:left="420"/>
+      </w:pPr>
+      <w:r>
+        <w:t xml:space="preserve">Utlendingsdirektoratet (UDI)</w:t>
+      </w:r>
+    </w:p>
+    <w:p>
+      <w:pPr>
+        <w:keepNext/>
+        <w:spacing w:after="30"/>
+        <w:ind w:left="420"/>
+      </w:pPr>
+      <w:r>
+        <w:t xml:space="preserve">Arbeids- og velferdsetaten (Nav)</w:t>
+      </w:r>
+    </w:p>
+    <w:p>
+      <w:pPr>
+        <w:keepNext w:val="false"/>
+        <w:spacing w:after="30"/>
+        <w:ind w:left="420"/>
+      </w:pPr>
+      <w:r>
+        <w:t xml:space="preserve">Integrerings- og mangfoldsdirektoratet (IMDi)</w:t>
+      </w:r>
+    </w:p>
+    <w:p>
+      <w:pPr>
+        <w:keepNext/>
+        <w:spacing w:after="60" w:before="180"/>
+      </w:pPr>
+      <w:r>
+        <w:rPr>
+          <w:b/>
+          <w:bCs/>
+        </w:rPr>
+        <w:t xml:space="preserve">286. Hva er nettsiden til UDI?</w:t>
+      </w:r>
+    </w:p>
+    <w:p>
+      <w:pPr>
+        <w:keepNext/>
+        <w:spacing w:after="30"/>
+        <w:ind w:left="420"/>
+      </w:pPr>
+      <w:r>
+        <w:t xml:space="preserve">udi.no</w:t>
+      </w:r>
+    </w:p>
+    <w:p>
+      <w:pPr>
+        <w:keepNext/>
+        <w:spacing w:after="30"/>
+        <w:ind w:left="420"/>
+      </w:pPr>
+      <w:r>
+        <w:t xml:space="preserve">nav.no</w:t>
+      </w:r>
+    </w:p>
+    <w:p>
+      <w:pPr>
+        <w:keepNext w:val="false"/>
+        <w:spacing w:after="30"/>
+        <w:ind w:left="420"/>
+      </w:pPr>
+      <w:r>
+        <w:t xml:space="preserve">skatteetaten.no</w:t>
+      </w:r>
+    </w:p>
+    <w:p>
+      <w:pPr>
+        <w:keepNext/>
+        <w:spacing w:after="60" w:before="180"/>
+      </w:pPr>
+      <w:r>
+        <w:rPr>
+          <w:b/>
+          <w:bCs/>
+        </w:rPr>
+        <w:t xml:space="preserve">287. Hvor registrerer borgere fra EU og EØS seg når de flytter til Norge?</w:t>
+      </w:r>
+    </w:p>
+    <w:p>
+      <w:pPr>
+        <w:keepNext/>
+        <w:spacing w:after="30"/>
+        <w:ind w:left="420"/>
+      </w:pPr>
+      <w:r>
+        <w:t xml:space="preserve">Hos politiet</w:t>
+      </w:r>
+    </w:p>
+    <w:p>
+      <w:pPr>
+        <w:keepNext/>
+        <w:spacing w:after="30"/>
+        <w:ind w:left="420"/>
+      </w:pPr>
+      <w:r>
+        <w:t xml:space="preserve">Hos Nav</w:t>
+      </w:r>
+    </w:p>
+    <w:p>
+      <w:pPr>
+        <w:keepNext w:val="false"/>
+        <w:spacing w:after="30"/>
+        <w:ind w:left="420"/>
+      </w:pPr>
+      <w:r>
+        <w:t xml:space="preserve">Hos kommunen</w:t>
+      </w:r>
+    </w:p>
+    <w:p>
+      <w:pPr>
+        <w:keepNext/>
+        <w:spacing w:after="60" w:before="180"/>
+      </w:pPr>
+      <w:r>
+        <w:rPr>
+          <w:b/>
+          <w:bCs/>
+        </w:rPr>
+        <w:t xml:space="preserve">288. Hva er en midlertidig oppholdstillatelse?</w:t>
+      </w:r>
+    </w:p>
+    <w:p>
+      <w:pPr>
+        <w:keepNext/>
+        <w:spacing w:after="30"/>
+        <w:ind w:left="420"/>
+      </w:pPr>
+      <w:r>
+        <w:t xml:space="preserve">En tillatelse som varer en periode, og du må søke på nytt</w:t>
+      </w:r>
+    </w:p>
+    <w:p>
+      <w:pPr>
+        <w:keepNext/>
+        <w:spacing w:after="30"/>
+        <w:ind w:left="420"/>
+      </w:pPr>
+      <w:r>
+        <w:t xml:space="preserve">En tillatelse som du får for resten av livet</w:t>
+      </w:r>
+    </w:p>
+    <w:p>
+      <w:pPr>
+        <w:keepNext w:val="false"/>
+        <w:spacing w:after="30"/>
+        <w:ind w:left="420"/>
+      </w:pPr>
+      <w:r>
+        <w:t xml:space="preserve">En tillatelse som du får som turist</w:t>
+      </w:r>
+    </w:p>
+    <w:p>
+      <w:pPr>
+        <w:keepNext/>
+        <w:spacing w:after="60" w:before="180"/>
+      </w:pPr>
+      <w:r>
+        <w:rPr>
+          <w:b/>
+          <w:bCs/>
+        </w:rPr>
+        <w:t xml:space="preserve">289. Hva betyr permanent oppholdstillatelse?</w:t>
+      </w:r>
+    </w:p>
+    <w:p>
+      <w:pPr>
+        <w:keepNext/>
+        <w:spacing w:after="30"/>
+        <w:ind w:left="420"/>
+      </w:pPr>
+      <w:r>
+        <w:t xml:space="preserve">Du kan bo i Norge uten å søke om ny tillatelse</w:t>
+      </w:r>
+    </w:p>
+    <w:p>
+      <w:pPr>
+        <w:keepNext/>
+        <w:spacing w:after="30"/>
+        <w:ind w:left="420"/>
+      </w:pPr>
+      <w:r>
+        <w:t xml:space="preserve">Du har fått norsk pass og norsk statsborgerskap</w:t>
+      </w:r>
+    </w:p>
+    <w:p>
+      <w:pPr>
+        <w:keepNext w:val="false"/>
+        <w:spacing w:after="30"/>
+        <w:ind w:left="420"/>
+      </w:pPr>
+      <w:r>
+        <w:t xml:space="preserve">Du må søke om ny tillatelse hvert år</w:t>
+      </w:r>
+    </w:p>
+    <w:p>
+      <w:pPr>
+        <w:keepNext/>
+        <w:spacing w:after="60" w:before="180"/>
+      </w:pPr>
+      <w:r>
+        <w:rPr>
+          <w:b/>
+          <w:bCs/>
+        </w:rPr>
+        <w:t xml:space="preserve">290. Hva er et statsborgerskap?</w:t>
+      </w:r>
+    </w:p>
+    <w:p>
+      <w:pPr>
+        <w:keepNext/>
+        <w:spacing w:after="30"/>
+        <w:ind w:left="420"/>
+      </w:pPr>
+      <w:r>
+        <w:t xml:space="preserve">Du tilhører et land og har rettigheter og plikter der</w:t>
+      </w:r>
+    </w:p>
+    <w:p>
+      <w:pPr>
+        <w:keepNext/>
+        <w:spacing w:after="30"/>
+        <w:ind w:left="420"/>
+      </w:pPr>
+      <w:r>
+        <w:t xml:space="preserve">Du har lov til å besøke et land som turist i tre måneder</w:t>
+      </w:r>
+    </w:p>
+    <w:p>
+      <w:pPr>
+        <w:keepNext w:val="false"/>
+        <w:spacing w:after="30"/>
+        <w:ind w:left="420"/>
+      </w:pPr>
+      <w:r>
+        <w:t xml:space="preserve">Du har lov til å jobbe i et land i ett år</w:t>
+      </w:r>
+    </w:p>
+    <w:p>
+      <w:pPr>
+        <w:keepNext/>
+        <w:spacing w:after="60" w:before="180"/>
+      </w:pPr>
+      <w:r>
+        <w:rPr>
+          <w:b/>
+          <w:bCs/>
+        </w:rPr>
+        <w:t xml:space="preserve">291. Hva er en flyktning?</w:t>
+      </w:r>
+    </w:p>
+    <w:p>
+      <w:pPr>
+        <w:keepNext/>
+        <w:spacing w:after="30"/>
+        <w:ind w:left="420"/>
+      </w:pPr>
+      <w:r>
+        <w:t xml:space="preserve">En person som må forlate landet sitt fordi livet er i fare</w:t>
+      </w:r>
+    </w:p>
+    <w:p>
+      <w:pPr>
+        <w:keepNext/>
+        <w:spacing w:after="30"/>
+        <w:ind w:left="420"/>
+      </w:pPr>
+      <w:r>
+        <w:t xml:space="preserve">En person som flytter til et nytt land for å jobbe</w:t>
+      </w:r>
+    </w:p>
+    <w:p>
+      <w:pPr>
+        <w:keepNext w:val="false"/>
+        <w:spacing w:after="30"/>
+        <w:ind w:left="420"/>
+      </w:pPr>
+      <w:r>
+        <w:t xml:space="preserve">En person som flytter til et nytt land for å studere</w:t>
+      </w:r>
+    </w:p>
+    <w:p>
+      <w:pPr>
+        <w:keepNext/>
+        <w:spacing w:after="60" w:before="180"/>
+      </w:pPr>
+      <w:r>
+        <w:rPr>
+          <w:b/>
+          <w:bCs/>
+        </w:rPr>
+        <w:t xml:space="preserve">292. Hva er en arbeidsinnvandrer?</w:t>
+      </w:r>
+    </w:p>
+    <w:p>
+      <w:pPr>
+        <w:keepNext/>
+        <w:spacing w:after="30"/>
+        <w:ind w:left="420"/>
+      </w:pPr>
+      <w:r>
+        <w:t xml:space="preserve">En person som flytter til Norge for å jobbe</w:t>
+      </w:r>
+    </w:p>
+    <w:p>
+      <w:pPr>
+        <w:keepNext/>
+        <w:spacing w:after="30"/>
+        <w:ind w:left="420"/>
+      </w:pPr>
+      <w:r>
+        <w:t xml:space="preserve">En person som får hjelp av FN til å flytte</w:t>
+      </w:r>
+    </w:p>
+    <w:p>
+      <w:pPr>
+        <w:keepNext w:val="false"/>
+        <w:spacing w:after="30"/>
+        <w:ind w:left="420"/>
+      </w:pPr>
+      <w:r>
+        <w:t xml:space="preserve">En person som flytter for å være sammen med familie</w:t>
+      </w:r>
+    </w:p>
+    <w:p>
+      <w:pPr>
+        <w:keepNext/>
+        <w:spacing w:after="60" w:before="180"/>
+      </w:pPr>
+      <w:r>
+        <w:rPr>
+          <w:b/>
+          <w:bCs/>
+        </w:rPr>
+        <w:t xml:space="preserve">293. Hva er en asylsøker?</w:t>
+      </w:r>
+    </w:p>
+    <w:p>
+      <w:pPr>
+        <w:keepNext/>
+        <w:spacing w:after="30"/>
+        <w:ind w:left="420"/>
+      </w:pPr>
+      <w:r>
+        <w:t xml:space="preserve">En person som har søkt om beskyttelse og venter på svar</w:t>
+      </w:r>
+    </w:p>
+    <w:p>
+      <w:pPr>
+        <w:keepNext/>
+        <w:spacing w:after="30"/>
+        <w:ind w:left="420"/>
+      </w:pPr>
+      <w:r>
+        <w:t xml:space="preserve">En person som har fått norsk statsborgerskap for noen år siden</w:t>
+      </w:r>
+    </w:p>
+    <w:p>
+      <w:pPr>
+        <w:keepNext w:val="false"/>
+        <w:spacing w:after="30"/>
+        <w:ind w:left="420"/>
+      </w:pPr>
+      <w:r>
+        <w:t xml:space="preserve">En person som jobber for UDI og behandler saker</w:t>
+      </w:r>
+    </w:p>
+    <w:p>
+      <w:pPr>
+        <w:keepNext/>
+        <w:spacing w:after="60" w:before="180"/>
+      </w:pPr>
+      <w:r>
+        <w:rPr>
+          <w:b/>
+          <w:bCs/>
+        </w:rPr>
+        <w:t xml:space="preserve">294. Hva er asyl?</w:t>
+      </w:r>
+    </w:p>
+    <w:p>
+      <w:pPr>
+        <w:keepNext/>
+        <w:spacing w:after="30"/>
+        <w:ind w:left="420"/>
+      </w:pPr>
+      <w:r>
+        <w:t xml:space="preserve">Beskyttelse for en person som er forfulgt i hjemlandet</w:t>
+      </w:r>
+    </w:p>
+    <w:p>
+      <w:pPr>
+        <w:keepNext/>
+        <w:spacing w:after="30"/>
+        <w:ind w:left="420"/>
+      </w:pPr>
+      <w:r>
+        <w:t xml:space="preserve">Tillatelse til å jobbe i Norge i ett år</w:t>
+      </w:r>
+    </w:p>
+    <w:p>
+      <w:pPr>
+        <w:keepNext w:val="false"/>
+        <w:spacing w:after="30"/>
+        <w:ind w:left="420"/>
+      </w:pPr>
+      <w:r>
+        <w:t xml:space="preserve">Tillatelse til å besøke familie i Norge</w:t>
+      </w:r>
+    </w:p>
+    <w:p>
+      <w:pPr>
+        <w:keepNext/>
+        <w:spacing w:after="60" w:before="180"/>
+      </w:pPr>
+      <w:r>
+        <w:rPr>
+          <w:b/>
+          <w:bCs/>
+        </w:rPr>
+        <w:t xml:space="preserve">295. Hvordan vurderer Norge en søknad om asyl?</w:t>
+      </w:r>
+    </w:p>
+    <w:p>
+      <w:pPr>
+        <w:keepNext/>
+        <w:spacing w:after="30"/>
+        <w:ind w:left="420"/>
+      </w:pPr>
+      <w:r>
+        <w:t xml:space="preserve">Hver søker får sin egen vurdering</w:t>
+      </w:r>
+    </w:p>
+    <w:p>
+      <w:pPr>
+        <w:keepNext/>
+        <w:spacing w:after="30"/>
+        <w:ind w:left="420"/>
+      </w:pPr>
+      <w:r>
+        <w:t xml:space="preserve">Familien får én felles vurdering</w:t>
+      </w:r>
+    </w:p>
+    <w:p>
+      <w:pPr>
+        <w:keepNext w:val="false"/>
+        <w:spacing w:after="30"/>
+        <w:ind w:left="420"/>
+      </w:pPr>
+      <w:r>
+        <w:t xml:space="preserve">Søkere fra samme land får samme svar</w:t>
+      </w:r>
+    </w:p>
+    <w:p>
+      <w:pPr>
+        <w:keepNext/>
+        <w:spacing w:after="60" w:before="180"/>
+      </w:pPr>
+      <w:r>
+        <w:rPr>
+          <w:b/>
+          <w:bCs/>
+        </w:rPr>
+        <w:t xml:space="preserve">296. Hvem er kvoteflyktninger?</w:t>
+      </w:r>
+    </w:p>
+    <w:p>
+      <w:pPr>
+        <w:keepNext/>
+        <w:spacing w:after="30"/>
+        <w:ind w:left="420"/>
+      </w:pPr>
+      <w:r>
+        <w:t xml:space="preserve">Flyktninger som er valgt ut før de kommer til Norge</w:t>
+      </w:r>
+    </w:p>
+    <w:p>
+      <w:pPr>
+        <w:keepNext/>
+        <w:spacing w:after="30"/>
+        <w:ind w:left="420"/>
+      </w:pPr>
+      <w:r>
+        <w:t xml:space="preserve">Flyktninger som kommer til den norske grensen på egen hånd</w:t>
+      </w:r>
+    </w:p>
+    <w:p>
+      <w:pPr>
+        <w:keepNext w:val="false"/>
+        <w:spacing w:after="30"/>
+        <w:ind w:left="420"/>
+      </w:pPr>
+      <w:r>
+        <w:t xml:space="preserve">Flyktninger som får jobb i Norge først</w:t>
+      </w:r>
+    </w:p>
+    <w:p>
+      <w:pPr>
+        <w:keepNext/>
+        <w:spacing w:after="60" w:before="180"/>
+      </w:pPr>
+      <w:r>
+        <w:rPr>
+          <w:b/>
+          <w:bCs/>
+        </w:rPr>
+        <w:t xml:space="preserve">297. Hvilken organisasjon hjelper Norge med å velge kvoteflyktninger?</w:t>
+      </w:r>
+    </w:p>
+    <w:p>
+      <w:pPr>
+        <w:keepNext/>
+        <w:spacing w:after="30"/>
+        <w:ind w:left="420"/>
+      </w:pPr>
+      <w:r>
+        <w:t xml:space="preserve">UNHCR, FNs flyktningorganisasjon</w:t>
+      </w:r>
+    </w:p>
+    <w:p>
+      <w:pPr>
+        <w:keepNext/>
+        <w:spacing w:after="30"/>
+        <w:ind w:left="420"/>
+      </w:pPr>
+      <w:r>
+        <w:t xml:space="preserve">NATO, en forsvarsorganisasjon</w:t>
+      </w:r>
+    </w:p>
+    <w:p>
+      <w:pPr>
+        <w:keepNext w:val="false"/>
+        <w:spacing w:after="30"/>
+        <w:ind w:left="420"/>
+      </w:pPr>
+      <w:r>
+        <w:t xml:space="preserve">EU, et samarbeid mellom europeiske land</w:t>
+      </w:r>
+    </w:p>
+    <w:p>
+      <w:pPr>
+        <w:keepNext/>
+        <w:spacing w:after="60" w:before="180"/>
+      </w:pPr>
+      <w:r>
+        <w:rPr>
+          <w:b/>
+          <w:bCs/>
+        </w:rPr>
+        <w:t xml:space="preserve">298. Hvilken tillatelse får kvoteflyktninger først?</w:t>
+      </w:r>
+    </w:p>
+    <w:p>
+      <w:pPr>
+        <w:keepNext/>
+        <w:spacing w:after="30"/>
+        <w:ind w:left="420"/>
+      </w:pPr>
+      <w:r>
+        <w:t xml:space="preserve">En midlertidig tillatelse</w:t>
+      </w:r>
+    </w:p>
+    <w:p>
+      <w:pPr>
+        <w:keepNext/>
+        <w:spacing w:after="30"/>
+        <w:ind w:left="420"/>
+      </w:pPr>
+      <w:r>
+        <w:t xml:space="preserve">En permanent tillatelse</w:t>
+      </w:r>
+    </w:p>
+    <w:p>
+      <w:pPr>
+        <w:keepNext w:val="false"/>
+        <w:spacing w:after="30"/>
+        <w:ind w:left="420"/>
+      </w:pPr>
+      <w:r>
+        <w:t xml:space="preserve">Norsk statsborgerskap</w:t>
+      </w:r>
+    </w:p>
+    <w:p>
+      <w:pPr>
+        <w:keepNext/>
+        <w:spacing w:after="60" w:before="180"/>
+      </w:pPr>
+      <w:r>
+        <w:rPr>
+          <w:b/>
+          <w:bCs/>
+        </w:rPr>
+        <w:t xml:space="preserve">299. Hva er familiegjenforening?</w:t>
+      </w:r>
+    </w:p>
+    <w:p>
+      <w:pPr>
+        <w:keepNext/>
+        <w:spacing w:after="30"/>
+        <w:ind w:left="420"/>
+      </w:pPr>
+      <w:r>
+        <w:t xml:space="preserve">Et familiemedlem får flytte til familie som bor i Norge</w:t>
+      </w:r>
+    </w:p>
+    <w:p>
+      <w:pPr>
+        <w:keepNext/>
+        <w:spacing w:after="30"/>
+        <w:ind w:left="420"/>
+      </w:pPr>
+      <w:r>
+        <w:t xml:space="preserve">En familie får lavere skatt de første årene i Norge</w:t>
+      </w:r>
+    </w:p>
+    <w:p>
+      <w:pPr>
+        <w:keepNext w:val="false"/>
+        <w:spacing w:after="30"/>
+        <w:ind w:left="420"/>
+      </w:pPr>
+      <w:r>
+        <w:t xml:space="preserve">En familie får gratis bolig fra kommunen</w:t>
+      </w:r>
+    </w:p>
+    <w:p>
+      <w:pPr>
+        <w:keepNext/>
+        <w:spacing w:after="60" w:before="180"/>
+      </w:pPr>
+      <w:r>
+        <w:rPr>
+          <w:b/>
+          <w:bCs/>
+        </w:rPr>
+        <w:t xml:space="preserve">300. Hva er introduksjonsprogrammet?</w:t>
+      </w:r>
+    </w:p>
+    <w:p>
+      <w:pPr>
+        <w:keepNext/>
+        <w:spacing w:after="30"/>
+        <w:ind w:left="420"/>
+      </w:pPr>
+      <w:r>
+        <w:t xml:space="preserve">Et opplæringstilbud for nyankomne flyktninger</w:t>
+      </w:r>
+    </w:p>
+    <w:p>
+      <w:pPr>
+        <w:keepNext/>
+        <w:spacing w:after="30"/>
+        <w:ind w:left="420"/>
+      </w:pPr>
+      <w:r>
+        <w:t xml:space="preserve">Et program på TV for nye innbyggere</w:t>
+      </w:r>
+    </w:p>
+    <w:p>
+      <w:pPr>
+        <w:keepNext w:val="false"/>
+        <w:spacing w:after="30"/>
+        <w:ind w:left="420"/>
+      </w:pPr>
+      <w:r>
+        <w:t xml:space="preserve">Et kurs for norske barn om andre land</w:t>
+      </w:r>
+    </w:p>
+    <w:p>
+      <w:pPr>
+        <w:keepNext/>
+        <w:spacing w:after="60" w:before="180"/>
+      </w:pPr>
+      <w:r>
+        <w:rPr>
+          <w:b/>
+          <w:bCs/>
+        </w:rPr>
+        <w:t xml:space="preserve">301. Hva er målet med introduksjonsprogrammet?</w:t>
+      </w:r>
+    </w:p>
+    <w:p>
+      <w:pPr>
+        <w:keepNext/>
+        <w:spacing w:after="30"/>
+        <w:ind w:left="420"/>
+      </w:pPr>
+      <w:r>
+        <w:t xml:space="preserve">Å lære norsk og komme i jobb eller utdanning</w:t>
+      </w:r>
+    </w:p>
+    <w:p>
+      <w:pPr>
+        <w:keepNext/>
+        <w:spacing w:after="30"/>
+        <w:ind w:left="420"/>
+      </w:pPr>
+      <w:r>
+        <w:t xml:space="preserve">Å få norsk pass og statsborgerskap så raskt som mulig</w:t>
+      </w:r>
+    </w:p>
+    <w:p>
+      <w:pPr>
+        <w:keepNext w:val="false"/>
+        <w:spacing w:after="30"/>
+        <w:ind w:left="420"/>
+      </w:pPr>
+      <w:r>
+        <w:t xml:space="preserve">Å finne en ny bolig i en annen kommune</w:t>
+      </w:r>
+    </w:p>
+    <w:p>
+      <w:pPr>
+        <w:keepNext/>
+        <w:spacing w:after="60" w:before="180"/>
+      </w:pPr>
+      <w:r>
+        <w:rPr>
+          <w:b/>
+          <w:bCs/>
+        </w:rPr>
+        <w:t xml:space="preserve">302. Hvem tilbyr introduksjonsprogram?</w:t>
+      </w:r>
+    </w:p>
+    <w:p>
+      <w:pPr>
+        <w:keepNext/>
+        <w:spacing w:after="30"/>
+        <w:ind w:left="420"/>
+      </w:pPr>
+      <w:r>
+        <w:t xml:space="preserve">Kommunen</w:t>
+      </w:r>
+    </w:p>
+    <w:p>
+      <w:pPr>
+        <w:keepNext/>
+        <w:spacing w:after="30"/>
+        <w:ind w:left="420"/>
+      </w:pPr>
+      <w:r>
+        <w:t xml:space="preserve">Arbeidsgiveren</w:t>
+      </w:r>
+    </w:p>
+    <w:p>
+      <w:pPr>
+        <w:keepNext w:val="false"/>
+        <w:spacing w:after="30"/>
+        <w:ind w:left="420"/>
+      </w:pPr>
+      <w:r>
+        <w:t xml:space="preserve">Politiet</w:t>
+      </w:r>
+    </w:p>
+    <w:p>
+      <w:pPr>
+        <w:keepNext/>
+        <w:spacing w:after="60" w:before="180"/>
+      </w:pPr>
+      <w:r>
+        <w:rPr>
+          <w:b/>
+          <w:bCs/>
+        </w:rPr>
+        <w:t xml:space="preserve">303. Hvem får tilbud om introduksjonsprogram?</w:t>
+      </w:r>
+    </w:p>
+    <w:p>
+      <w:pPr>
+        <w:keepNext/>
+        <w:spacing w:after="30"/>
+        <w:ind w:left="420"/>
+      </w:pPr>
+      <w:r>
+        <w:t xml:space="preserve">Flyktninger som har fått opphold</w:t>
+      </w:r>
+    </w:p>
+    <w:p>
+      <w:pPr>
+        <w:keepNext/>
+        <w:spacing w:after="30"/>
+        <w:ind w:left="420"/>
+      </w:pPr>
+      <w:r>
+        <w:t xml:space="preserve">Arbeidsinnvandrere fra EU</w:t>
+      </w:r>
+    </w:p>
+    <w:p>
+      <w:pPr>
+        <w:keepNext w:val="false"/>
+        <w:spacing w:after="30"/>
+        <w:ind w:left="420"/>
+      </w:pPr>
+      <w:r>
+        <w:t xml:space="preserve">Studenter fra utlandet</w:t>
+      </w:r>
+    </w:p>
+    <w:p>
+      <w:pPr>
+        <w:keepNext/>
+        <w:spacing w:after="60" w:before="180"/>
+      </w:pPr>
+      <w:r>
+        <w:rPr>
+          <w:b/>
+          <w:bCs/>
+        </w:rPr>
+        <w:t xml:space="preserve">304. Hvor lenge kan et introduksjonsprogram vare?</w:t>
+      </w:r>
+    </w:p>
+    <w:p>
+      <w:pPr>
+        <w:keepNext/>
+        <w:spacing w:after="30"/>
+        <w:ind w:left="420"/>
+      </w:pPr>
+      <w:r>
+        <w:t xml:space="preserve">Fra tre måneder til tre år</w:t>
+      </w:r>
+    </w:p>
+    <w:p>
+      <w:pPr>
+        <w:keepNext/>
+        <w:spacing w:after="30"/>
+        <w:ind w:left="420"/>
+      </w:pPr>
+      <w:r>
+        <w:t xml:space="preserve">Fra én uke til noen få måneder</w:t>
+      </w:r>
+    </w:p>
+    <w:p>
+      <w:pPr>
+        <w:keepNext w:val="false"/>
+        <w:spacing w:after="30"/>
+        <w:ind w:left="420"/>
+      </w:pPr>
+      <w:r>
+        <w:t xml:space="preserve">Fra fem år til ti år, hvis man ønsker det</w:t>
+      </w:r>
+    </w:p>
+    <w:p>
+      <w:pPr>
+        <w:keepNext/>
+        <w:spacing w:after="60" w:before="180"/>
+      </w:pPr>
+      <w:r>
+        <w:rPr>
+          <w:b/>
+          <w:bCs/>
+        </w:rPr>
+        <w:t xml:space="preserve">305. Hva får deltakere i introduksjonsprogrammet?</w:t>
+      </w:r>
+    </w:p>
+    <w:p>
+      <w:pPr>
+        <w:keepNext/>
+        <w:spacing w:after="30"/>
+        <w:ind w:left="420"/>
+      </w:pPr>
+      <w:r>
+        <w:t xml:space="preserve">Økonomisk støtte</w:t>
+      </w:r>
+    </w:p>
+    <w:p>
+      <w:pPr>
+        <w:keepNext/>
+        <w:spacing w:after="30"/>
+        <w:ind w:left="420"/>
+      </w:pPr>
+      <w:r>
+        <w:t xml:space="preserve">Gratis bil</w:t>
+      </w:r>
+    </w:p>
+    <w:p>
+      <w:pPr>
+        <w:keepNext w:val="false"/>
+        <w:spacing w:after="30"/>
+        <w:ind w:left="420"/>
+      </w:pPr>
+      <w:r>
+        <w:t xml:space="preserve">Norsk pass</w:t>
+      </w:r>
+    </w:p>
+    <w:p>
+      <w:pPr>
+        <w:keepNext/>
+        <w:spacing w:after="60" w:before="180"/>
+      </w:pPr>
+      <w:r>
+        <w:rPr>
+          <w:b/>
+          <w:bCs/>
+        </w:rPr>
+        <w:t xml:space="preserve">306. Hvorfor får deltakerne økonomisk støtte?</w:t>
+      </w:r>
+    </w:p>
+    <w:p>
+      <w:pPr>
+        <w:keepNext/>
+        <w:spacing w:after="30"/>
+        <w:ind w:left="420"/>
+      </w:pPr>
+      <w:r>
+        <w:t xml:space="preserve">Slik at de kan leve mens de lærer norsk</w:t>
+      </w:r>
+    </w:p>
+    <w:p>
+      <w:pPr>
+        <w:keepNext/>
+        <w:spacing w:after="30"/>
+        <w:ind w:left="420"/>
+      </w:pPr>
+      <w:r>
+        <w:t xml:space="preserve">Fordi de har fått gode karakterer i norskprøven</w:t>
+      </w:r>
+    </w:p>
+    <w:p>
+      <w:pPr>
+        <w:keepNext w:val="false"/>
+        <w:spacing w:after="30"/>
+        <w:ind w:left="420"/>
+      </w:pPr>
+      <w:r>
+        <w:t xml:space="preserve">Fordi de skal betale for kurset</w:t>
+      </w:r>
+    </w:p>
+    <w:p>
+      <w:pPr>
+        <w:keepNext/>
+        <w:spacing w:after="60" w:before="180"/>
+      </w:pPr>
+      <w:r>
+        <w:rPr>
+          <w:b/>
+          <w:bCs/>
+        </w:rPr>
+        <w:t xml:space="preserve">307. Hva er en del av introduksjonsprogrammet?</w:t>
+      </w:r>
+    </w:p>
+    <w:p>
+      <w:pPr>
+        <w:keepNext/>
+        <w:spacing w:after="30"/>
+        <w:ind w:left="420"/>
+      </w:pPr>
+      <w:r>
+        <w:t xml:space="preserve">Opplæring i norsk</w:t>
+      </w:r>
+    </w:p>
+    <w:p>
+      <w:pPr>
+        <w:keepNext/>
+        <w:spacing w:after="30"/>
+        <w:ind w:left="420"/>
+      </w:pPr>
+      <w:r>
+        <w:t xml:space="preserve">Betalt reise hjem</w:t>
+      </w:r>
+    </w:p>
+    <w:p>
+      <w:pPr>
+        <w:keepNext w:val="false"/>
+        <w:spacing w:after="30"/>
+        <w:ind w:left="420"/>
+      </w:pPr>
+      <w:r>
+        <w:t xml:space="preserve">Studier i utlandet</w:t>
+      </w:r>
+    </w:p>
+    <w:p>
+      <w:pPr>
+        <w:keepNext/>
+        <w:spacing w:after="60" w:before="180"/>
+      </w:pPr>
+      <w:r>
+        <w:rPr>
+          <w:b/>
+          <w:bCs/>
+        </w:rPr>
+        <w:t xml:space="preserve">308. Hva betyr ordet «integrering»?</w:t>
+      </w:r>
+    </w:p>
+    <w:p>
+      <w:pPr>
+        <w:keepNext/>
+        <w:spacing w:after="30"/>
+        <w:ind w:left="420"/>
+      </w:pPr>
+      <w:r>
+        <w:t xml:space="preserve">Nyankomne blir en del av samfunnet</w:t>
+      </w:r>
+    </w:p>
+    <w:p>
+      <w:pPr>
+        <w:keepNext/>
+        <w:spacing w:after="30"/>
+        <w:ind w:left="420"/>
+      </w:pPr>
+      <w:r>
+        <w:t xml:space="preserve">Nyankomne må reise hjem igjen</w:t>
+      </w:r>
+    </w:p>
+    <w:p>
+      <w:pPr>
+        <w:keepNext w:val="false"/>
+        <w:spacing w:after="30"/>
+        <w:ind w:left="420"/>
+      </w:pPr>
+      <w:r>
+        <w:t xml:space="preserve">Nyankomne bor i egne områder</w:t>
+      </w:r>
+    </w:p>
+    <w:p>
+      <w:pPr>
+        <w:keepNext/>
+        <w:spacing w:after="60" w:before="180"/>
+      </w:pPr>
+      <w:r>
+        <w:rPr>
+          <w:b/>
+          <w:bCs/>
+        </w:rPr>
+        <w:t xml:space="preserve">309. Hva heter loven om introduksjonsprogrammet?</w:t>
+      </w:r>
+    </w:p>
+    <w:p>
+      <w:pPr>
+        <w:keepNext/>
+        <w:spacing w:after="30"/>
+        <w:ind w:left="420"/>
+      </w:pPr>
+      <w:r>
+        <w:t xml:space="preserve">Integreringsloven</w:t>
+      </w:r>
+    </w:p>
+    <w:p>
+      <w:pPr>
+        <w:keepNext/>
+        <w:spacing w:after="30"/>
+        <w:ind w:left="420"/>
+      </w:pPr>
+      <w:r>
+        <w:t xml:space="preserve">Folketrygdloven</w:t>
+      </w:r>
+    </w:p>
+    <w:p>
+      <w:pPr>
+        <w:keepNext w:val="false"/>
+        <w:spacing w:after="30"/>
+        <w:ind w:left="420"/>
+      </w:pPr>
+      <w:r>
+        <w:t xml:space="preserve">Utlendingsloven</w:t>
+      </w:r>
+    </w:p>
+    <w:p>
+      <w:pPr>
+        <w:keepNext/>
+        <w:spacing w:after="60" w:before="180"/>
+      </w:pPr>
+      <w:r>
+        <w:rPr>
+          <w:b/>
+          <w:bCs/>
+        </w:rPr>
+        <w:t xml:space="preserve">310. Hvem har vedtatt integreringsloven?</w:t>
+      </w:r>
+    </w:p>
+    <w:p>
+      <w:pPr>
+        <w:keepNext/>
+        <w:spacing w:after="30"/>
+        <w:ind w:left="420"/>
+      </w:pPr>
+      <w:r>
+        <w:t xml:space="preserve">Stortinget</w:t>
+      </w:r>
+    </w:p>
+    <w:p>
+      <w:pPr>
+        <w:keepNext/>
+        <w:spacing w:after="30"/>
+        <w:ind w:left="420"/>
+      </w:pPr>
+      <w:r>
+        <w:t xml:space="preserve">Kommunen</w:t>
+      </w:r>
+    </w:p>
+    <w:p>
+      <w:pPr>
+        <w:keepNext w:val="false"/>
+        <w:spacing w:after="30"/>
+        <w:ind w:left="420"/>
+      </w:pPr>
+      <w:r>
+        <w:t xml:space="preserve">UDI</w:t>
+      </w:r>
+    </w:p>
+    <w:p>
+      <w:pPr>
+        <w:keepNext/>
+        <w:spacing w:after="60" w:before="180"/>
+      </w:pPr>
+      <w:r>
+        <w:rPr>
+          <w:b/>
+          <w:bCs/>
+        </w:rPr>
+        <w:t xml:space="preserve">311. Hvor kan en flyktning spørre om introduksjonsprogrammet?</w:t>
+      </w:r>
+    </w:p>
+    <w:p>
+      <w:pPr>
+        <w:keepNext/>
+        <w:spacing w:after="30"/>
+        <w:ind w:left="420"/>
+      </w:pPr>
+      <w:r>
+        <w:t xml:space="preserve">I kommunen der personen bor</w:t>
+      </w:r>
+    </w:p>
+    <w:p>
+      <w:pPr>
+        <w:keepNext/>
+        <w:spacing w:after="30"/>
+        <w:ind w:left="420"/>
+      </w:pPr>
+      <w:r>
+        <w:t xml:space="preserve">Hos politiet i nærmeste by</w:t>
+      </w:r>
+    </w:p>
+    <w:p>
+      <w:pPr>
+        <w:keepNext w:val="false"/>
+        <w:spacing w:after="30"/>
+        <w:ind w:left="420"/>
+      </w:pPr>
+      <w:r>
+        <w:t xml:space="preserve">Hos banken som personen bruker</w:t>
+      </w:r>
+    </w:p>
+    <w:p>
+      <w:pPr>
+        <w:keepNext/>
+        <w:spacing w:after="60" w:before="180"/>
+      </w:pPr>
+      <w:r>
+        <w:rPr>
+          <w:b/>
+          <w:bCs/>
+        </w:rPr>
+        <w:t xml:space="preserve">312. Omtrent hvor mange mennesker bor i Norge?</w:t>
+      </w:r>
+    </w:p>
+    <w:p>
+      <w:pPr>
+        <w:keepNext/>
+        <w:spacing w:after="30"/>
+        <w:ind w:left="420"/>
+      </w:pPr>
+      <w:r>
+        <w:t xml:space="preserve">Over fem millioner</w:t>
+      </w:r>
+    </w:p>
+    <w:p>
+      <w:pPr>
+        <w:keepNext/>
+        <w:spacing w:after="30"/>
+        <w:ind w:left="420"/>
+      </w:pPr>
+      <w:r>
+        <w:t xml:space="preserve">Omtrent én million</w:t>
+      </w:r>
+    </w:p>
+    <w:p>
+      <w:pPr>
+        <w:keepNext w:val="false"/>
+        <w:spacing w:after="30"/>
+        <w:ind w:left="420"/>
+      </w:pPr>
+      <w:r>
+        <w:t xml:space="preserve">Nesten ti millioner</w:t>
+      </w:r>
+    </w:p>
+    <w:p>
+      <w:pPr>
+        <w:keepNext/>
+        <w:spacing w:after="60" w:before="180"/>
+      </w:pPr>
+      <w:r>
+        <w:rPr>
+          <w:b/>
+          <w:bCs/>
+        </w:rPr>
+        <w:t xml:space="preserve">313. Hva slags styre har Norge?</w:t>
+      </w:r>
+    </w:p>
+    <w:p>
+      <w:pPr>
+        <w:keepNext/>
+        <w:spacing w:after="30"/>
+        <w:ind w:left="420"/>
+      </w:pPr>
+      <w:r>
+        <w:t xml:space="preserve">Et demokrati der kongen har en symbolsk rolle</w:t>
+      </w:r>
+    </w:p>
+    <w:p>
+      <w:pPr>
+        <w:keepNext/>
+        <w:spacing w:after="30"/>
+        <w:ind w:left="420"/>
+      </w:pPr>
+      <w:r>
+        <w:t xml:space="preserve">Et demokrati der kongen bestemmer over landets lover</w:t>
+      </w:r>
+    </w:p>
+    <w:p>
+      <w:pPr>
+        <w:keepNext w:val="false"/>
+        <w:spacing w:after="30"/>
+        <w:ind w:left="420"/>
+      </w:pPr>
+      <w:r>
+        <w:t xml:space="preserve">Et land uten konge og uten valg</w:t>
+      </w:r>
+    </w:p>
+    <w:p>
+      <w:pPr>
+        <w:keepNext/>
+        <w:spacing w:after="60" w:before="180"/>
+      </w:pPr>
+      <w:r>
+        <w:rPr>
+          <w:b/>
+          <w:bCs/>
+        </w:rPr>
+        <w:t xml:space="preserve">314. Hvor ofte er det stortingsvalg i Norge?</w:t>
+      </w:r>
+    </w:p>
+    <w:p>
+      <w:pPr>
+        <w:keepNext/>
+        <w:spacing w:after="30"/>
+        <w:ind w:left="420"/>
+      </w:pPr>
+      <w:r>
+        <w:t xml:space="preserve">Hvert fjerde år</w:t>
+      </w:r>
+    </w:p>
+    <w:p>
+      <w:pPr>
+        <w:keepNext/>
+        <w:spacing w:after="30"/>
+        <w:ind w:left="420"/>
+      </w:pPr>
+      <w:r>
+        <w:t xml:space="preserve">Hvert annet år</w:t>
+      </w:r>
+    </w:p>
+    <w:p>
+      <w:pPr>
+        <w:keepNext w:val="false"/>
+        <w:spacing w:after="30"/>
+        <w:ind w:left="420"/>
+      </w:pPr>
+      <w:r>
+        <w:t xml:space="preserve">Hvert tiende år</w:t>
+      </w:r>
+    </w:p>
+    <w:p>
+      <w:pPr>
+        <w:keepNext/>
+        <w:spacing w:after="60" w:before="180"/>
+      </w:pPr>
+      <w:r>
+        <w:rPr>
+          <w:b/>
+          <w:bCs/>
+        </w:rPr>
+        <w:t xml:space="preserve">315. Hvem kan stemme ved stortingsvalg?</w:t>
+      </w:r>
+    </w:p>
+    <w:p>
+      <w:pPr>
+        <w:keepNext/>
+        <w:spacing w:after="30"/>
+        <w:ind w:left="420"/>
+      </w:pPr>
+      <w:r>
+        <w:t xml:space="preserve">Norske statsborgere som er 18 år eller eldre</w:t>
+      </w:r>
+    </w:p>
+    <w:p>
+      <w:pPr>
+        <w:keepNext/>
+        <w:spacing w:after="30"/>
+        <w:ind w:left="420"/>
+      </w:pPr>
+      <w:r>
+        <w:t xml:space="preserve">Personer som har bodd tre år i Norge</w:t>
+      </w:r>
+    </w:p>
+    <w:p>
+      <w:pPr>
+        <w:keepNext w:val="false"/>
+        <w:spacing w:after="30"/>
+        <w:ind w:left="420"/>
+      </w:pPr>
+      <w:r>
+        <w:t xml:space="preserve">Norske statsborgere fra 16 år</w:t>
+      </w:r>
+    </w:p>
+    <w:p>
+      <w:pPr>
+        <w:keepNext/>
+        <w:spacing w:after="60" w:before="180"/>
+      </w:pPr>
+      <w:r>
+        <w:rPr>
+          <w:b/>
+          <w:bCs/>
+        </w:rPr>
+        <w:t xml:space="preserve">316. Hva betyr velferdsstat?</w:t>
+      </w:r>
+    </w:p>
+    <w:p>
+      <w:pPr>
+        <w:keepNext/>
+        <w:spacing w:after="30"/>
+        <w:ind w:left="420"/>
+      </w:pPr>
+      <w:r>
+        <w:t xml:space="preserve">Staten hjelper innbyggerne med blant annet skole og helse</w:t>
+      </w:r>
+    </w:p>
+    <w:p>
+      <w:pPr>
+        <w:keepNext/>
+        <w:spacing w:after="30"/>
+        <w:ind w:left="420"/>
+      </w:pPr>
+      <w:r>
+        <w:t xml:space="preserve">Staten eier selskapene i landet og bestemmer lønnen</w:t>
+      </w:r>
+    </w:p>
+    <w:p>
+      <w:pPr>
+        <w:keepNext w:val="false"/>
+        <w:spacing w:after="30"/>
+        <w:ind w:left="420"/>
+      </w:pPr>
+      <w:r>
+        <w:t xml:space="preserve">Staten gir innbyggerne like mye penger i året</w:t>
+      </w:r>
+    </w:p>
+    <w:p>
+      <w:pPr>
+        <w:keepNext/>
+        <w:spacing w:after="60" w:before="180"/>
+      </w:pPr>
+      <w:r>
+        <w:rPr>
+          <w:b/>
+          <w:bCs/>
+        </w:rPr>
+        <w:t xml:space="preserve">317. Hva bruker staten til å betale for velferden?</w:t>
+      </w:r>
+    </w:p>
+    <w:p>
+      <w:pPr>
+        <w:keepNext/>
+        <w:spacing w:after="30"/>
+        <w:ind w:left="420"/>
+      </w:pPr>
+      <w:r>
+        <w:t xml:space="preserve">Skatt som innbyggerne betaler</w:t>
+      </w:r>
+    </w:p>
+    <w:p>
+      <w:pPr>
+        <w:keepNext/>
+        <w:spacing w:after="30"/>
+        <w:ind w:left="420"/>
+      </w:pPr>
+      <w:r>
+        <w:t xml:space="preserve">Penger fra andre land i EU</w:t>
+      </w:r>
+    </w:p>
+    <w:p>
+      <w:pPr>
+        <w:keepNext w:val="false"/>
+        <w:spacing w:after="30"/>
+        <w:ind w:left="420"/>
+      </w:pPr>
+      <w:r>
+        <w:t xml:space="preserve">Penger som kongen eier</w:t>
+      </w:r>
+    </w:p>
+    <w:p>
+      <w:pPr>
+        <w:keepNext/>
+        <w:spacing w:after="60" w:before="180"/>
+      </w:pPr>
+      <w:r>
+        <w:rPr>
+          <w:b/>
+          <w:bCs/>
+        </w:rPr>
+        <w:t xml:space="preserve">318. Når feirer Norge nasjonaldagen?</w:t>
+      </w:r>
+    </w:p>
+    <w:p>
+      <w:pPr>
+        <w:keepNext/>
+        <w:spacing w:after="30"/>
+        <w:ind w:left="420"/>
+      </w:pPr>
+      <w:r>
+        <w:t xml:space="preserve">17. mai</w:t>
+      </w:r>
+    </w:p>
+    <w:p>
+      <w:pPr>
+        <w:keepNext/>
+        <w:spacing w:after="30"/>
+        <w:ind w:left="420"/>
+      </w:pPr>
+      <w:r>
+        <w:t xml:space="preserve">1. mai</w:t>
+      </w:r>
+    </w:p>
+    <w:p>
+      <w:pPr>
+        <w:keepNext w:val="false"/>
+        <w:spacing w:after="30"/>
+        <w:ind w:left="420"/>
+      </w:pPr>
+      <w:r>
+        <w:t xml:space="preserve">8. mai</w:t>
+      </w:r>
+    </w:p>
+    <w:p>
+      <w:pPr>
+        <w:keepNext/>
+        <w:spacing w:after="60" w:before="180"/>
+      </w:pPr>
+      <w:r>
+        <w:rPr>
+          <w:b/>
+          <w:bCs/>
+        </w:rPr>
+        <w:t xml:space="preserve">319. Hvilket år fikk Norge grunnloven sin?</w:t>
+      </w:r>
+    </w:p>
+    <w:p>
+      <w:pPr>
+        <w:keepNext/>
+        <w:spacing w:after="30"/>
+        <w:ind w:left="420"/>
+      </w:pPr>
+      <w:r>
+        <w:t xml:space="preserve">1814</w:t>
+      </w:r>
+    </w:p>
+    <w:p>
+      <w:pPr>
+        <w:keepNext/>
+        <w:spacing w:after="30"/>
+        <w:ind w:left="420"/>
+      </w:pPr>
+      <w:r>
+        <w:t xml:space="preserve">1905</w:t>
+      </w:r>
+    </w:p>
+    <w:p>
+      <w:pPr>
+        <w:keepNext w:val="false"/>
+        <w:spacing w:after="30"/>
+        <w:ind w:left="420"/>
+      </w:pPr>
+      <w:r>
+        <w:t xml:space="preserve">1945</w:t>
+      </w:r>
+    </w:p>
+    <w:p>
+      <w:pPr>
+        <w:keepNext/>
+        <w:spacing w:after="60" w:before="180"/>
+      </w:pPr>
+      <w:r>
+        <w:rPr>
+          <w:b/>
+          <w:bCs/>
+        </w:rPr>
+        <w:t xml:space="preserve">320. Hvilken union gikk Norge ut av i 1905?</w:t>
+      </w:r>
+    </w:p>
+    <w:p>
+      <w:pPr>
+        <w:keepNext/>
+        <w:spacing w:after="30"/>
+        <w:ind w:left="420"/>
+      </w:pPr>
+      <w:r>
+        <w:t xml:space="preserve">Unionen med Sverige</w:t>
+      </w:r>
+    </w:p>
+    <w:p>
+      <w:pPr>
+        <w:keepNext/>
+        <w:spacing w:after="30"/>
+        <w:ind w:left="420"/>
+      </w:pPr>
+      <w:r>
+        <w:t xml:space="preserve">Unionen med Danmark</w:t>
+      </w:r>
+    </w:p>
+    <w:p>
+      <w:pPr>
+        <w:keepNext w:val="false"/>
+        <w:spacing w:after="30"/>
+        <w:ind w:left="420"/>
+      </w:pPr>
+      <w:r>
+        <w:t xml:space="preserve">Unionen med Finland</w:t>
       </w:r>
     </w:p>
     <w:sectPr>

</xml_diff>